<commit_message>
Lesson 02: Rest Api, Microservices
</commit_message>
<xml_diff>
--- a/Node 54.docx
+++ b/Node 54.docx
@@ -10,14 +10,14 @@
       </w:tblPr>
       <w:tblGrid>
         <w:gridCol w:w="749"/>
-        <w:gridCol w:w="2694"/>
-        <w:gridCol w:w="2507"/>
+        <w:gridCol w:w="2773"/>
+        <w:gridCol w:w="2428"/>
         <w:gridCol w:w="4506"/>
       </w:tblGrid>
       <w:tr>
         <w:tc>
           <w:tcPr>
-            <w:tcW w:w="749" w:type="dxa"/>
+            <w:tcW w:w="562" w:type="dxa"/>
             <w:tcBorders>
               <w:bottom w:val="single" w:sz="4" w:space="0" w:color="auto"/>
             </w:tcBorders>
@@ -39,7 +39,7 @@
         </w:tc>
         <w:tc>
           <w:tcPr>
-            <w:tcW w:w="2726" w:type="dxa"/>
+            <w:tcW w:w="2881" w:type="dxa"/>
             <w:tcBorders>
               <w:bottom w:val="single" w:sz="4" w:space="0" w:color="auto"/>
             </w:tcBorders>
@@ -61,7 +61,7 @@
         </w:tc>
         <w:tc>
           <w:tcPr>
-            <w:tcW w:w="2535" w:type="dxa"/>
+            <w:tcW w:w="2507" w:type="dxa"/>
             <w:tcBorders>
               <w:bottom w:val="single" w:sz="4" w:space="0" w:color="auto"/>
             </w:tcBorders>
@@ -89,7 +89,7 @@
         </w:tc>
         <w:tc>
           <w:tcPr>
-            <w:tcW w:w="4446" w:type="dxa"/>
+            <w:tcW w:w="4506" w:type="dxa"/>
             <w:tcBorders>
               <w:bottom w:val="single" w:sz="4" w:space="0" w:color="auto"/>
             </w:tcBorders>
@@ -136,7 +136,7 @@
       <w:tr>
         <w:tc>
           <w:tcPr>
-            <w:tcW w:w="749" w:type="dxa"/>
+            <w:tcW w:w="562" w:type="dxa"/>
           </w:tcPr>
           <w:p>
             <w:pPr>
@@ -155,7 +155,7 @@
         </w:tc>
         <w:tc>
           <w:tcPr>
-            <w:tcW w:w="2726" w:type="dxa"/>
+            <w:tcW w:w="2881" w:type="dxa"/>
           </w:tcPr>
           <w:p>
             <w:pPr>
@@ -173,7 +173,7 @@
         </w:tc>
         <w:tc>
           <w:tcPr>
-            <w:tcW w:w="2535" w:type="dxa"/>
+            <w:tcW w:w="2507" w:type="dxa"/>
           </w:tcPr>
           <w:p>
             <w:pPr>
@@ -220,7 +220,7 @@
         </w:tc>
         <w:tc>
           <w:tcPr>
-            <w:tcW w:w="4446" w:type="dxa"/>
+            <w:tcW w:w="4506" w:type="dxa"/>
           </w:tcPr>
           <w:p>
             <w:pPr>
@@ -305,7 +305,7 @@
       <w:tr>
         <w:tc>
           <w:tcPr>
-            <w:tcW w:w="749" w:type="dxa"/>
+            <w:tcW w:w="562" w:type="dxa"/>
           </w:tcPr>
           <w:p>
             <w:pPr>
@@ -324,7 +324,7 @@
         </w:tc>
         <w:tc>
           <w:tcPr>
-            <w:tcW w:w="2726" w:type="dxa"/>
+            <w:tcW w:w="2881" w:type="dxa"/>
           </w:tcPr>
           <w:p>
             <w:pPr>
@@ -342,7 +342,7 @@
         </w:tc>
         <w:tc>
           <w:tcPr>
-            <w:tcW w:w="2535" w:type="dxa"/>
+            <w:tcW w:w="2507" w:type="dxa"/>
           </w:tcPr>
           <w:p>
             <w:pPr>
@@ -374,7 +374,7 @@
         </w:tc>
         <w:tc>
           <w:tcPr>
-            <w:tcW w:w="4446" w:type="dxa"/>
+            <w:tcW w:w="4506" w:type="dxa"/>
           </w:tcPr>
           <w:p>
             <w:pPr>
@@ -685,7 +685,7 @@
       <w:tr>
         <w:tc>
           <w:tcPr>
-            <w:tcW w:w="749" w:type="dxa"/>
+            <w:tcW w:w="562" w:type="dxa"/>
           </w:tcPr>
           <w:p>
             <w:pPr>
@@ -710,7 +710,7 @@
         </w:tc>
         <w:tc>
           <w:tcPr>
-            <w:tcW w:w="2726" w:type="dxa"/>
+            <w:tcW w:w="2881" w:type="dxa"/>
           </w:tcPr>
           <w:p>
             <w:pPr>
@@ -742,7 +742,7 @@
         </w:tc>
         <w:tc>
           <w:tcPr>
-            <w:tcW w:w="2535" w:type="dxa"/>
+            <w:tcW w:w="2507" w:type="dxa"/>
           </w:tcPr>
           <w:p>
             <w:pPr>
@@ -768,7 +768,7 @@
         </w:tc>
         <w:tc>
           <w:tcPr>
-            <w:tcW w:w="4446" w:type="dxa"/>
+            <w:tcW w:w="4506" w:type="dxa"/>
           </w:tcPr>
           <w:p>
             <w:pPr>
@@ -853,7 +853,7 @@
       <w:tr>
         <w:tc>
           <w:tcPr>
-            <w:tcW w:w="749" w:type="dxa"/>
+            <w:tcW w:w="562" w:type="dxa"/>
           </w:tcPr>
           <w:p>
             <w:pPr>
@@ -872,7 +872,7 @@
         </w:tc>
         <w:tc>
           <w:tcPr>
-            <w:tcW w:w="2726" w:type="dxa"/>
+            <w:tcW w:w="2881" w:type="dxa"/>
           </w:tcPr>
           <w:p>
             <w:pPr>
@@ -890,7 +890,7 @@
         </w:tc>
         <w:tc>
           <w:tcPr>
-            <w:tcW w:w="2535" w:type="dxa"/>
+            <w:tcW w:w="2507" w:type="dxa"/>
           </w:tcPr>
           <w:p>
             <w:pPr>
@@ -908,7 +908,7 @@
         </w:tc>
         <w:tc>
           <w:tcPr>
-            <w:tcW w:w="4446" w:type="dxa"/>
+            <w:tcW w:w="4506" w:type="dxa"/>
           </w:tcPr>
           <w:p>
             <w:pPr>
@@ -993,7 +993,7 @@
       <w:tr>
         <w:tc>
           <w:tcPr>
-            <w:tcW w:w="749" w:type="dxa"/>
+            <w:tcW w:w="562" w:type="dxa"/>
           </w:tcPr>
           <w:p>
             <w:pPr>
@@ -1012,7 +1012,7 @@
         </w:tc>
         <w:tc>
           <w:tcPr>
-            <w:tcW w:w="2726" w:type="dxa"/>
+            <w:tcW w:w="2881" w:type="dxa"/>
           </w:tcPr>
           <w:p>
             <w:pPr>
@@ -1044,7 +1044,7 @@
         </w:tc>
         <w:tc>
           <w:tcPr>
-            <w:tcW w:w="2535" w:type="dxa"/>
+            <w:tcW w:w="2507" w:type="dxa"/>
           </w:tcPr>
           <w:p>
             <w:pPr>
@@ -1062,7 +1062,7 @@
         </w:tc>
         <w:tc>
           <w:tcPr>
-            <w:tcW w:w="4446" w:type="dxa"/>
+            <w:tcW w:w="4506" w:type="dxa"/>
           </w:tcPr>
           <w:p>
             <w:pPr>
@@ -1147,7 +1147,7 @@
       <w:tr>
         <w:tc>
           <w:tcPr>
-            <w:tcW w:w="749" w:type="dxa"/>
+            <w:tcW w:w="562" w:type="dxa"/>
           </w:tcPr>
           <w:p>
             <w:pPr>
@@ -1166,7 +1166,7 @@
         </w:tc>
         <w:tc>
           <w:tcPr>
-            <w:tcW w:w="9707" w:type="dxa"/>
+            <w:tcW w:w="9894" w:type="dxa"/>
             <w:gridSpan w:val="3"/>
           </w:tcPr>
           <w:p>
@@ -1188,20 +1188,20 @@
       <w:tr>
         <w:tc>
           <w:tcPr>
-            <w:tcW w:w="749" w:type="dxa"/>
-          </w:tcPr>
-          <w:p>
-            <w:pPr>
-              <w:jc w:val="center"/>
-              <w:rPr>
-                <w:lang w:val="en-US"/>
-              </w:rPr>
-            </w:pPr>
-          </w:p>
-        </w:tc>
-        <w:tc>
-          <w:tcPr>
-            <w:tcW w:w="2726" w:type="dxa"/>
+            <w:tcW w:w="562" w:type="dxa"/>
+          </w:tcPr>
+          <w:p>
+            <w:pPr>
+              <w:jc w:val="center"/>
+              <w:rPr>
+                <w:lang w:val="en-US"/>
+              </w:rPr>
+            </w:pPr>
+          </w:p>
+        </w:tc>
+        <w:tc>
+          <w:tcPr>
+            <w:tcW w:w="2881" w:type="dxa"/>
           </w:tcPr>
           <w:p>
             <w:pPr>
@@ -1239,7 +1239,7 @@
         </w:tc>
         <w:tc>
           <w:tcPr>
-            <w:tcW w:w="2535" w:type="dxa"/>
+            <w:tcW w:w="2507" w:type="dxa"/>
           </w:tcPr>
           <w:p>
             <w:pPr>
@@ -1278,14 +1278,13 @@
               <w:rPr>
                 <w:lang w:val="en-US"/>
               </w:rPr>
-              <w:lastRenderedPageBreak/>
               <w:t>Like total of all numbers into array</w:t>
             </w:r>
           </w:p>
         </w:tc>
         <w:tc>
           <w:tcPr>
-            <w:tcW w:w="4446" w:type="dxa"/>
+            <w:tcW w:w="4506" w:type="dxa"/>
           </w:tcPr>
           <w:p>
             <w:pPr>
@@ -1298,7 +1297,6 @@
               <w:rPr>
                 <w:noProof/>
               </w:rPr>
-              <w:lastRenderedPageBreak/>
               <w:drawing>
                 <wp:inline distT="0" distB="0" distL="0" distR="0" wp14:anchorId="38A540C2" wp14:editId="7CCD55E7">
                   <wp:extent cx="2401570" cy="399487"/>
@@ -1454,7 +1452,7 @@
         </w:trPr>
         <w:tc>
           <w:tcPr>
-            <w:tcW w:w="749" w:type="dxa"/>
+            <w:tcW w:w="562" w:type="dxa"/>
             <w:vMerge w:val="restart"/>
           </w:tcPr>
           <w:p>
@@ -1474,7 +1472,7 @@
         </w:tc>
         <w:tc>
           <w:tcPr>
-            <w:tcW w:w="2726" w:type="dxa"/>
+            <w:tcW w:w="2881" w:type="dxa"/>
             <w:vMerge w:val="restart"/>
           </w:tcPr>
           <w:p>
@@ -1493,7 +1491,7 @@
         </w:tc>
         <w:tc>
           <w:tcPr>
-            <w:tcW w:w="2535" w:type="dxa"/>
+            <w:tcW w:w="2507" w:type="dxa"/>
           </w:tcPr>
           <w:p>
             <w:pPr>
@@ -1525,7 +1523,7 @@
         </w:tc>
         <w:tc>
           <w:tcPr>
-            <w:tcW w:w="4446" w:type="dxa"/>
+            <w:tcW w:w="4506" w:type="dxa"/>
           </w:tcPr>
           <w:p>
             <w:pPr>
@@ -1613,7 +1611,7 @@
         </w:trPr>
         <w:tc>
           <w:tcPr>
-            <w:tcW w:w="749" w:type="dxa"/>
+            <w:tcW w:w="562" w:type="dxa"/>
             <w:vMerge/>
           </w:tcPr>
           <w:p>
@@ -1627,7 +1625,7 @@
         </w:tc>
         <w:tc>
           <w:tcPr>
-            <w:tcW w:w="2726" w:type="dxa"/>
+            <w:tcW w:w="2881" w:type="dxa"/>
             <w:vMerge/>
           </w:tcPr>
           <w:p>
@@ -1640,7 +1638,7 @@
         </w:tc>
         <w:tc>
           <w:tcPr>
-            <w:tcW w:w="2535" w:type="dxa"/>
+            <w:tcW w:w="2507" w:type="dxa"/>
           </w:tcPr>
           <w:p>
             <w:pPr>
@@ -1658,7 +1656,7 @@
         </w:tc>
         <w:tc>
           <w:tcPr>
-            <w:tcW w:w="4446" w:type="dxa"/>
+            <w:tcW w:w="4506" w:type="dxa"/>
           </w:tcPr>
           <w:p>
             <w:pPr>
@@ -1821,102 +1819,546 @@
       <w:tr>
         <w:tc>
           <w:tcPr>
-            <w:tcW w:w="749" w:type="dxa"/>
-          </w:tcPr>
-          <w:p>
-            <w:pPr>
-              <w:jc w:val="center"/>
-              <w:rPr>
-                <w:lang w:val="en-US"/>
-              </w:rPr>
-            </w:pPr>
-            <w:r>
-              <w:rPr>
-                <w:lang w:val="en-US"/>
-              </w:rPr>
-              <w:t>20:</w:t>
-            </w:r>
-          </w:p>
-        </w:tc>
-        <w:tc>
-          <w:tcPr>
-            <w:tcW w:w="2726" w:type="dxa"/>
-          </w:tcPr>
-          <w:p>
-            <w:pPr>
-              <w:rPr>
-                <w:lang w:val="en-US"/>
-              </w:rPr>
-            </w:pPr>
-          </w:p>
-        </w:tc>
-        <w:tc>
-          <w:tcPr>
-            <w:tcW w:w="2535" w:type="dxa"/>
-          </w:tcPr>
-          <w:p>
-            <w:pPr>
-              <w:rPr>
-                <w:lang w:val="en-US"/>
-              </w:rPr>
-            </w:pPr>
-          </w:p>
-        </w:tc>
-        <w:tc>
-          <w:tcPr>
-            <w:tcW w:w="4446" w:type="dxa"/>
-          </w:tcPr>
-          <w:p>
-            <w:pPr>
-              <w:jc w:val="center"/>
-              <w:rPr>
-                <w:lang w:val="en-US"/>
-              </w:rPr>
-            </w:pPr>
+            <w:tcW w:w="562" w:type="dxa"/>
+            <w:tcBorders>
+              <w:bottom w:val="single" w:sz="4" w:space="0" w:color="auto"/>
+            </w:tcBorders>
+          </w:tcPr>
+          <w:p>
+            <w:pPr>
+              <w:jc w:val="center"/>
+              <w:rPr>
+                <w:lang w:val="en-US"/>
+              </w:rPr>
+            </w:pPr>
+            <w:r>
+              <w:rPr>
+                <w:lang w:val="en-US"/>
+              </w:rPr>
+              <w:t>Time</w:t>
+            </w:r>
+          </w:p>
+        </w:tc>
+        <w:tc>
+          <w:tcPr>
+            <w:tcW w:w="2881" w:type="dxa"/>
+            <w:tcBorders>
+              <w:bottom w:val="single" w:sz="4" w:space="0" w:color="auto"/>
+            </w:tcBorders>
+          </w:tcPr>
+          <w:p>
+            <w:pPr>
+              <w:jc w:val="center"/>
+              <w:rPr>
+                <w:lang w:val="en-US"/>
+              </w:rPr>
+            </w:pPr>
+            <w:r>
+              <w:rPr>
+                <w:lang w:val="en-US"/>
+              </w:rPr>
+              <w:t>Concept</w:t>
+            </w:r>
+          </w:p>
+        </w:tc>
+        <w:tc>
+          <w:tcPr>
+            <w:tcW w:w="2507" w:type="dxa"/>
+            <w:tcBorders>
+              <w:bottom w:val="single" w:sz="4" w:space="0" w:color="auto"/>
+            </w:tcBorders>
+          </w:tcPr>
+          <w:p>
+            <w:pPr>
+              <w:jc w:val="center"/>
+              <w:rPr>
+                <w:lang w:val="en-US"/>
+              </w:rPr>
+            </w:pPr>
+            <w:r>
+              <w:rPr>
+                <w:lang w:val="en-US"/>
+              </w:rPr>
+              <w:t>E</w:t>
+            </w:r>
+            <w:r>
+              <w:rPr>
+                <w:lang w:val="en-US"/>
+              </w:rPr>
+              <w:t>xplanation</w:t>
+            </w:r>
+          </w:p>
+        </w:tc>
+        <w:tc>
+          <w:tcPr>
+            <w:tcW w:w="4506" w:type="dxa"/>
+            <w:tcBorders>
+              <w:bottom w:val="single" w:sz="4" w:space="0" w:color="auto"/>
+            </w:tcBorders>
+          </w:tcPr>
+          <w:p>
+            <w:pPr>
+              <w:jc w:val="center"/>
+              <w:rPr>
+                <w:lang w:val="en-US"/>
+              </w:rPr>
+            </w:pPr>
+            <w:r>
+              <w:rPr>
+                <w:lang w:val="en-US"/>
+              </w:rPr>
+              <w:t>Example</w:t>
+            </w:r>
           </w:p>
         </w:tc>
       </w:tr>
       <w:tr>
         <w:tc>
           <w:tcPr>
-            <w:tcW w:w="749" w:type="dxa"/>
-          </w:tcPr>
-          <w:p>
-            <w:pPr>
-              <w:jc w:val="center"/>
-              <w:rPr>
-                <w:lang w:val="en-US"/>
-              </w:rPr>
-            </w:pPr>
-          </w:p>
-        </w:tc>
-        <w:tc>
-          <w:tcPr>
-            <w:tcW w:w="2726" w:type="dxa"/>
-          </w:tcPr>
-          <w:p>
-            <w:pPr>
-              <w:rPr>
-                <w:lang w:val="en-US"/>
-              </w:rPr>
-            </w:pPr>
-          </w:p>
-        </w:tc>
-        <w:tc>
-          <w:tcPr>
-            <w:tcW w:w="2535" w:type="dxa"/>
-          </w:tcPr>
-          <w:p>
-            <w:pPr>
-              <w:rPr>
-                <w:lang w:val="en-US"/>
-              </w:rPr>
-            </w:pPr>
-          </w:p>
-        </w:tc>
-        <w:tc>
-          <w:tcPr>
-            <w:tcW w:w="4446" w:type="dxa"/>
+            <w:tcW w:w="10456" w:type="dxa"/>
+            <w:gridSpan w:val="4"/>
+            <w:shd w:val="clear" w:color="auto" w:fill="FFFF00"/>
+          </w:tcPr>
+          <w:p>
+            <w:pPr>
+              <w:jc w:val="center"/>
+              <w:rPr>
+                <w:lang w:val="en-US"/>
+              </w:rPr>
+            </w:pPr>
+            <w:r>
+              <w:rPr>
+                <w:lang w:val="en-US"/>
+              </w:rPr>
+              <w:t>Lesson 0</w:t>
+            </w:r>
+            <w:r>
+              <w:rPr>
+                <w:lang w:val="en-US"/>
+              </w:rPr>
+              <w:t>2</w:t>
+            </w:r>
+          </w:p>
+        </w:tc>
+      </w:tr>
+      <w:tr>
+        <w:tc>
+          <w:tcPr>
+            <w:tcW w:w="562" w:type="dxa"/>
+          </w:tcPr>
+          <w:p>
+            <w:pPr>
+              <w:jc w:val="center"/>
+              <w:rPr>
+                <w:lang w:val="en-US"/>
+              </w:rPr>
+            </w:pPr>
+            <w:r>
+              <w:rPr>
+                <w:lang w:val="en-US"/>
+              </w:rPr>
+              <w:t>19:15</w:t>
+            </w:r>
+          </w:p>
+        </w:tc>
+        <w:tc>
+          <w:tcPr>
+            <w:tcW w:w="9894" w:type="dxa"/>
+            <w:gridSpan w:val="3"/>
+          </w:tcPr>
+          <w:p>
+            <w:pPr>
+              <w:jc w:val="center"/>
+              <w:rPr>
+                <w:lang w:val="en-US"/>
+              </w:rPr>
+            </w:pPr>
+            <w:r>
+              <w:rPr>
+                <w:lang w:val="en-US"/>
+              </w:rPr>
+              <w:t xml:space="preserve">Lab </w:t>
+            </w:r>
+            <w:r>
+              <w:rPr>
+                <w:lang w:val="en-US"/>
+              </w:rPr>
+              <w:t>04</w:t>
+            </w:r>
+            <w:r>
+              <w:rPr>
+                <w:lang w:val="en-US"/>
+              </w:rPr>
+              <w:t xml:space="preserve"> Solution</w:t>
+            </w:r>
+          </w:p>
+        </w:tc>
+      </w:tr>
+      <w:tr>
+        <w:tc>
+          <w:tcPr>
+            <w:tcW w:w="562" w:type="dxa"/>
+          </w:tcPr>
+          <w:p>
+            <w:pPr>
+              <w:jc w:val="center"/>
+              <w:rPr>
+                <w:lang w:val="en-US"/>
+              </w:rPr>
+            </w:pPr>
+            <w:r>
+              <w:rPr>
+                <w:lang w:val="en-US"/>
+              </w:rPr>
+              <w:t>20:00</w:t>
+            </w:r>
+          </w:p>
+        </w:tc>
+        <w:tc>
+          <w:tcPr>
+            <w:tcW w:w="2881" w:type="dxa"/>
+          </w:tcPr>
+          <w:p>
+            <w:pPr>
+              <w:rPr>
+                <w:lang w:val="en-US"/>
+              </w:rPr>
+            </w:pPr>
+            <w:r>
+              <w:rPr>
+                <w:lang w:val="en-US"/>
+              </w:rPr>
+              <w:t>Microservices</w:t>
+            </w:r>
+          </w:p>
+        </w:tc>
+        <w:tc>
+          <w:tcPr>
+            <w:tcW w:w="2507" w:type="dxa"/>
+          </w:tcPr>
+          <w:p>
+            <w:pPr>
+              <w:rPr>
+                <w:lang w:val="en-US"/>
+              </w:rPr>
+            </w:pPr>
+            <w:r>
+              <w:rPr>
+                <w:lang w:val="en-US"/>
+              </w:rPr>
+              <w:t>Node Microservices – Separation of modules</w:t>
+            </w:r>
+          </w:p>
+        </w:tc>
+        <w:tc>
+          <w:tcPr>
+            <w:tcW w:w="4506" w:type="dxa"/>
+          </w:tcPr>
+          <w:p>
+            <w:pPr>
+              <w:jc w:val="center"/>
+              <w:rPr>
+                <w:lang w:val="en-US"/>
+              </w:rPr>
+            </w:pPr>
+            <w:r>
+              <w:rPr>
+                <w:noProof/>
+              </w:rPr>
+              <w:drawing>
+                <wp:inline distT="0" distB="0" distL="0" distR="0" wp14:anchorId="71FECFA9" wp14:editId="3042E883">
+                  <wp:extent cx="2335323" cy="1318054"/>
+                  <wp:effectExtent l="0" t="0" r="8255" b="0"/>
+                  <wp:docPr id="988135633" name="Picture 1"/>
+                  <wp:cNvGraphicFramePr>
+                    <a:graphicFrameLocks xmlns:a="http://schemas.openxmlformats.org/drawingml/2006/main" noChangeAspect="1"/>
+                  </wp:cNvGraphicFramePr>
+                  <a:graphic xmlns:a="http://schemas.openxmlformats.org/drawingml/2006/main">
+                    <a:graphicData uri="http://schemas.openxmlformats.org/drawingml/2006/picture">
+                      <pic:pic xmlns:pic="http://schemas.openxmlformats.org/drawingml/2006/picture">
+                        <pic:nvPicPr>
+                          <pic:cNvPr id="988135633" name=""/>
+                          <pic:cNvPicPr/>
+                        </pic:nvPicPr>
+                        <pic:blipFill>
+                          <a:blip r:embed="rId14"/>
+                          <a:stretch>
+                            <a:fillRect/>
+                          </a:stretch>
+                        </pic:blipFill>
+                        <pic:spPr>
+                          <a:xfrm>
+                            <a:off x="0" y="0"/>
+                            <a:ext cx="2344715" cy="1323355"/>
+                          </a:xfrm>
+                          <a:prstGeom prst="rect">
+                            <a:avLst/>
+                          </a:prstGeom>
+                        </pic:spPr>
+                      </pic:pic>
+                    </a:graphicData>
+                  </a:graphic>
+                </wp:inline>
+              </w:drawing>
+            </w:r>
+          </w:p>
+          <w:p>
+            <w:pPr>
+              <w:jc w:val="center"/>
+              <w:rPr>
+                <w:lang w:val="en-US"/>
+              </w:rPr>
+            </w:pPr>
+            <w:r>
+              <w:rPr>
+                <w:noProof/>
+              </w:rPr>
+              <w:drawing>
+                <wp:inline distT="0" distB="0" distL="0" distR="0" wp14:anchorId="50A8B53F" wp14:editId="36559BE4">
+                  <wp:extent cx="2197580" cy="2879059"/>
+                  <wp:effectExtent l="0" t="0" r="0" b="0"/>
+                  <wp:docPr id="2140364670" name="Picture 1"/>
+                  <wp:cNvGraphicFramePr>
+                    <a:graphicFrameLocks xmlns:a="http://schemas.openxmlformats.org/drawingml/2006/main" noChangeAspect="1"/>
+                  </wp:cNvGraphicFramePr>
+                  <a:graphic xmlns:a="http://schemas.openxmlformats.org/drawingml/2006/main">
+                    <a:graphicData uri="http://schemas.openxmlformats.org/drawingml/2006/picture">
+                      <pic:pic xmlns:pic="http://schemas.openxmlformats.org/drawingml/2006/picture">
+                        <pic:nvPicPr>
+                          <pic:cNvPr id="2140364670" name=""/>
+                          <pic:cNvPicPr/>
+                        </pic:nvPicPr>
+                        <pic:blipFill>
+                          <a:blip r:embed="rId15"/>
+                          <a:stretch>
+                            <a:fillRect/>
+                          </a:stretch>
+                        </pic:blipFill>
+                        <pic:spPr>
+                          <a:xfrm>
+                            <a:off x="0" y="0"/>
+                            <a:ext cx="2205193" cy="2889032"/>
+                          </a:xfrm>
+                          <a:prstGeom prst="rect">
+                            <a:avLst/>
+                          </a:prstGeom>
+                        </pic:spPr>
+                      </pic:pic>
+                    </a:graphicData>
+                  </a:graphic>
+                </wp:inline>
+              </w:drawing>
+            </w:r>
+          </w:p>
+          <w:p>
+            <w:pPr>
+              <w:jc w:val="center"/>
+              <w:rPr>
+                <w:rFonts w:hint="cs"/>
+                <w:rtl/>
+                <w:lang w:val="en-US"/>
+              </w:rPr>
+            </w:pPr>
+          </w:p>
+        </w:tc>
+      </w:tr>
+      <w:tr>
+        <w:tc>
+          <w:tcPr>
+            <w:tcW w:w="562" w:type="dxa"/>
+          </w:tcPr>
+          <w:p>
+            <w:pPr>
+              <w:jc w:val="center"/>
+              <w:rPr>
+                <w:lang w:val="en-US"/>
+              </w:rPr>
+            </w:pPr>
+          </w:p>
+        </w:tc>
+        <w:tc>
+          <w:tcPr>
+            <w:tcW w:w="2881" w:type="dxa"/>
+          </w:tcPr>
+          <w:p>
+            <w:pPr>
+              <w:rPr>
+                <w:lang w:val="en-US"/>
+              </w:rPr>
+            </w:pPr>
+          </w:p>
+        </w:tc>
+        <w:tc>
+          <w:tcPr>
+            <w:tcW w:w="2507" w:type="dxa"/>
+          </w:tcPr>
+          <w:p>
+            <w:pPr>
+              <w:rPr>
+                <w:lang w:val="en-US"/>
+              </w:rPr>
+            </w:pPr>
+          </w:p>
+        </w:tc>
+        <w:tc>
+          <w:tcPr>
+            <w:tcW w:w="4506" w:type="dxa"/>
+          </w:tcPr>
+          <w:p>
+            <w:pPr>
+              <w:jc w:val="center"/>
+              <w:rPr>
+                <w:lang w:val="en-US"/>
+              </w:rPr>
+            </w:pPr>
+          </w:p>
+        </w:tc>
+      </w:tr>
+      <w:tr>
+        <w:tc>
+          <w:tcPr>
+            <w:tcW w:w="562" w:type="dxa"/>
+          </w:tcPr>
+          <w:p>
+            <w:pPr>
+              <w:jc w:val="center"/>
+              <w:rPr>
+                <w:lang w:val="en-US"/>
+              </w:rPr>
+            </w:pPr>
+          </w:p>
+        </w:tc>
+        <w:tc>
+          <w:tcPr>
+            <w:tcW w:w="2881" w:type="dxa"/>
+          </w:tcPr>
+          <w:p>
+            <w:pPr>
+              <w:rPr>
+                <w:lang w:val="en-US"/>
+              </w:rPr>
+            </w:pPr>
+          </w:p>
+        </w:tc>
+        <w:tc>
+          <w:tcPr>
+            <w:tcW w:w="2507" w:type="dxa"/>
+          </w:tcPr>
+          <w:p>
+            <w:pPr>
+              <w:rPr>
+                <w:lang w:val="en-US"/>
+              </w:rPr>
+            </w:pPr>
+          </w:p>
+        </w:tc>
+        <w:tc>
+          <w:tcPr>
+            <w:tcW w:w="4506" w:type="dxa"/>
+          </w:tcPr>
+          <w:p>
+            <w:pPr>
+              <w:jc w:val="center"/>
+              <w:rPr>
+                <w:lang w:val="en-US"/>
+              </w:rPr>
+            </w:pPr>
+          </w:p>
+        </w:tc>
+      </w:tr>
+      <w:tr>
+        <w:tc>
+          <w:tcPr>
+            <w:tcW w:w="562" w:type="dxa"/>
+          </w:tcPr>
+          <w:p>
+            <w:pPr>
+              <w:jc w:val="center"/>
+              <w:rPr>
+                <w:lang w:val="en-US"/>
+              </w:rPr>
+            </w:pPr>
+          </w:p>
+        </w:tc>
+        <w:tc>
+          <w:tcPr>
+            <w:tcW w:w="2881" w:type="dxa"/>
+          </w:tcPr>
+          <w:p>
+            <w:pPr>
+              <w:rPr>
+                <w:lang w:val="en-US"/>
+              </w:rPr>
+            </w:pPr>
+          </w:p>
+        </w:tc>
+        <w:tc>
+          <w:tcPr>
+            <w:tcW w:w="2507" w:type="dxa"/>
+          </w:tcPr>
+          <w:p>
+            <w:pPr>
+              <w:rPr>
+                <w:lang w:val="en-US"/>
+              </w:rPr>
+            </w:pPr>
+          </w:p>
+        </w:tc>
+        <w:tc>
+          <w:tcPr>
+            <w:tcW w:w="4506" w:type="dxa"/>
+          </w:tcPr>
+          <w:p>
+            <w:pPr>
+              <w:jc w:val="center"/>
+              <w:rPr>
+                <w:lang w:val="en-US"/>
+              </w:rPr>
+            </w:pPr>
+          </w:p>
+        </w:tc>
+      </w:tr>
+      <w:tr>
+        <w:tc>
+          <w:tcPr>
+            <w:tcW w:w="562" w:type="dxa"/>
+          </w:tcPr>
+          <w:p>
+            <w:pPr>
+              <w:jc w:val="center"/>
+              <w:rPr>
+                <w:lang w:val="en-US"/>
+              </w:rPr>
+            </w:pPr>
+          </w:p>
+        </w:tc>
+        <w:tc>
+          <w:tcPr>
+            <w:tcW w:w="2881" w:type="dxa"/>
+          </w:tcPr>
+          <w:p>
+            <w:pPr>
+              <w:rPr>
+                <w:lang w:val="en-US"/>
+              </w:rPr>
+            </w:pPr>
+          </w:p>
+        </w:tc>
+        <w:tc>
+          <w:tcPr>
+            <w:tcW w:w="2507" w:type="dxa"/>
+          </w:tcPr>
+          <w:p>
+            <w:pPr>
+              <w:rPr>
+                <w:lang w:val="en-US"/>
+              </w:rPr>
+            </w:pPr>
+          </w:p>
+        </w:tc>
+        <w:tc>
+          <w:tcPr>
+            <w:tcW w:w="4506" w:type="dxa"/>
           </w:tcPr>
           <w:p>
             <w:pPr>
@@ -2558,7 +3000,7 @@
   <w:style w:type="paragraph" w:default="1" w:styleId="Normal">
     <w:name w:val="Normal"/>
     <w:qFormat/>
-    <w:rsid w:val="00E0114F"/>
+    <w:rsid w:val="00F41DA7"/>
     <w:pPr>
       <w:spacing w:line="259" w:lineRule="auto"/>
     </w:pPr>

</xml_diff>

<commit_message>
Lesson 03: REST Server, express, nodemon, cors, routesr
</commit_message>
<xml_diff>
--- a/Node 54.docx
+++ b/Node 54.docx
@@ -2,22 +2,96 @@
 <file path=word/document.xml><?xml version="1.0" encoding="utf-8"?>
 <w:document xmlns:wpc="http://schemas.microsoft.com/office/word/2010/wordprocessingCanvas" xmlns:cx="http://schemas.microsoft.com/office/drawing/2014/chartex" xmlns:cx1="http://schemas.microsoft.com/office/drawing/2015/9/8/chartex" xmlns:cx2="http://schemas.microsoft.com/office/drawing/2015/10/21/chartex" xmlns:cx3="http://schemas.microsoft.com/office/drawing/2016/5/9/chartex" xmlns:cx4="http://schemas.microsoft.com/office/drawing/2016/5/10/chartex" xmlns:cx5="http://schemas.microsoft.com/office/drawing/2016/5/11/chartex" xmlns:cx6="http://schemas.microsoft.com/office/drawing/2016/5/12/chartex" xmlns:cx7="http://schemas.microsoft.com/office/drawing/2016/5/13/chartex" xmlns:cx8="http://schemas.microsoft.com/office/drawing/2016/5/14/chartex" xmlns:mc="http://schemas.openxmlformats.org/markup-compatibility/2006" xmlns:aink="http://schemas.microsoft.com/office/drawing/2016/ink" xmlns:am3d="http://schemas.microsoft.com/office/drawing/2017/model3d" xmlns:o="urn:schemas-microsoft-com:office:office" xmlns:oel="http://schemas.microsoft.com/office/2019/extlst" xmlns:r="http://schemas.openxmlformats.org/officeDocument/2006/relationships" xmlns:m="http://schemas.openxmlformats.org/officeDocument/2006/math" xmlns:v="urn:schemas-microsoft-com:vml" xmlns:wp14="http://schemas.microsoft.com/office/word/2010/wordprocessingDrawing" xmlns:wp="http://schemas.openxmlformats.org/drawingml/2006/wordprocessingDrawing" xmlns:w10="urn:schemas-microsoft-com:office:word" xmlns:w="http://schemas.openxmlformats.org/wordprocessingml/2006/main" xmlns:w14="http://schemas.microsoft.com/office/word/2010/wordml" xmlns:w15="http://schemas.microsoft.com/office/word/2012/wordml" xmlns:w16cex="http://schemas.microsoft.com/office/word/2018/wordml/cex" xmlns:w16cid="http://schemas.microsoft.com/office/word/2016/wordml/cid" xmlns:w16="http://schemas.microsoft.com/office/word/2018/wordml" xmlns:w16du="http://schemas.microsoft.com/office/word/2023/wordml/word16du" xmlns:w16sdtdh="http://schemas.microsoft.com/office/word/2020/wordml/sdtdatahash" xmlns:w16sdtfl="http://schemas.microsoft.com/office/word/2024/wordml/sdtformatlock" xmlns:w16se="http://schemas.microsoft.com/office/word/2015/wordml/symex" xmlns:wpg="http://schemas.microsoft.com/office/word/2010/wordprocessingGroup" xmlns:wpi="http://schemas.microsoft.com/office/word/2010/wordprocessingInk" xmlns:wne="http://schemas.microsoft.com/office/word/2006/wordml" xmlns:wps="http://schemas.microsoft.com/office/word/2010/wordprocessingShape" mc:Ignorable="w14 w15 w16se w16cid w16 w16cex w16sdtdh w16sdtfl w16du wp14">
   <w:body>
+    <w:p>
+      <w:r>
+        <w:rPr>
+          <w:noProof/>
+        </w:rPr>
+        <w:drawing>
+          <wp:inline distT="0" distB="0" distL="0" distR="0" wp14:anchorId="208CA066" wp14:editId="103834D1">
+            <wp:extent cx="6389363" cy="5023092"/>
+            <wp:effectExtent l="114300" t="114300" r="107315" b="158750"/>
+            <wp:docPr id="1916065673" name="Picture 1"/>
+            <wp:cNvGraphicFramePr>
+              <a:graphicFrameLocks xmlns:a="http://schemas.openxmlformats.org/drawingml/2006/main" noChangeAspect="1"/>
+            </wp:cNvGraphicFramePr>
+            <a:graphic xmlns:a="http://schemas.openxmlformats.org/drawingml/2006/main">
+              <a:graphicData uri="http://schemas.openxmlformats.org/drawingml/2006/picture">
+                <pic:pic xmlns:pic="http://schemas.openxmlformats.org/drawingml/2006/picture">
+                  <pic:nvPicPr>
+                    <pic:cNvPr id="1916065673" name=""/>
+                    <pic:cNvPicPr/>
+                  </pic:nvPicPr>
+                  <pic:blipFill>
+                    <a:blip r:embed="rId5"/>
+                    <a:stretch>
+                      <a:fillRect/>
+                    </a:stretch>
+                  </pic:blipFill>
+                  <pic:spPr>
+                    <a:xfrm>
+                      <a:off x="0" y="0"/>
+                      <a:ext cx="6397260" cy="5029300"/>
+                    </a:xfrm>
+                    <a:prstGeom prst="rect">
+                      <a:avLst/>
+                    </a:prstGeom>
+                    <a:solidFill>
+                      <a:srgbClr val="FFFFFF">
+                        <a:shade val="85000"/>
+                      </a:srgbClr>
+                    </a:solidFill>
+                    <a:ln w="88900" cap="sq">
+                      <a:solidFill>
+                        <a:srgbClr val="FFFFFF"/>
+                      </a:solidFill>
+                      <a:miter lim="800000"/>
+                    </a:ln>
+                    <a:effectLst>
+                      <a:outerShdw blurRad="55000" dist="18000" dir="5400000" algn="tl" rotWithShape="0">
+                        <a:srgbClr val="000000">
+                          <a:alpha val="40000"/>
+                        </a:srgbClr>
+                      </a:outerShdw>
+                    </a:effectLst>
+                    <a:scene3d>
+                      <a:camera prst="orthographicFront"/>
+                      <a:lightRig rig="twoPt" dir="t">
+                        <a:rot lat="0" lon="0" rev="7200000"/>
+                      </a:lightRig>
+                    </a:scene3d>
+                    <a:sp3d>
+                      <a:bevelT w="25400" h="19050"/>
+                      <a:contourClr>
+                        <a:srgbClr val="FFFFFF"/>
+                      </a:contourClr>
+                    </a:sp3d>
+                  </pic:spPr>
+                </pic:pic>
+              </a:graphicData>
+            </a:graphic>
+          </wp:inline>
+        </w:drawing>
+      </w:r>
+    </w:p>
     <w:tbl>
       <w:tblPr>
         <w:tblStyle w:val="TableGrid"/>
         <w:tblW w:w="0" w:type="auto"/>
+        <w:tblLayout w:type="fixed"/>
         <w:tblLook w:val="04A0" w:firstRow="1" w:lastRow="0" w:firstColumn="1" w:lastColumn="0" w:noHBand="0" w:noVBand="1"/>
       </w:tblPr>
       <w:tblGrid>
-        <w:gridCol w:w="749"/>
-        <w:gridCol w:w="2773"/>
-        <w:gridCol w:w="2428"/>
+        <w:gridCol w:w="1054"/>
+        <w:gridCol w:w="1635"/>
+        <w:gridCol w:w="567"/>
+        <w:gridCol w:w="2694"/>
         <w:gridCol w:w="4506"/>
       </w:tblGrid>
       <w:tr>
         <w:tc>
           <w:tcPr>
-            <w:tcW w:w="562" w:type="dxa"/>
+            <w:tcW w:w="1054" w:type="dxa"/>
             <w:tcBorders>
               <w:bottom w:val="single" w:sz="4" w:space="0" w:color="auto"/>
             </w:tcBorders>
@@ -39,7 +113,8 @@
         </w:tc>
         <w:tc>
           <w:tcPr>
-            <w:tcW w:w="2881" w:type="dxa"/>
+            <w:tcW w:w="2202" w:type="dxa"/>
+            <w:gridSpan w:val="2"/>
             <w:tcBorders>
               <w:bottom w:val="single" w:sz="4" w:space="0" w:color="auto"/>
             </w:tcBorders>
@@ -61,7 +136,7 @@
         </w:tc>
         <w:tc>
           <w:tcPr>
-            <w:tcW w:w="2507" w:type="dxa"/>
+            <w:tcW w:w="2694" w:type="dxa"/>
             <w:tcBorders>
               <w:bottom w:val="single" w:sz="4" w:space="0" w:color="auto"/>
             </w:tcBorders>
@@ -114,18 +189,26 @@
         <w:tc>
           <w:tcPr>
             <w:tcW w:w="10456" w:type="dxa"/>
-            <w:gridSpan w:val="4"/>
+            <w:gridSpan w:val="5"/>
             <w:shd w:val="clear" w:color="auto" w:fill="FFFF00"/>
           </w:tcPr>
           <w:p>
             <w:pPr>
               <w:jc w:val="center"/>
               <w:rPr>
-                <w:lang w:val="en-US"/>
-              </w:rPr>
-            </w:pPr>
-            <w:r>
-              <w:rPr>
+                <w:b/>
+                <w:bCs/>
+                <w:sz w:val="32"/>
+                <w:szCs w:val="32"/>
+                <w:lang w:val="en-US"/>
+              </w:rPr>
+            </w:pPr>
+            <w:r>
+              <w:rPr>
+                <w:b/>
+                <w:bCs/>
+                <w:sz w:val="32"/>
+                <w:szCs w:val="32"/>
                 <w:lang w:val="en-US"/>
               </w:rPr>
               <w:t>Lesson 01</w:t>
@@ -136,7 +219,7 @@
       <w:tr>
         <w:tc>
           <w:tcPr>
-            <w:tcW w:w="562" w:type="dxa"/>
+            <w:tcW w:w="1054" w:type="dxa"/>
           </w:tcPr>
           <w:p>
             <w:pPr>
@@ -155,7 +238,8 @@
         </w:tc>
         <w:tc>
           <w:tcPr>
-            <w:tcW w:w="2881" w:type="dxa"/>
+            <w:tcW w:w="2202" w:type="dxa"/>
+            <w:gridSpan w:val="2"/>
           </w:tcPr>
           <w:p>
             <w:pPr>
@@ -173,7 +257,7 @@
         </w:tc>
         <w:tc>
           <w:tcPr>
-            <w:tcW w:w="2507" w:type="dxa"/>
+            <w:tcW w:w="2694" w:type="dxa"/>
           </w:tcPr>
           <w:p>
             <w:pPr>
@@ -249,7 +333,7 @@
                           <pic:cNvPicPr/>
                         </pic:nvPicPr>
                         <pic:blipFill>
-                          <a:blip r:embed="rId5"/>
+                          <a:blip r:embed="rId6"/>
                           <a:stretch>
                             <a:fillRect/>
                           </a:stretch>
@@ -305,26 +389,28 @@
       <w:tr>
         <w:tc>
           <w:tcPr>
-            <w:tcW w:w="562" w:type="dxa"/>
-          </w:tcPr>
-          <w:p>
-            <w:pPr>
-              <w:jc w:val="center"/>
-              <w:rPr>
-                <w:lang w:val="en-US"/>
-              </w:rPr>
-            </w:pPr>
-            <w:r>
-              <w:rPr>
-                <w:lang w:val="en-US"/>
-              </w:rPr>
+            <w:tcW w:w="1054" w:type="dxa"/>
+          </w:tcPr>
+          <w:p>
+            <w:pPr>
+              <w:jc w:val="center"/>
+              <w:rPr>
+                <w:lang w:val="en-US"/>
+              </w:rPr>
+            </w:pPr>
+            <w:r>
+              <w:rPr>
+                <w:lang w:val="en-US"/>
+              </w:rPr>
+              <w:lastRenderedPageBreak/>
               <w:t>18:07</w:t>
             </w:r>
           </w:p>
         </w:tc>
         <w:tc>
           <w:tcPr>
-            <w:tcW w:w="2881" w:type="dxa"/>
+            <w:tcW w:w="2202" w:type="dxa"/>
+            <w:gridSpan w:val="2"/>
           </w:tcPr>
           <w:p>
             <w:pPr>
@@ -342,7 +428,7 @@
         </w:tc>
         <w:tc>
           <w:tcPr>
-            <w:tcW w:w="2507" w:type="dxa"/>
+            <w:tcW w:w="2694" w:type="dxa"/>
           </w:tcPr>
           <w:p>
             <w:pPr>
@@ -403,7 +489,7 @@
                           <pic:cNvPicPr/>
                         </pic:nvPicPr>
                         <pic:blipFill>
-                          <a:blip r:embed="rId6"/>
+                          <a:blip r:embed="rId7"/>
                           <a:stretch>
                             <a:fillRect/>
                           </a:stretch>
@@ -460,7 +546,7 @@
         <w:tc>
           <w:tcPr>
             <w:tcW w:w="10456" w:type="dxa"/>
-            <w:gridSpan w:val="4"/>
+            <w:gridSpan w:val="5"/>
           </w:tcPr>
           <w:p>
             <w:pPr>
@@ -685,7 +771,7 @@
       <w:tr>
         <w:tc>
           <w:tcPr>
-            <w:tcW w:w="562" w:type="dxa"/>
+            <w:tcW w:w="1054" w:type="dxa"/>
           </w:tcPr>
           <w:p>
             <w:pPr>
@@ -710,7 +796,8 @@
         </w:tc>
         <w:tc>
           <w:tcPr>
-            <w:tcW w:w="2881" w:type="dxa"/>
+            <w:tcW w:w="2202" w:type="dxa"/>
+            <w:gridSpan w:val="2"/>
           </w:tcPr>
           <w:p>
             <w:pPr>
@@ -742,7 +829,7 @@
         </w:tc>
         <w:tc>
           <w:tcPr>
-            <w:tcW w:w="2507" w:type="dxa"/>
+            <w:tcW w:w="2694" w:type="dxa"/>
           </w:tcPr>
           <w:p>
             <w:pPr>
@@ -797,7 +884,7 @@
                           <pic:cNvPicPr/>
                         </pic:nvPicPr>
                         <pic:blipFill>
-                          <a:blip r:embed="rId7"/>
+                          <a:blip r:embed="rId8"/>
                           <a:stretch>
                             <a:fillRect/>
                           </a:stretch>
@@ -853,7 +940,7 @@
       <w:tr>
         <w:tc>
           <w:tcPr>
-            <w:tcW w:w="562" w:type="dxa"/>
+            <w:tcW w:w="1054" w:type="dxa"/>
           </w:tcPr>
           <w:p>
             <w:pPr>
@@ -872,7 +959,8 @@
         </w:tc>
         <w:tc>
           <w:tcPr>
-            <w:tcW w:w="2881" w:type="dxa"/>
+            <w:tcW w:w="2202" w:type="dxa"/>
+            <w:gridSpan w:val="2"/>
           </w:tcPr>
           <w:p>
             <w:pPr>
@@ -890,7 +978,7 @@
         </w:tc>
         <w:tc>
           <w:tcPr>
-            <w:tcW w:w="2507" w:type="dxa"/>
+            <w:tcW w:w="2694" w:type="dxa"/>
           </w:tcPr>
           <w:p>
             <w:pPr>
@@ -937,7 +1025,7 @@
                           <pic:cNvPicPr/>
                         </pic:nvPicPr>
                         <pic:blipFill>
-                          <a:blip r:embed="rId8"/>
+                          <a:blip r:embed="rId9"/>
                           <a:stretch>
                             <a:fillRect/>
                           </a:stretch>
@@ -993,7 +1081,7 @@
       <w:tr>
         <w:tc>
           <w:tcPr>
-            <w:tcW w:w="562" w:type="dxa"/>
+            <w:tcW w:w="1054" w:type="dxa"/>
           </w:tcPr>
           <w:p>
             <w:pPr>
@@ -1012,7 +1100,8 @@
         </w:tc>
         <w:tc>
           <w:tcPr>
-            <w:tcW w:w="2881" w:type="dxa"/>
+            <w:tcW w:w="2202" w:type="dxa"/>
+            <w:gridSpan w:val="2"/>
           </w:tcPr>
           <w:p>
             <w:pPr>
@@ -1044,7 +1133,7 @@
         </w:tc>
         <w:tc>
           <w:tcPr>
-            <w:tcW w:w="2507" w:type="dxa"/>
+            <w:tcW w:w="2694" w:type="dxa"/>
           </w:tcPr>
           <w:p>
             <w:pPr>
@@ -1091,7 +1180,7 @@
                           <pic:cNvPicPr/>
                         </pic:nvPicPr>
                         <pic:blipFill>
-                          <a:blip r:embed="rId9"/>
+                          <a:blip r:embed="rId10"/>
                           <a:stretch>
                             <a:fillRect/>
                           </a:stretch>
@@ -1147,7 +1236,7 @@
       <w:tr>
         <w:tc>
           <w:tcPr>
-            <w:tcW w:w="562" w:type="dxa"/>
+            <w:tcW w:w="1054" w:type="dxa"/>
           </w:tcPr>
           <w:p>
             <w:pPr>
@@ -1166,8 +1255,8 @@
         </w:tc>
         <w:tc>
           <w:tcPr>
-            <w:tcW w:w="9894" w:type="dxa"/>
-            <w:gridSpan w:val="3"/>
+            <w:tcW w:w="9402" w:type="dxa"/>
+            <w:gridSpan w:val="4"/>
           </w:tcPr>
           <w:p>
             <w:pPr>
@@ -1188,20 +1277,21 @@
       <w:tr>
         <w:tc>
           <w:tcPr>
-            <w:tcW w:w="562" w:type="dxa"/>
-          </w:tcPr>
-          <w:p>
-            <w:pPr>
-              <w:jc w:val="center"/>
-              <w:rPr>
-                <w:lang w:val="en-US"/>
-              </w:rPr>
-            </w:pPr>
-          </w:p>
-        </w:tc>
-        <w:tc>
-          <w:tcPr>
-            <w:tcW w:w="2881" w:type="dxa"/>
+            <w:tcW w:w="1054" w:type="dxa"/>
+          </w:tcPr>
+          <w:p>
+            <w:pPr>
+              <w:jc w:val="center"/>
+              <w:rPr>
+                <w:lang w:val="en-US"/>
+              </w:rPr>
+            </w:pPr>
+          </w:p>
+        </w:tc>
+        <w:tc>
+          <w:tcPr>
+            <w:tcW w:w="2202" w:type="dxa"/>
+            <w:gridSpan w:val="2"/>
           </w:tcPr>
           <w:p>
             <w:pPr>
@@ -1239,7 +1329,7 @@
         </w:tc>
         <w:tc>
           <w:tcPr>
-            <w:tcW w:w="2507" w:type="dxa"/>
+            <w:tcW w:w="2694" w:type="dxa"/>
           </w:tcPr>
           <w:p>
             <w:pPr>
@@ -1313,7 +1403,7 @@
                           <pic:cNvPicPr/>
                         </pic:nvPicPr>
                         <pic:blipFill>
-                          <a:blip r:embed="rId10"/>
+                          <a:blip r:embed="rId11"/>
                           <a:stretch>
                             <a:fillRect/>
                           </a:stretch>
@@ -1370,7 +1460,7 @@
         <w:tc>
           <w:tcPr>
             <w:tcW w:w="10456" w:type="dxa"/>
-            <w:gridSpan w:val="4"/>
+            <w:gridSpan w:val="5"/>
           </w:tcPr>
           <w:p>
             <w:pPr>
@@ -1452,7 +1542,7 @@
         </w:trPr>
         <w:tc>
           <w:tcPr>
-            <w:tcW w:w="562" w:type="dxa"/>
+            <w:tcW w:w="1054" w:type="dxa"/>
             <w:vMerge w:val="restart"/>
           </w:tcPr>
           <w:p>
@@ -1472,7 +1562,8 @@
         </w:tc>
         <w:tc>
           <w:tcPr>
-            <w:tcW w:w="2881" w:type="dxa"/>
+            <w:tcW w:w="2202" w:type="dxa"/>
+            <w:gridSpan w:val="2"/>
             <w:vMerge w:val="restart"/>
           </w:tcPr>
           <w:p>
@@ -1491,7 +1582,7 @@
         </w:tc>
         <w:tc>
           <w:tcPr>
-            <w:tcW w:w="2507" w:type="dxa"/>
+            <w:tcW w:w="2694" w:type="dxa"/>
           </w:tcPr>
           <w:p>
             <w:pPr>
@@ -1552,7 +1643,7 @@
                           <pic:cNvPicPr/>
                         </pic:nvPicPr>
                         <pic:blipFill>
-                          <a:blip r:embed="rId11"/>
+                          <a:blip r:embed="rId12"/>
                           <a:stretch>
                             <a:fillRect/>
                           </a:stretch>
@@ -1611,7 +1702,7 @@
         </w:trPr>
         <w:tc>
           <w:tcPr>
-            <w:tcW w:w="562" w:type="dxa"/>
+            <w:tcW w:w="1054" w:type="dxa"/>
             <w:vMerge/>
           </w:tcPr>
           <w:p>
@@ -1625,7 +1716,8 @@
         </w:tc>
         <w:tc>
           <w:tcPr>
-            <w:tcW w:w="2881" w:type="dxa"/>
+            <w:tcW w:w="2202" w:type="dxa"/>
+            <w:gridSpan w:val="2"/>
             <w:vMerge/>
           </w:tcPr>
           <w:p>
@@ -1638,7 +1730,7 @@
         </w:tc>
         <w:tc>
           <w:tcPr>
-            <w:tcW w:w="2507" w:type="dxa"/>
+            <w:tcW w:w="2694" w:type="dxa"/>
           </w:tcPr>
           <w:p>
             <w:pPr>
@@ -1685,7 +1777,7 @@
                           <pic:cNvPicPr/>
                         </pic:nvPicPr>
                         <pic:blipFill>
-                          <a:blip r:embed="rId12"/>
+                          <a:blip r:embed="rId13"/>
                           <a:stretch>
                             <a:fillRect/>
                           </a:stretch>
@@ -1747,6 +1839,7 @@
               <w:rPr>
                 <w:noProof/>
               </w:rPr>
+              <w:lastRenderedPageBreak/>
               <w:drawing>
                 <wp:inline distT="0" distB="0" distL="0" distR="0" wp14:anchorId="77EF99E7" wp14:editId="762DBCA9">
                   <wp:extent cx="2354209" cy="844186"/>
@@ -1763,7 +1856,7 @@
                           <pic:cNvPicPr/>
                         </pic:nvPicPr>
                         <pic:blipFill>
-                          <a:blip r:embed="rId13"/>
+                          <a:blip r:embed="rId14"/>
                           <a:stretch>
                             <a:fillRect/>
                           </a:stretch>
@@ -1819,7 +1912,7 @@
       <w:tr>
         <w:tc>
           <w:tcPr>
-            <w:tcW w:w="562" w:type="dxa"/>
+            <w:tcW w:w="1054" w:type="dxa"/>
             <w:tcBorders>
               <w:bottom w:val="single" w:sz="4" w:space="0" w:color="auto"/>
             </w:tcBorders>
@@ -1835,13 +1928,15 @@
               <w:rPr>
                 <w:lang w:val="en-US"/>
               </w:rPr>
+              <w:lastRenderedPageBreak/>
               <w:t>Time</w:t>
             </w:r>
           </w:p>
         </w:tc>
         <w:tc>
           <w:tcPr>
-            <w:tcW w:w="2881" w:type="dxa"/>
+            <w:tcW w:w="2202" w:type="dxa"/>
+            <w:gridSpan w:val="2"/>
             <w:tcBorders>
               <w:bottom w:val="single" w:sz="4" w:space="0" w:color="auto"/>
             </w:tcBorders>
@@ -1863,7 +1958,7 @@
         </w:tc>
         <w:tc>
           <w:tcPr>
-            <w:tcW w:w="2507" w:type="dxa"/>
+            <w:tcW w:w="2694" w:type="dxa"/>
             <w:tcBorders>
               <w:bottom w:val="single" w:sz="4" w:space="0" w:color="auto"/>
             </w:tcBorders>
@@ -1916,27 +2011,29 @@
         <w:tc>
           <w:tcPr>
             <w:tcW w:w="10456" w:type="dxa"/>
-            <w:gridSpan w:val="4"/>
+            <w:gridSpan w:val="5"/>
             <w:shd w:val="clear" w:color="auto" w:fill="FFFF00"/>
           </w:tcPr>
           <w:p>
             <w:pPr>
               <w:jc w:val="center"/>
               <w:rPr>
-                <w:lang w:val="en-US"/>
-              </w:rPr>
-            </w:pPr>
-            <w:r>
-              <w:rPr>
-                <w:lang w:val="en-US"/>
-              </w:rPr>
-              <w:t>Lesson 0</w:t>
-            </w:r>
-            <w:r>
-              <w:rPr>
-                <w:lang w:val="en-US"/>
-              </w:rPr>
-              <w:t>2</w:t>
+                <w:b/>
+                <w:bCs/>
+                <w:sz w:val="32"/>
+                <w:szCs w:val="32"/>
+                <w:lang w:val="en-US"/>
+              </w:rPr>
+            </w:pPr>
+            <w:r>
+              <w:rPr>
+                <w:b/>
+                <w:bCs/>
+                <w:sz w:val="32"/>
+                <w:szCs w:val="32"/>
+                <w:lang w:val="en-US"/>
+              </w:rPr>
+              <w:t>Lesson 02</w:t>
             </w:r>
           </w:p>
         </w:tc>
@@ -1944,7 +2041,7 @@
       <w:tr>
         <w:tc>
           <w:tcPr>
-            <w:tcW w:w="562" w:type="dxa"/>
+            <w:tcW w:w="1054" w:type="dxa"/>
           </w:tcPr>
           <w:p>
             <w:pPr>
@@ -1963,33 +2060,21 @@
         </w:tc>
         <w:tc>
           <w:tcPr>
-            <w:tcW w:w="9894" w:type="dxa"/>
-            <w:gridSpan w:val="3"/>
-          </w:tcPr>
-          <w:p>
-            <w:pPr>
-              <w:jc w:val="center"/>
-              <w:rPr>
-                <w:lang w:val="en-US"/>
-              </w:rPr>
-            </w:pPr>
-            <w:r>
-              <w:rPr>
-                <w:lang w:val="en-US"/>
-              </w:rPr>
-              <w:t xml:space="preserve">Lab </w:t>
-            </w:r>
-            <w:r>
-              <w:rPr>
-                <w:lang w:val="en-US"/>
-              </w:rPr>
-              <w:t>04</w:t>
-            </w:r>
-            <w:r>
-              <w:rPr>
-                <w:lang w:val="en-US"/>
-              </w:rPr>
-              <w:t xml:space="preserve"> Solution</w:t>
+            <w:tcW w:w="9402" w:type="dxa"/>
+            <w:gridSpan w:val="4"/>
+          </w:tcPr>
+          <w:p>
+            <w:pPr>
+              <w:jc w:val="center"/>
+              <w:rPr>
+                <w:lang w:val="en-US"/>
+              </w:rPr>
+            </w:pPr>
+            <w:r>
+              <w:rPr>
+                <w:lang w:val="en-US"/>
+              </w:rPr>
+              <w:t>Lab 04 Solution</w:t>
             </w:r>
           </w:p>
         </w:tc>
@@ -1997,7 +2082,7 @@
       <w:tr>
         <w:tc>
           <w:tcPr>
-            <w:tcW w:w="562" w:type="dxa"/>
+            <w:tcW w:w="1054" w:type="dxa"/>
           </w:tcPr>
           <w:p>
             <w:pPr>
@@ -2016,7 +2101,8 @@
         </w:tc>
         <w:tc>
           <w:tcPr>
-            <w:tcW w:w="2881" w:type="dxa"/>
+            <w:tcW w:w="2202" w:type="dxa"/>
+            <w:gridSpan w:val="2"/>
           </w:tcPr>
           <w:p>
             <w:pPr>
@@ -2034,7 +2120,7 @@
         </w:tc>
         <w:tc>
           <w:tcPr>
-            <w:tcW w:w="2507" w:type="dxa"/>
+            <w:tcW w:w="2694" w:type="dxa"/>
           </w:tcPr>
           <w:p>
             <w:pPr>
@@ -2081,7 +2167,7 @@
                           <pic:cNvPicPr/>
                         </pic:nvPicPr>
                         <pic:blipFill>
-                          <a:blip r:embed="rId14"/>
+                          <a:blip r:embed="rId15"/>
                           <a:stretch>
                             <a:fillRect/>
                           </a:stretch>
@@ -2129,7 +2215,7 @@
                           <pic:cNvPicPr/>
                         </pic:nvPicPr>
                         <pic:blipFill>
-                          <a:blip r:embed="rId15"/>
+                          <a:blip r:embed="rId16"/>
                           <a:stretch>
                             <a:fillRect/>
                           </a:stretch>
@@ -2154,10 +2240,923 @@
             <w:pPr>
               <w:jc w:val="center"/>
               <w:rPr>
+                <w:rtl/>
+                <w:lang w:val="en-US"/>
+              </w:rPr>
+            </w:pPr>
+          </w:p>
+        </w:tc>
+      </w:tr>
+      <w:tr>
+        <w:tc>
+          <w:tcPr>
+            <w:tcW w:w="1054" w:type="dxa"/>
+            <w:tcBorders>
+              <w:bottom w:val="single" w:sz="4" w:space="0" w:color="auto"/>
+            </w:tcBorders>
+          </w:tcPr>
+          <w:p>
+            <w:pPr>
+              <w:jc w:val="center"/>
+              <w:rPr>
+                <w:lang w:val="en-US"/>
+              </w:rPr>
+            </w:pPr>
+            <w:r>
+              <w:rPr>
+                <w:lang w:val="en-US"/>
+              </w:rPr>
+              <w:t>Time</w:t>
+            </w:r>
+          </w:p>
+        </w:tc>
+        <w:tc>
+          <w:tcPr>
+            <w:tcW w:w="2202" w:type="dxa"/>
+            <w:gridSpan w:val="2"/>
+            <w:tcBorders>
+              <w:bottom w:val="single" w:sz="4" w:space="0" w:color="auto"/>
+            </w:tcBorders>
+          </w:tcPr>
+          <w:p>
+            <w:pPr>
+              <w:jc w:val="center"/>
+              <w:rPr>
+                <w:lang w:val="en-US"/>
+              </w:rPr>
+            </w:pPr>
+            <w:r>
+              <w:rPr>
+                <w:lang w:val="en-US"/>
+              </w:rPr>
+              <w:t>Concept</w:t>
+            </w:r>
+          </w:p>
+        </w:tc>
+        <w:tc>
+          <w:tcPr>
+            <w:tcW w:w="2694" w:type="dxa"/>
+            <w:tcBorders>
+              <w:bottom w:val="single" w:sz="4" w:space="0" w:color="auto"/>
+            </w:tcBorders>
+          </w:tcPr>
+          <w:p>
+            <w:pPr>
+              <w:jc w:val="center"/>
+              <w:rPr>
+                <w:lang w:val="en-US"/>
+              </w:rPr>
+            </w:pPr>
+            <w:r>
+              <w:rPr>
+                <w:lang w:val="en-US"/>
+              </w:rPr>
+              <w:t>E</w:t>
+            </w:r>
+            <w:r>
+              <w:rPr>
+                <w:lang w:val="en-US"/>
+              </w:rPr>
+              <w:t>xplanation</w:t>
+            </w:r>
+          </w:p>
+        </w:tc>
+        <w:tc>
+          <w:tcPr>
+            <w:tcW w:w="4506" w:type="dxa"/>
+            <w:tcBorders>
+              <w:bottom w:val="single" w:sz="4" w:space="0" w:color="auto"/>
+            </w:tcBorders>
+          </w:tcPr>
+          <w:p>
+            <w:pPr>
+              <w:jc w:val="center"/>
+              <w:rPr>
+                <w:lang w:val="en-US"/>
+              </w:rPr>
+            </w:pPr>
+            <w:r>
+              <w:rPr>
+                <w:lang w:val="en-US"/>
+              </w:rPr>
+              <w:t>Example</w:t>
+            </w:r>
+          </w:p>
+        </w:tc>
+      </w:tr>
+      <w:tr>
+        <w:tc>
+          <w:tcPr>
+            <w:tcW w:w="10456" w:type="dxa"/>
+            <w:gridSpan w:val="5"/>
+            <w:shd w:val="clear" w:color="auto" w:fill="FFFF00"/>
+          </w:tcPr>
+          <w:p>
+            <w:pPr>
+              <w:jc w:val="center"/>
+              <w:rPr>
+                <w:b/>
+                <w:bCs/>
+                <w:sz w:val="28"/>
+                <w:szCs w:val="28"/>
+                <w:lang w:val="en-US"/>
+              </w:rPr>
+            </w:pPr>
+            <w:r>
+              <w:rPr>
+                <w:b/>
+                <w:bCs/>
+                <w:sz w:val="28"/>
+                <w:szCs w:val="28"/>
+                <w:lang w:val="en-US"/>
+              </w:rPr>
+              <w:t>Lesson 03</w:t>
+            </w:r>
+          </w:p>
+        </w:tc>
+      </w:tr>
+      <w:tr>
+        <w:tc>
+          <w:tcPr>
+            <w:tcW w:w="1054" w:type="dxa"/>
+          </w:tcPr>
+          <w:p>
+            <w:pPr>
+              <w:jc w:val="center"/>
+              <w:rPr>
+                <w:lang w:val="en-US"/>
+              </w:rPr>
+            </w:pPr>
+            <w:r>
+              <w:rPr>
+                <w:lang w:val="en-US"/>
+              </w:rPr>
+              <w:t>00:00:00</w:t>
+            </w:r>
+          </w:p>
+        </w:tc>
+        <w:tc>
+          <w:tcPr>
+            <w:tcW w:w="9402" w:type="dxa"/>
+            <w:gridSpan w:val="4"/>
+          </w:tcPr>
+          <w:p>
+            <w:pPr>
+              <w:jc w:val="center"/>
+              <w:rPr>
+                <w:lang w:val="en-US"/>
+              </w:rPr>
+            </w:pPr>
+            <w:r>
+              <w:rPr>
+                <w:lang w:val="en-US"/>
+              </w:rPr>
+              <w:t>Lab 05 solution</w:t>
+            </w:r>
+          </w:p>
+        </w:tc>
+      </w:tr>
+      <w:tr>
+        <w:tc>
+          <w:tcPr>
+            <w:tcW w:w="1054" w:type="dxa"/>
+          </w:tcPr>
+          <w:p>
+            <w:pPr>
+              <w:jc w:val="center"/>
+              <w:rPr>
+                <w:lang w:val="en-US"/>
+              </w:rPr>
+            </w:pPr>
+            <w:r>
+              <w:rPr>
+                <w:lang w:val="en-US"/>
+              </w:rPr>
+              <w:t>00:</w:t>
+            </w:r>
+            <w:r>
+              <w:rPr>
+                <w:lang w:val="en-US"/>
+              </w:rPr>
+              <w:t>32</w:t>
+            </w:r>
+          </w:p>
+        </w:tc>
+        <w:tc>
+          <w:tcPr>
+            <w:tcW w:w="2202" w:type="dxa"/>
+            <w:gridSpan w:val="2"/>
+          </w:tcPr>
+          <w:p>
+            <w:pPr>
+              <w:rPr>
+                <w:lang w:val="en-US"/>
+              </w:rPr>
+            </w:pPr>
+            <w:r>
+              <w:rPr>
+                <w:lang w:val="en-US"/>
+              </w:rPr>
+              <w:t xml:space="preserve">Rest </w:t>
+            </w:r>
+            <w:r>
+              <w:rPr>
+                <w:lang w:val="en-US"/>
+              </w:rPr>
+              <w:t>API</w:t>
+            </w:r>
+            <w:r>
+              <w:rPr>
+                <w:lang w:val="en-US"/>
+              </w:rPr>
+              <w:t xml:space="preserve"> (Serv</w:t>
+            </w:r>
+            <w:r>
+              <w:rPr>
+                <w:lang w:val="en-US"/>
+              </w:rPr>
+              <w:t>er</w:t>
+            </w:r>
+            <w:r>
+              <w:rPr>
+                <w:lang w:val="en-US"/>
+              </w:rPr>
+              <w:t xml:space="preserve"> type)</w:t>
+            </w:r>
+          </w:p>
+        </w:tc>
+        <w:tc>
+          <w:tcPr>
+            <w:tcW w:w="2694" w:type="dxa"/>
+          </w:tcPr>
+          <w:p>
+            <w:pPr>
+              <w:rPr>
+                <w:lang w:val="en-US"/>
+              </w:rPr>
+            </w:pPr>
+          </w:p>
+        </w:tc>
+        <w:tc>
+          <w:tcPr>
+            <w:tcW w:w="4506" w:type="dxa"/>
+          </w:tcPr>
+          <w:p>
+            <w:pPr>
+              <w:jc w:val="center"/>
+              <w:rPr>
+                <w:lang w:val="en-US"/>
+              </w:rPr>
+            </w:pPr>
+            <w:r>
+              <w:rPr>
+                <w:noProof/>
+              </w:rPr>
+              <w:drawing>
+                <wp:inline distT="0" distB="0" distL="0" distR="0" wp14:anchorId="70643886" wp14:editId="64EAA137">
+                  <wp:extent cx="2642528" cy="1489166"/>
+                  <wp:effectExtent l="0" t="0" r="5715" b="0"/>
+                  <wp:docPr id="156198820" name="Picture 1"/>
+                  <wp:cNvGraphicFramePr>
+                    <a:graphicFrameLocks xmlns:a="http://schemas.openxmlformats.org/drawingml/2006/main" noChangeAspect="1"/>
+                  </wp:cNvGraphicFramePr>
+                  <a:graphic xmlns:a="http://schemas.openxmlformats.org/drawingml/2006/main">
+                    <a:graphicData uri="http://schemas.openxmlformats.org/drawingml/2006/picture">
+                      <pic:pic xmlns:pic="http://schemas.openxmlformats.org/drawingml/2006/picture">
+                        <pic:nvPicPr>
+                          <pic:cNvPr id="156198820" name=""/>
+                          <pic:cNvPicPr/>
+                        </pic:nvPicPr>
+                        <pic:blipFill>
+                          <a:blip r:embed="rId17"/>
+                          <a:stretch>
+                            <a:fillRect/>
+                          </a:stretch>
+                        </pic:blipFill>
+                        <pic:spPr>
+                          <a:xfrm>
+                            <a:off x="0" y="0"/>
+                            <a:ext cx="2733492" cy="1540428"/>
+                          </a:xfrm>
+                          <a:prstGeom prst="rect">
+                            <a:avLst/>
+                          </a:prstGeom>
+                        </pic:spPr>
+                      </pic:pic>
+                    </a:graphicData>
+                  </a:graphic>
+                </wp:inline>
+              </w:drawing>
+            </w:r>
+          </w:p>
+          <w:p>
+            <w:pPr>
+              <w:jc w:val="center"/>
+              <w:rPr>
+                <w:lang w:val="en-US"/>
+              </w:rPr>
+            </w:pPr>
+          </w:p>
+        </w:tc>
+      </w:tr>
+      <w:tr>
+        <w:tc>
+          <w:tcPr>
+            <w:tcW w:w="1054" w:type="dxa"/>
+          </w:tcPr>
+          <w:p>
+            <w:pPr>
+              <w:jc w:val="center"/>
+              <w:rPr>
+                <w:lang w:val="en-US"/>
+              </w:rPr>
+            </w:pPr>
+            <w:r>
+              <w:rPr>
+                <w:lang w:val="en-US"/>
+              </w:rPr>
+              <w:t>00:40:28</w:t>
+            </w:r>
+          </w:p>
+        </w:tc>
+        <w:tc>
+          <w:tcPr>
+            <w:tcW w:w="2202" w:type="dxa"/>
+            <w:gridSpan w:val="2"/>
+          </w:tcPr>
+          <w:p>
+            <w:pPr>
+              <w:rPr>
+                <w:lang w:val="en-US"/>
+              </w:rPr>
+            </w:pPr>
+            <w:r>
+              <w:rPr>
+                <w:lang w:val="en-US"/>
+              </w:rPr>
+              <w:t>Creation of Rest API server in NODE</w:t>
+            </w:r>
+          </w:p>
+        </w:tc>
+        <w:tc>
+          <w:tcPr>
+            <w:tcW w:w="2694" w:type="dxa"/>
+          </w:tcPr>
+          <w:p>
+            <w:pPr>
+              <w:rPr>
+                <w:lang w:val="en-US"/>
+              </w:rPr>
+            </w:pPr>
+            <w:r>
+              <w:rPr>
+                <w:lang w:val="en-US"/>
+              </w:rPr>
+              <w:t xml:space="preserve">The creation of the server if this type needs to import library </w:t>
+            </w:r>
+          </w:p>
+          <w:p>
+            <w:pPr>
+              <w:rPr>
+                <w:lang w:val="en-US"/>
+              </w:rPr>
+            </w:pPr>
+            <w:r>
+              <w:rPr>
+                <w:lang w:val="en-US"/>
+              </w:rPr>
+              <w:t>“express”</w:t>
+            </w:r>
+          </w:p>
+        </w:tc>
+        <w:tc>
+          <w:tcPr>
+            <w:tcW w:w="4506" w:type="dxa"/>
+          </w:tcPr>
+          <w:p>
+            <w:pPr>
+              <w:jc w:val="center"/>
+              <w:rPr>
+                <w:lang w:val="en-US"/>
+              </w:rPr>
+            </w:pPr>
+          </w:p>
+        </w:tc>
+      </w:tr>
+      <w:tr>
+        <w:tc>
+          <w:tcPr>
+            <w:tcW w:w="10456" w:type="dxa"/>
+            <w:gridSpan w:val="5"/>
+          </w:tcPr>
+          <w:p>
+            <w:pPr>
+              <w:jc w:val="center"/>
+              <w:rPr>
+                <w:b/>
+                <w:bCs/>
+                <w:u w:val="single"/>
+                <w:lang w:val="en-US"/>
+              </w:rPr>
+            </w:pPr>
+            <w:r>
+              <w:rPr>
+                <w:b/>
+                <w:bCs/>
+                <w:highlight w:val="yellow"/>
+                <w:u w:val="single"/>
+                <w:lang w:val="en-US"/>
+              </w:rPr>
+              <w:t xml:space="preserve">Import the express </w:t>
+            </w:r>
+            <w:r>
+              <w:rPr>
+                <w:b/>
+                <w:bCs/>
+                <w:highlight w:val="yellow"/>
+                <w:u w:val="single"/>
+                <w:lang w:val="en-US"/>
+              </w:rPr>
+              <w:t>package</w:t>
+            </w:r>
+            <w:r>
+              <w:rPr>
+                <w:b/>
+                <w:bCs/>
+                <w:highlight w:val="yellow"/>
+                <w:u w:val="single"/>
+                <w:lang w:val="en-US"/>
+              </w:rPr>
+              <w:t xml:space="preserve"> for </w:t>
+            </w:r>
+            <w:proofErr w:type="gramStart"/>
+            <w:r>
+              <w:rPr>
+                <w:b/>
+                <w:bCs/>
+                <w:highlight w:val="yellow"/>
+                <w:u w:val="single"/>
+                <w:lang w:val="en-US"/>
+              </w:rPr>
+              <w:t>create</w:t>
+            </w:r>
+            <w:proofErr w:type="gramEnd"/>
+            <w:r>
+              <w:rPr>
+                <w:b/>
+                <w:bCs/>
+                <w:highlight w:val="yellow"/>
+                <w:u w:val="single"/>
+                <w:lang w:val="en-US"/>
+              </w:rPr>
+              <w:t xml:space="preserve"> the Rest API Server with NODE:</w:t>
+            </w:r>
+          </w:p>
+          <w:p>
+            <w:pPr>
+              <w:jc w:val="center"/>
+              <w:rPr>
+                <w:i/>
+                <w:iCs/>
+                <w:lang w:val="en-US"/>
+              </w:rPr>
+            </w:pPr>
+            <w:proofErr w:type="spellStart"/>
+            <w:r>
+              <w:rPr>
+                <w:i/>
+                <w:iCs/>
+                <w:lang w:val="en-US"/>
+              </w:rPr>
+              <w:t>npm</w:t>
+            </w:r>
+            <w:proofErr w:type="spellEnd"/>
+            <w:r>
+              <w:rPr>
+                <w:i/>
+                <w:iCs/>
+                <w:lang w:val="en-US"/>
+              </w:rPr>
+              <w:t xml:space="preserve"> </w:t>
+            </w:r>
+            <w:r>
+              <w:rPr>
+                <w:i/>
+                <w:iCs/>
+                <w:lang w:val="en-US"/>
+              </w:rPr>
+              <w:t>i</w:t>
+            </w:r>
+            <w:r>
+              <w:rPr>
+                <w:i/>
+                <w:iCs/>
+                <w:lang w:val="en-US"/>
+              </w:rPr>
+              <w:t xml:space="preserve"> express</w:t>
+            </w:r>
+          </w:p>
+        </w:tc>
+      </w:tr>
+      <w:tr>
+        <w:tc>
+          <w:tcPr>
+            <w:tcW w:w="1054" w:type="dxa"/>
+          </w:tcPr>
+          <w:p>
+            <w:pPr>
+              <w:jc w:val="center"/>
+              <w:rPr>
+                <w:lang w:val="en-US"/>
+              </w:rPr>
+            </w:pPr>
+            <w:r>
+              <w:rPr>
+                <w:lang w:val="en-US"/>
+              </w:rPr>
+              <w:lastRenderedPageBreak/>
+              <w:t>00:41:50</w:t>
+            </w:r>
+          </w:p>
+        </w:tc>
+        <w:tc>
+          <w:tcPr>
+            <w:tcW w:w="2202" w:type="dxa"/>
+            <w:gridSpan w:val="2"/>
+          </w:tcPr>
+          <w:p>
+            <w:pPr>
+              <w:rPr>
+                <w:lang w:val="en-US"/>
+              </w:rPr>
+            </w:pPr>
+            <w:r>
+              <w:rPr>
+                <w:lang w:val="en-US"/>
+              </w:rPr>
+              <w:t>Routers of server</w:t>
+            </w:r>
+          </w:p>
+        </w:tc>
+        <w:tc>
+          <w:tcPr>
+            <w:tcW w:w="2694" w:type="dxa"/>
+          </w:tcPr>
+          <w:p>
+            <w:pPr>
+              <w:rPr>
+                <w:lang w:val="en-US"/>
+              </w:rPr>
+            </w:pPr>
+            <w:r>
+              <w:rPr>
+                <w:lang w:val="en-US"/>
+              </w:rPr>
+              <w:t>Reuters pear entity\resource in system</w:t>
+            </w:r>
+          </w:p>
+        </w:tc>
+        <w:tc>
+          <w:tcPr>
+            <w:tcW w:w="4506" w:type="dxa"/>
+          </w:tcPr>
+          <w:p>
+            <w:pPr>
+              <w:jc w:val="center"/>
+              <w:rPr>
+                <w:lang w:val="en-US"/>
+              </w:rPr>
+            </w:pPr>
+            <w:r>
+              <w:rPr>
+                <w:noProof/>
+              </w:rPr>
+              <w:drawing>
+                <wp:inline distT="0" distB="0" distL="0" distR="0" wp14:anchorId="4B97DF2C" wp14:editId="2C1FDBAB">
+                  <wp:extent cx="2571170" cy="1815738"/>
+                  <wp:effectExtent l="0" t="0" r="635" b="0"/>
+                  <wp:docPr id="120353755" name="Picture 1"/>
+                  <wp:cNvGraphicFramePr>
+                    <a:graphicFrameLocks xmlns:a="http://schemas.openxmlformats.org/drawingml/2006/main" noChangeAspect="1"/>
+                  </wp:cNvGraphicFramePr>
+                  <a:graphic xmlns:a="http://schemas.openxmlformats.org/drawingml/2006/main">
+                    <a:graphicData uri="http://schemas.openxmlformats.org/drawingml/2006/picture">
+                      <pic:pic xmlns:pic="http://schemas.openxmlformats.org/drawingml/2006/picture">
+                        <pic:nvPicPr>
+                          <pic:cNvPr id="120353755" name=""/>
+                          <pic:cNvPicPr/>
+                        </pic:nvPicPr>
+                        <pic:blipFill>
+                          <a:blip r:embed="rId18"/>
+                          <a:stretch>
+                            <a:fillRect/>
+                          </a:stretch>
+                        </pic:blipFill>
+                        <pic:spPr>
+                          <a:xfrm>
+                            <a:off x="0" y="0"/>
+                            <a:ext cx="2606902" cy="1840972"/>
+                          </a:xfrm>
+                          <a:prstGeom prst="rect">
+                            <a:avLst/>
+                          </a:prstGeom>
+                        </pic:spPr>
+                      </pic:pic>
+                    </a:graphicData>
+                  </a:graphic>
+                </wp:inline>
+              </w:drawing>
+            </w:r>
+          </w:p>
+        </w:tc>
+      </w:tr>
+      <w:tr>
+        <w:tc>
+          <w:tcPr>
+            <w:tcW w:w="1054" w:type="dxa"/>
+          </w:tcPr>
+          <w:p>
+            <w:pPr>
+              <w:jc w:val="center"/>
+              <w:rPr>
+                <w:lang w:val="en-US"/>
+              </w:rPr>
+            </w:pPr>
+            <w:r>
+              <w:rPr>
+                <w:lang w:val="en-US"/>
+              </w:rPr>
+              <w:t>0</w:t>
+            </w:r>
+            <w:r>
+              <w:rPr>
+                <w:lang w:val="en-US"/>
+              </w:rPr>
+              <w:t>1:04:40</w:t>
+            </w:r>
+          </w:p>
+        </w:tc>
+        <w:tc>
+          <w:tcPr>
+            <w:tcW w:w="2202" w:type="dxa"/>
+            <w:gridSpan w:val="2"/>
+          </w:tcPr>
+          <w:p>
+            <w:pPr>
+              <w:rPr>
+                <w:lang w:val="en-US"/>
+              </w:rPr>
+            </w:pPr>
+            <w:r>
+              <w:rPr>
+                <w:lang w:val="en-US"/>
+              </w:rPr>
+              <w:t xml:space="preserve">Server setting by Express </w:t>
+            </w:r>
+          </w:p>
+        </w:tc>
+        <w:tc>
+          <w:tcPr>
+            <w:tcW w:w="2694" w:type="dxa"/>
+          </w:tcPr>
+          <w:p>
+            <w:pPr>
+              <w:pStyle w:val="ListParagraph"/>
+              <w:numPr>
+                <w:ilvl w:val="0"/>
+                <w:numId w:val="3"/>
+              </w:numPr>
+              <w:rPr>
+                <w:lang w:val="en-US"/>
+              </w:rPr>
+            </w:pPr>
+            <w:r>
+              <w:rPr>
+                <w:lang w:val="en-US"/>
+              </w:rPr>
+              <w:t xml:space="preserve">Import </w:t>
+            </w:r>
+            <w:r>
+              <w:rPr>
+                <w:i/>
+                <w:iCs/>
+                <w:lang w:val="en-US"/>
+              </w:rPr>
+              <w:t>express</w:t>
+            </w:r>
+            <w:r>
+              <w:rPr>
+                <w:lang w:val="en-US"/>
+              </w:rPr>
+              <w:t>.</w:t>
+            </w:r>
+          </w:p>
+          <w:p>
+            <w:pPr>
+              <w:ind w:left="142"/>
+              <w:rPr>
+                <w:lang w:val="en-US"/>
+              </w:rPr>
+            </w:pPr>
+          </w:p>
+        </w:tc>
+        <w:tc>
+          <w:tcPr>
+            <w:tcW w:w="4506" w:type="dxa"/>
+          </w:tcPr>
+          <w:p>
+            <w:pPr>
+              <w:jc w:val="center"/>
+              <w:rPr>
+                <w:lang w:val="en-US"/>
+              </w:rPr>
+            </w:pPr>
+            <w:r>
+              <w:rPr>
+                <w:noProof/>
+              </w:rPr>
+              <w:drawing>
+                <wp:inline distT="0" distB="0" distL="0" distR="0" wp14:anchorId="20260FD5" wp14:editId="21C24996">
+                  <wp:extent cx="2694561" cy="1354746"/>
+                  <wp:effectExtent l="0" t="0" r="0" b="0"/>
+                  <wp:docPr id="1109855329" name="Picture 1"/>
+                  <wp:cNvGraphicFramePr>
+                    <a:graphicFrameLocks xmlns:a="http://schemas.openxmlformats.org/drawingml/2006/main" noChangeAspect="1"/>
+                  </wp:cNvGraphicFramePr>
+                  <a:graphic xmlns:a="http://schemas.openxmlformats.org/drawingml/2006/main">
+                    <a:graphicData uri="http://schemas.openxmlformats.org/drawingml/2006/picture">
+                      <pic:pic xmlns:pic="http://schemas.openxmlformats.org/drawingml/2006/picture">
+                        <pic:nvPicPr>
+                          <pic:cNvPr id="1109855329" name=""/>
+                          <pic:cNvPicPr/>
+                        </pic:nvPicPr>
+                        <pic:blipFill>
+                          <a:blip r:embed="rId19"/>
+                          <a:stretch>
+                            <a:fillRect/>
+                          </a:stretch>
+                        </pic:blipFill>
+                        <pic:spPr>
+                          <a:xfrm>
+                            <a:off x="0" y="0"/>
+                            <a:ext cx="2713339" cy="1364187"/>
+                          </a:xfrm>
+                          <a:prstGeom prst="rect">
+                            <a:avLst/>
+                          </a:prstGeom>
+                        </pic:spPr>
+                      </pic:pic>
+                    </a:graphicData>
+                  </a:graphic>
+                </wp:inline>
+              </w:drawing>
+            </w:r>
+          </w:p>
+        </w:tc>
+      </w:tr>
+      <w:tr>
+        <w:tc>
+          <w:tcPr>
+            <w:tcW w:w="1054" w:type="dxa"/>
+          </w:tcPr>
+          <w:p>
+            <w:pPr>
+              <w:jc w:val="center"/>
+              <w:rPr>
+                <w:b/>
+                <w:bCs/>
+                <w:lang w:val="en-US"/>
+              </w:rPr>
+            </w:pPr>
+            <w:r>
+              <w:rPr>
+                <w:b/>
+                <w:bCs/>
+                <w:lang w:val="en-US"/>
+              </w:rPr>
+              <w:t>01:</w:t>
+            </w:r>
+            <w:r>
+              <w:rPr>
+                <w:b/>
+                <w:bCs/>
+                <w:lang w:val="en-US"/>
+              </w:rPr>
+              <w:t>17:58</w:t>
+            </w:r>
+          </w:p>
+        </w:tc>
+        <w:tc>
+          <w:tcPr>
+            <w:tcW w:w="2202" w:type="dxa"/>
+            <w:gridSpan w:val="2"/>
+          </w:tcPr>
+          <w:p>
+            <w:pPr>
+              <w:rPr>
+                <w:lang w:val="en-US"/>
+              </w:rPr>
+            </w:pPr>
+            <w:r>
+              <w:rPr>
+                <w:lang w:val="en-US"/>
+              </w:rPr>
+              <w:t>Mid</w:t>
+            </w:r>
+            <w:r>
+              <w:rPr>
+                <w:lang w:val="en-US"/>
+              </w:rPr>
+              <w:t>d</w:t>
+            </w:r>
+            <w:r>
+              <w:rPr>
+                <w:lang w:val="en-US"/>
+              </w:rPr>
+              <w:t>leware</w:t>
+            </w:r>
+          </w:p>
+        </w:tc>
+        <w:tc>
+          <w:tcPr>
+            <w:tcW w:w="2694" w:type="dxa"/>
+          </w:tcPr>
+          <w:p>
+            <w:pPr>
+              <w:bidi/>
+              <w:rPr>
+                <w:rFonts w:hint="cs"/>
+                <w:lang w:val="en-US"/>
+              </w:rPr>
+            </w:pPr>
+            <w:r>
+              <w:rPr>
                 <w:rFonts w:hint="cs"/>
                 <w:rtl/>
                 <w:lang w:val="en-US"/>
               </w:rPr>
+              <w:t>מנתב בקשות לאן שהם אמורים להגיעה</w:t>
+            </w:r>
+          </w:p>
+        </w:tc>
+        <w:tc>
+          <w:tcPr>
+            <w:tcW w:w="4506" w:type="dxa"/>
+          </w:tcPr>
+          <w:p>
+            <w:pPr>
+              <w:jc w:val="center"/>
+              <w:rPr>
+                <w:lang w:val="en-US"/>
+              </w:rPr>
+            </w:pPr>
+            <w:r>
+              <w:rPr>
+                <w:noProof/>
+              </w:rPr>
+              <w:drawing>
+                <wp:inline distT="0" distB="0" distL="0" distR="0" wp14:anchorId="6C67CBD8" wp14:editId="366716FC">
+                  <wp:extent cx="2535373" cy="2133368"/>
+                  <wp:effectExtent l="0" t="0" r="0" b="635"/>
+                  <wp:docPr id="1708960960" name="Picture 1"/>
+                  <wp:cNvGraphicFramePr>
+                    <a:graphicFrameLocks xmlns:a="http://schemas.openxmlformats.org/drawingml/2006/main" noChangeAspect="1"/>
+                  </wp:cNvGraphicFramePr>
+                  <a:graphic xmlns:a="http://schemas.openxmlformats.org/drawingml/2006/main">
+                    <a:graphicData uri="http://schemas.openxmlformats.org/drawingml/2006/picture">
+                      <pic:pic xmlns:pic="http://schemas.openxmlformats.org/drawingml/2006/picture">
+                        <pic:nvPicPr>
+                          <pic:cNvPr id="1708960960" name=""/>
+                          <pic:cNvPicPr/>
+                        </pic:nvPicPr>
+                        <pic:blipFill>
+                          <a:blip r:embed="rId20"/>
+                          <a:stretch>
+                            <a:fillRect/>
+                          </a:stretch>
+                        </pic:blipFill>
+                        <pic:spPr>
+                          <a:xfrm>
+                            <a:off x="0" y="0"/>
+                            <a:ext cx="2543512" cy="2140216"/>
+                          </a:xfrm>
+                          <a:prstGeom prst="rect">
+                            <a:avLst/>
+                          </a:prstGeom>
+                        </pic:spPr>
+                      </pic:pic>
+                    </a:graphicData>
+                  </a:graphic>
+                </wp:inline>
+              </w:drawing>
+            </w:r>
+          </w:p>
+          <w:p>
+            <w:pPr>
+              <w:jc w:val="center"/>
+              <w:rPr>
+                <w:lang w:val="en-US"/>
+              </w:rPr>
             </w:pPr>
           </w:p>
         </w:tc>
@@ -2165,188 +3164,1062 @@
       <w:tr>
         <w:tc>
           <w:tcPr>
-            <w:tcW w:w="562" w:type="dxa"/>
-          </w:tcPr>
-          <w:p>
-            <w:pPr>
-              <w:jc w:val="center"/>
-              <w:rPr>
-                <w:lang w:val="en-US"/>
-              </w:rPr>
-            </w:pPr>
-          </w:p>
-        </w:tc>
-        <w:tc>
-          <w:tcPr>
-            <w:tcW w:w="2881" w:type="dxa"/>
-          </w:tcPr>
-          <w:p>
-            <w:pPr>
-              <w:rPr>
-                <w:lang w:val="en-US"/>
-              </w:rPr>
-            </w:pPr>
-          </w:p>
-        </w:tc>
-        <w:tc>
-          <w:tcPr>
-            <w:tcW w:w="2507" w:type="dxa"/>
-          </w:tcPr>
-          <w:p>
-            <w:pPr>
-              <w:rPr>
-                <w:lang w:val="en-US"/>
-              </w:rPr>
-            </w:pPr>
+            <w:tcW w:w="1054" w:type="dxa"/>
+            <w:tcBorders>
+              <w:bottom w:val="single" w:sz="4" w:space="0" w:color="auto"/>
+            </w:tcBorders>
+          </w:tcPr>
+          <w:p>
+            <w:pPr>
+              <w:jc w:val="center"/>
+              <w:rPr>
+                <w:b/>
+                <w:bCs/>
+                <w:lang w:val="en-US"/>
+              </w:rPr>
+            </w:pPr>
+            <w:r>
+              <w:rPr>
+                <w:b/>
+                <w:bCs/>
+                <w:lang w:val="en-US"/>
+              </w:rPr>
+              <w:t>01:52:00</w:t>
+            </w:r>
+          </w:p>
+        </w:tc>
+        <w:tc>
+          <w:tcPr>
+            <w:tcW w:w="2202" w:type="dxa"/>
+            <w:gridSpan w:val="2"/>
+            <w:tcBorders>
+              <w:bottom w:val="single" w:sz="4" w:space="0" w:color="auto"/>
+            </w:tcBorders>
+          </w:tcPr>
+          <w:p>
+            <w:pPr>
+              <w:rPr>
+                <w:lang w:val="en-US"/>
+              </w:rPr>
+            </w:pPr>
+            <w:proofErr w:type="spellStart"/>
+            <w:r>
+              <w:rPr>
+                <w:b/>
+                <w:bCs/>
+                <w:lang w:val="en-US"/>
+              </w:rPr>
+              <w:t>nodemon</w:t>
+            </w:r>
+            <w:proofErr w:type="spellEnd"/>
+            <w:r>
+              <w:rPr>
+                <w:lang w:val="en-US"/>
+              </w:rPr>
+              <w:t xml:space="preserve"> package</w:t>
+            </w:r>
+          </w:p>
+        </w:tc>
+        <w:tc>
+          <w:tcPr>
+            <w:tcW w:w="2694" w:type="dxa"/>
+            <w:tcBorders>
+              <w:bottom w:val="single" w:sz="4" w:space="0" w:color="auto"/>
+            </w:tcBorders>
+          </w:tcPr>
+          <w:p>
+            <w:pPr>
+              <w:rPr>
+                <w:lang w:val="en-US"/>
+              </w:rPr>
+            </w:pPr>
+            <w:r>
+              <w:rPr>
+                <w:lang w:val="en-US"/>
+              </w:rPr>
+              <w:t>Server automatic tools:</w:t>
+            </w:r>
+          </w:p>
+          <w:p>
+            <w:pPr>
+              <w:pStyle w:val="ListParagraph"/>
+              <w:numPr>
+                <w:ilvl w:val="0"/>
+                <w:numId w:val="4"/>
+              </w:numPr>
+              <w:rPr>
+                <w:lang w:val="en-US"/>
+              </w:rPr>
+            </w:pPr>
+            <w:r>
+              <w:rPr>
+                <w:lang w:val="en-US"/>
+              </w:rPr>
+              <w:t xml:space="preserve">Auto </w:t>
+            </w:r>
+            <w:r>
+              <w:rPr>
+                <w:lang w:val="en-US"/>
+              </w:rPr>
+              <w:t>restarts</w:t>
+            </w:r>
+            <w:r>
+              <w:rPr>
+                <w:lang w:val="en-US"/>
+              </w:rPr>
+              <w:t xml:space="preserve"> to server.</w:t>
+            </w:r>
+          </w:p>
+          <w:p>
+            <w:pPr>
+              <w:rPr>
+                <w:rFonts w:hint="cs"/>
+                <w:rtl/>
+                <w:lang w:val="en-US"/>
+              </w:rPr>
+            </w:pPr>
+            <w:r>
+              <w:rPr>
+                <w:noProof/>
+                <w:highlight w:val="yellow"/>
+                <w:u w:val="single"/>
+              </w:rPr>
+              <w:t>npm i -g nodemon</w:t>
+            </w:r>
           </w:p>
         </w:tc>
         <w:tc>
           <w:tcPr>
             <w:tcW w:w="4506" w:type="dxa"/>
-          </w:tcPr>
-          <w:p>
-            <w:pPr>
-              <w:jc w:val="center"/>
-              <w:rPr>
-                <w:lang w:val="en-US"/>
-              </w:rPr>
-            </w:pPr>
+            <w:tcBorders>
+              <w:bottom w:val="single" w:sz="4" w:space="0" w:color="auto"/>
+            </w:tcBorders>
+          </w:tcPr>
+          <w:p>
+            <w:pPr>
+              <w:rPr>
+                <w:noProof/>
+              </w:rPr>
+            </w:pPr>
+            <w:r>
+              <w:rPr>
+                <w:noProof/>
+                <w:u w:val="single"/>
+              </w:rPr>
+              <w:t>nodemon index.js</w:t>
+            </w:r>
+            <w:r>
+              <w:rPr>
+                <w:noProof/>
+              </w:rPr>
+              <w:br/>
+            </w:r>
+            <w:r>
+              <w:rPr>
+                <w:noProof/>
+                <w:color w:val="FF0000"/>
+              </w:rPr>
+              <w:t>NOT NODE INDEX.JS</w:t>
+            </w:r>
           </w:p>
         </w:tc>
       </w:tr>
       <w:tr>
-        <w:tc>
-          <w:tcPr>
-            <w:tcW w:w="562" w:type="dxa"/>
-          </w:tcPr>
-          <w:p>
-            <w:pPr>
-              <w:jc w:val="center"/>
-              <w:rPr>
-                <w:lang w:val="en-US"/>
-              </w:rPr>
-            </w:pPr>
-          </w:p>
-        </w:tc>
-        <w:tc>
-          <w:tcPr>
-            <w:tcW w:w="2881" w:type="dxa"/>
-          </w:tcPr>
-          <w:p>
-            <w:pPr>
-              <w:rPr>
-                <w:lang w:val="en-US"/>
-              </w:rPr>
-            </w:pPr>
-          </w:p>
-        </w:tc>
-        <w:tc>
-          <w:tcPr>
-            <w:tcW w:w="2507" w:type="dxa"/>
-          </w:tcPr>
-          <w:p>
-            <w:pPr>
-              <w:rPr>
-                <w:lang w:val="en-US"/>
-              </w:rPr>
-            </w:pPr>
-          </w:p>
-        </w:tc>
-        <w:tc>
-          <w:tcPr>
-            <w:tcW w:w="4506" w:type="dxa"/>
-          </w:tcPr>
-          <w:p>
-            <w:pPr>
-              <w:jc w:val="center"/>
-              <w:rPr>
-                <w:lang w:val="en-US"/>
+        <w:trPr>
+          <w:trHeight w:val="35"/>
+        </w:trPr>
+        <w:tc>
+          <w:tcPr>
+            <w:tcW w:w="10456" w:type="dxa"/>
+            <w:gridSpan w:val="5"/>
+            <w:shd w:val="clear" w:color="auto" w:fill="FFFF00"/>
+          </w:tcPr>
+          <w:p>
+            <w:pPr>
+              <w:jc w:val="center"/>
+              <w:rPr>
+                <w:noProof/>
               </w:rPr>
             </w:pPr>
           </w:p>
         </w:tc>
       </w:tr>
       <w:tr>
-        <w:tc>
-          <w:tcPr>
-            <w:tcW w:w="562" w:type="dxa"/>
-          </w:tcPr>
-          <w:p>
-            <w:pPr>
-              <w:jc w:val="center"/>
-              <w:rPr>
-                <w:lang w:val="en-US"/>
-              </w:rPr>
-            </w:pPr>
-          </w:p>
-        </w:tc>
-        <w:tc>
-          <w:tcPr>
-            <w:tcW w:w="2881" w:type="dxa"/>
-          </w:tcPr>
-          <w:p>
-            <w:pPr>
-              <w:rPr>
-                <w:lang w:val="en-US"/>
-              </w:rPr>
-            </w:pPr>
-          </w:p>
-        </w:tc>
-        <w:tc>
-          <w:tcPr>
-            <w:tcW w:w="2507" w:type="dxa"/>
-          </w:tcPr>
-          <w:p>
-            <w:pPr>
-              <w:rPr>
-                <w:lang w:val="en-US"/>
-              </w:rPr>
-            </w:pPr>
-          </w:p>
-        </w:tc>
-        <w:tc>
-          <w:tcPr>
-            <w:tcW w:w="4506" w:type="dxa"/>
-          </w:tcPr>
-          <w:p>
-            <w:pPr>
-              <w:jc w:val="center"/>
-              <w:rPr>
-                <w:lang w:val="en-US"/>
-              </w:rPr>
-            </w:pPr>
+        <w:trPr>
+          <w:trHeight w:val="35"/>
+        </w:trPr>
+        <w:tc>
+          <w:tcPr>
+            <w:tcW w:w="2689" w:type="dxa"/>
+            <w:gridSpan w:val="2"/>
+            <w:vMerge w:val="restart"/>
+          </w:tcPr>
+          <w:p>
+            <w:pPr>
+              <w:rPr>
+                <w:b/>
+                <w:bCs/>
+                <w:lang w:val="en-US"/>
+              </w:rPr>
+            </w:pPr>
+            <w:r>
+              <w:rPr>
+                <w:b/>
+                <w:bCs/>
+                <w:lang w:val="en-US"/>
+              </w:rPr>
+              <w:t>Router types</w:t>
+            </w:r>
+          </w:p>
+        </w:tc>
+        <w:tc>
+          <w:tcPr>
+            <w:tcW w:w="7767" w:type="dxa"/>
+            <w:gridSpan w:val="3"/>
+          </w:tcPr>
+          <w:p>
+            <w:pPr>
+              <w:jc w:val="center"/>
+              <w:rPr>
+                <w:lang w:val="en-US"/>
+              </w:rPr>
+            </w:pPr>
+            <w:r>
+              <w:rPr>
+                <w:noProof/>
+              </w:rPr>
+              <w:drawing>
+                <wp:inline distT="0" distB="0" distL="0" distR="0" wp14:anchorId="35BAC8C5" wp14:editId="40D36154">
+                  <wp:extent cx="3211429" cy="790992"/>
+                  <wp:effectExtent l="0" t="0" r="0" b="9525"/>
+                  <wp:docPr id="848158497" name="Picture 1"/>
+                  <wp:cNvGraphicFramePr>
+                    <a:graphicFrameLocks xmlns:a="http://schemas.openxmlformats.org/drawingml/2006/main" noChangeAspect="1"/>
+                  </wp:cNvGraphicFramePr>
+                  <a:graphic xmlns:a="http://schemas.openxmlformats.org/drawingml/2006/main">
+                    <a:graphicData uri="http://schemas.openxmlformats.org/drawingml/2006/picture">
+                      <pic:pic xmlns:pic="http://schemas.openxmlformats.org/drawingml/2006/picture">
+                        <pic:nvPicPr>
+                          <pic:cNvPr id="848158497" name=""/>
+                          <pic:cNvPicPr/>
+                        </pic:nvPicPr>
+                        <pic:blipFill>
+                          <a:blip r:embed="rId21"/>
+                          <a:stretch>
+                            <a:fillRect/>
+                          </a:stretch>
+                        </pic:blipFill>
+                        <pic:spPr>
+                          <a:xfrm>
+                            <a:off x="0" y="0"/>
+                            <a:ext cx="3227474" cy="794944"/>
+                          </a:xfrm>
+                          <a:prstGeom prst="rect">
+                            <a:avLst/>
+                          </a:prstGeom>
+                        </pic:spPr>
+                      </pic:pic>
+                    </a:graphicData>
+                  </a:graphic>
+                </wp:inline>
+              </w:drawing>
+            </w:r>
           </w:p>
         </w:tc>
       </w:tr>
       <w:tr>
-        <w:tc>
-          <w:tcPr>
-            <w:tcW w:w="562" w:type="dxa"/>
-          </w:tcPr>
-          <w:p>
-            <w:pPr>
-              <w:jc w:val="center"/>
-              <w:rPr>
-                <w:lang w:val="en-US"/>
-              </w:rPr>
-            </w:pPr>
-          </w:p>
-        </w:tc>
-        <w:tc>
-          <w:tcPr>
-            <w:tcW w:w="2881" w:type="dxa"/>
-          </w:tcPr>
-          <w:p>
-            <w:pPr>
-              <w:rPr>
-                <w:lang w:val="en-US"/>
-              </w:rPr>
-            </w:pPr>
-          </w:p>
-        </w:tc>
-        <w:tc>
-          <w:tcPr>
-            <w:tcW w:w="2507" w:type="dxa"/>
+        <w:trPr>
+          <w:trHeight w:val="1489"/>
+        </w:trPr>
+        <w:tc>
+          <w:tcPr>
+            <w:tcW w:w="2689" w:type="dxa"/>
+            <w:gridSpan w:val="2"/>
+            <w:vMerge/>
+            <w:tcBorders>
+              <w:bottom w:val="single" w:sz="4" w:space="0" w:color="auto"/>
+            </w:tcBorders>
+          </w:tcPr>
+          <w:p>
+            <w:pPr>
+              <w:rPr>
+                <w:b/>
+                <w:bCs/>
+                <w:lang w:val="en-US"/>
+              </w:rPr>
+            </w:pPr>
+          </w:p>
+        </w:tc>
+        <w:tc>
+          <w:tcPr>
+            <w:tcW w:w="7767" w:type="dxa"/>
+            <w:gridSpan w:val="3"/>
+            <w:tcBorders>
+              <w:bottom w:val="single" w:sz="4" w:space="0" w:color="auto"/>
+            </w:tcBorders>
+          </w:tcPr>
+          <w:p>
+            <w:pPr>
+              <w:jc w:val="center"/>
+              <w:rPr>
+                <w:lang w:val="en-US"/>
+              </w:rPr>
+            </w:pPr>
+            <w:r>
+              <w:rPr>
+                <w:noProof/>
+              </w:rPr>
+              <w:drawing>
+                <wp:inline distT="0" distB="0" distL="0" distR="0" wp14:anchorId="27C09B0F" wp14:editId="69F45DD7">
+                  <wp:extent cx="3457194" cy="1261208"/>
+                  <wp:effectExtent l="0" t="0" r="0" b="0"/>
+                  <wp:docPr id="584151286" name="Picture 1"/>
+                  <wp:cNvGraphicFramePr>
+                    <a:graphicFrameLocks xmlns:a="http://schemas.openxmlformats.org/drawingml/2006/main" noChangeAspect="1"/>
+                  </wp:cNvGraphicFramePr>
+                  <a:graphic xmlns:a="http://schemas.openxmlformats.org/drawingml/2006/main">
+                    <a:graphicData uri="http://schemas.openxmlformats.org/drawingml/2006/picture">
+                      <pic:pic xmlns:pic="http://schemas.openxmlformats.org/drawingml/2006/picture">
+                        <pic:nvPicPr>
+                          <pic:cNvPr id="584151286" name=""/>
+                          <pic:cNvPicPr/>
+                        </pic:nvPicPr>
+                        <pic:blipFill>
+                          <a:blip r:embed="rId22"/>
+                          <a:stretch>
+                            <a:fillRect/>
+                          </a:stretch>
+                        </pic:blipFill>
+                        <pic:spPr>
+                          <a:xfrm>
+                            <a:off x="0" y="0"/>
+                            <a:ext cx="3470007" cy="1265882"/>
+                          </a:xfrm>
+                          <a:prstGeom prst="rect">
+                            <a:avLst/>
+                          </a:prstGeom>
+                        </pic:spPr>
+                      </pic:pic>
+                    </a:graphicData>
+                  </a:graphic>
+                </wp:inline>
+              </w:drawing>
+            </w:r>
+          </w:p>
+        </w:tc>
+      </w:tr>
+      <w:tr>
+        <w:tc>
+          <w:tcPr>
+            <w:tcW w:w="10456" w:type="dxa"/>
+            <w:gridSpan w:val="5"/>
+            <w:shd w:val="clear" w:color="auto" w:fill="FFFF00"/>
+          </w:tcPr>
+          <w:p>
+            <w:pPr>
+              <w:jc w:val="center"/>
+              <w:rPr>
+                <w:noProof/>
+              </w:rPr>
+            </w:pPr>
+          </w:p>
+        </w:tc>
+      </w:tr>
+      <w:tr>
+        <w:tc>
+          <w:tcPr>
+            <w:tcW w:w="1054" w:type="dxa"/>
+          </w:tcPr>
+          <w:p>
+            <w:pPr>
+              <w:jc w:val="center"/>
+              <w:rPr>
+                <w:lang w:val="en-US"/>
+              </w:rPr>
+            </w:pPr>
+            <w:r>
+              <w:rPr>
+                <w:lang w:val="en-US"/>
+              </w:rPr>
+              <w:lastRenderedPageBreak/>
+              <w:t>02:</w:t>
+            </w:r>
+            <w:r>
+              <w:rPr>
+                <w:lang w:val="en-US"/>
+              </w:rPr>
+              <w:t>11:45</w:t>
+            </w:r>
+          </w:p>
+        </w:tc>
+        <w:tc>
+          <w:tcPr>
+            <w:tcW w:w="2202" w:type="dxa"/>
+            <w:gridSpan w:val="2"/>
+          </w:tcPr>
+          <w:p>
+            <w:pPr>
+              <w:rPr>
+                <w:lang w:val="en-US"/>
+              </w:rPr>
+            </w:pPr>
+            <w:proofErr w:type="spellStart"/>
+            <w:r>
+              <w:rPr>
+                <w:lang w:val="en-US"/>
+              </w:rPr>
+              <w:t>app.use</w:t>
+            </w:r>
+            <w:proofErr w:type="spellEnd"/>
+            <w:r>
+              <w:rPr>
+                <w:lang w:val="en-US"/>
+              </w:rPr>
+              <w:t>(</w:t>
+            </w:r>
+            <w:proofErr w:type="spellStart"/>
+            <w:proofErr w:type="gramStart"/>
+            <w:r>
+              <w:rPr>
+                <w:lang w:val="en-US"/>
+              </w:rPr>
+              <w:t>express.json</w:t>
+            </w:r>
+            <w:proofErr w:type="spellEnd"/>
+            <w:proofErr w:type="gramEnd"/>
+            <w:r>
+              <w:rPr>
+                <w:lang w:val="en-US"/>
+              </w:rPr>
+              <w:t>())</w:t>
+            </w:r>
+          </w:p>
+        </w:tc>
+        <w:tc>
+          <w:tcPr>
+            <w:tcW w:w="2694" w:type="dxa"/>
+          </w:tcPr>
+          <w:p>
+            <w:pPr>
+              <w:rPr>
+                <w:lang w:val="en-US"/>
+              </w:rPr>
+            </w:pPr>
+            <w:r>
+              <w:rPr>
+                <w:lang w:val="en-US"/>
+              </w:rPr>
+              <w:t xml:space="preserve">To convert all input data to object </w:t>
+            </w:r>
+            <w:r>
+              <w:rPr>
+                <w:lang w:val="en-US"/>
+              </w:rPr>
+              <w:t>(All inputs come as JSON) by default before they go to the Route, set the function on Middleware</w:t>
+            </w:r>
+          </w:p>
+        </w:tc>
+        <w:tc>
+          <w:tcPr>
+            <w:tcW w:w="4506" w:type="dxa"/>
+          </w:tcPr>
+          <w:p>
+            <w:pPr>
+              <w:jc w:val="center"/>
+              <w:rPr>
+                <w:lang w:val="en-US"/>
+              </w:rPr>
+            </w:pPr>
+            <w:r>
+              <w:rPr>
+                <w:noProof/>
+              </w:rPr>
+              <w:drawing>
+                <wp:inline distT="0" distB="0" distL="0" distR="0" wp14:anchorId="749EAC51" wp14:editId="674B9E4D">
+                  <wp:extent cx="2360060" cy="1086223"/>
+                  <wp:effectExtent l="0" t="0" r="2540" b="0"/>
+                  <wp:docPr id="1294718161" name="Picture 1"/>
+                  <wp:cNvGraphicFramePr>
+                    <a:graphicFrameLocks xmlns:a="http://schemas.openxmlformats.org/drawingml/2006/main" noChangeAspect="1"/>
+                  </wp:cNvGraphicFramePr>
+                  <a:graphic xmlns:a="http://schemas.openxmlformats.org/drawingml/2006/main">
+                    <a:graphicData uri="http://schemas.openxmlformats.org/drawingml/2006/picture">
+                      <pic:pic xmlns:pic="http://schemas.openxmlformats.org/drawingml/2006/picture">
+                        <pic:nvPicPr>
+                          <pic:cNvPr id="1294718161" name=""/>
+                          <pic:cNvPicPr/>
+                        </pic:nvPicPr>
+                        <pic:blipFill>
+                          <a:blip r:embed="rId23"/>
+                          <a:stretch>
+                            <a:fillRect/>
+                          </a:stretch>
+                        </pic:blipFill>
+                        <pic:spPr>
+                          <a:xfrm>
+                            <a:off x="0" y="0"/>
+                            <a:ext cx="2385420" cy="1097895"/>
+                          </a:xfrm>
+                          <a:prstGeom prst="rect">
+                            <a:avLst/>
+                          </a:prstGeom>
+                        </pic:spPr>
+                      </pic:pic>
+                    </a:graphicData>
+                  </a:graphic>
+                </wp:inline>
+              </w:drawing>
+            </w:r>
+          </w:p>
+        </w:tc>
+      </w:tr>
+      <w:tr>
+        <w:trPr>
+          <w:trHeight w:val="597"/>
+        </w:trPr>
+        <w:tc>
+          <w:tcPr>
+            <w:tcW w:w="1054" w:type="dxa"/>
+            <w:vMerge w:val="restart"/>
+          </w:tcPr>
+          <w:p>
+            <w:pPr>
+              <w:jc w:val="center"/>
+              <w:rPr>
+                <w:lang w:val="en-US"/>
+              </w:rPr>
+            </w:pPr>
+            <w:r>
+              <w:rPr>
+                <w:lang w:val="en-US"/>
+              </w:rPr>
+              <w:t>02:28:38</w:t>
+            </w:r>
+          </w:p>
+        </w:tc>
+        <w:tc>
+          <w:tcPr>
+            <w:tcW w:w="2202" w:type="dxa"/>
+            <w:gridSpan w:val="2"/>
+            <w:vMerge w:val="restart"/>
+          </w:tcPr>
+          <w:p>
+            <w:pPr>
+              <w:rPr>
+                <w:lang w:val="en-US"/>
+              </w:rPr>
+            </w:pPr>
+            <w:r>
+              <w:rPr>
+                <w:lang w:val="en-US"/>
+              </w:rPr>
+              <w:t>CORS</w:t>
+            </w:r>
+          </w:p>
+        </w:tc>
+        <w:tc>
+          <w:tcPr>
+            <w:tcW w:w="2694" w:type="dxa"/>
+          </w:tcPr>
+          <w:p>
+            <w:pPr>
+              <w:rPr>
+                <w:lang w:val="en-US"/>
+              </w:rPr>
+            </w:pPr>
+            <w:r>
+              <w:rPr>
+                <w:lang w:val="en-US"/>
+              </w:rPr>
+              <w:t>Cros-Origin Resource Sharing</w:t>
+            </w:r>
+          </w:p>
+          <w:p>
+            <w:pPr>
+              <w:rPr>
+                <w:lang w:val="en-US"/>
+              </w:rPr>
+            </w:pPr>
+            <w:r>
+              <w:rPr>
+                <w:lang w:val="en-US"/>
+              </w:rPr>
+              <w:t>Use for o</w:t>
+            </w:r>
+            <w:r>
+              <w:rPr>
+                <w:lang w:val="en-US"/>
+              </w:rPr>
+              <w:t>pens access to all</w:t>
+            </w:r>
+            <w:r>
+              <w:rPr>
+                <w:lang w:val="en-US"/>
+              </w:rPr>
+              <w:t xml:space="preserve"> </w:t>
+            </w:r>
+            <w:r>
+              <w:rPr>
+                <w:lang w:val="en-US"/>
+              </w:rPr>
+              <w:t>domains\computers</w:t>
+            </w:r>
+          </w:p>
+          <w:p>
+            <w:pPr>
+              <w:rPr>
+                <w:lang w:val="en-US"/>
+              </w:rPr>
+            </w:pPr>
+          </w:p>
+        </w:tc>
+        <w:tc>
+          <w:tcPr>
+            <w:tcW w:w="4506" w:type="dxa"/>
+            <w:vMerge w:val="restart"/>
+          </w:tcPr>
+          <w:p>
+            <w:pPr>
+              <w:jc w:val="center"/>
+              <w:rPr>
+                <w:lang w:val="en-US"/>
+              </w:rPr>
+            </w:pPr>
+            <w:r>
+              <w:rPr>
+                <w:noProof/>
+              </w:rPr>
+              <w:drawing>
+                <wp:inline distT="0" distB="0" distL="0" distR="0" wp14:anchorId="301C1080" wp14:editId="074B3716">
+                  <wp:extent cx="2436767" cy="980387"/>
+                  <wp:effectExtent l="0" t="0" r="1905" b="0"/>
+                  <wp:docPr id="182002876" name="Picture 1"/>
+                  <wp:cNvGraphicFramePr>
+                    <a:graphicFrameLocks xmlns:a="http://schemas.openxmlformats.org/drawingml/2006/main" noChangeAspect="1"/>
+                  </wp:cNvGraphicFramePr>
+                  <a:graphic xmlns:a="http://schemas.openxmlformats.org/drawingml/2006/main">
+                    <a:graphicData uri="http://schemas.openxmlformats.org/drawingml/2006/picture">
+                      <pic:pic xmlns:pic="http://schemas.openxmlformats.org/drawingml/2006/picture">
+                        <pic:nvPicPr>
+                          <pic:cNvPr id="182002876" name=""/>
+                          <pic:cNvPicPr/>
+                        </pic:nvPicPr>
+                        <pic:blipFill>
+                          <a:blip r:embed="rId24"/>
+                          <a:stretch>
+                            <a:fillRect/>
+                          </a:stretch>
+                        </pic:blipFill>
+                        <pic:spPr>
+                          <a:xfrm>
+                            <a:off x="0" y="0"/>
+                            <a:ext cx="2446931" cy="984476"/>
+                          </a:xfrm>
+                          <a:prstGeom prst="rect">
+                            <a:avLst/>
+                          </a:prstGeom>
+                        </pic:spPr>
+                      </pic:pic>
+                    </a:graphicData>
+                  </a:graphic>
+                </wp:inline>
+              </w:drawing>
+            </w:r>
+          </w:p>
+        </w:tc>
+      </w:tr>
+      <w:tr>
+        <w:trPr>
+          <w:trHeight w:val="596"/>
+        </w:trPr>
+        <w:tc>
+          <w:tcPr>
+            <w:tcW w:w="1054" w:type="dxa"/>
+            <w:vMerge/>
+          </w:tcPr>
+          <w:p>
+            <w:pPr>
+              <w:jc w:val="center"/>
+              <w:rPr>
+                <w:lang w:val="en-US"/>
+              </w:rPr>
+            </w:pPr>
+          </w:p>
+        </w:tc>
+        <w:tc>
+          <w:tcPr>
+            <w:tcW w:w="2202" w:type="dxa"/>
+            <w:gridSpan w:val="2"/>
+            <w:vMerge/>
+          </w:tcPr>
+          <w:p>
+            <w:pPr>
+              <w:rPr>
+                <w:lang w:val="en-US"/>
+              </w:rPr>
+            </w:pPr>
+          </w:p>
+        </w:tc>
+        <w:tc>
+          <w:tcPr>
+            <w:tcW w:w="2694" w:type="dxa"/>
+          </w:tcPr>
+          <w:p>
+            <w:pPr>
+              <w:rPr>
+                <w:b/>
+                <w:bCs/>
+                <w:u w:val="single"/>
+                <w:lang w:val="en-US"/>
+              </w:rPr>
+            </w:pPr>
+            <w:proofErr w:type="spellStart"/>
+            <w:r>
+              <w:rPr>
+                <w:b/>
+                <w:bCs/>
+                <w:highlight w:val="yellow"/>
+                <w:u w:val="single"/>
+                <w:lang w:val="en-US"/>
+              </w:rPr>
+              <w:t>npm</w:t>
+            </w:r>
+            <w:proofErr w:type="spellEnd"/>
+            <w:r>
+              <w:rPr>
+                <w:b/>
+                <w:bCs/>
+                <w:highlight w:val="yellow"/>
+                <w:u w:val="single"/>
+                <w:lang w:val="en-US"/>
+              </w:rPr>
+              <w:t xml:space="preserve"> i </w:t>
+            </w:r>
+            <w:proofErr w:type="spellStart"/>
+            <w:r>
+              <w:rPr>
+                <w:b/>
+                <w:bCs/>
+                <w:highlight w:val="yellow"/>
+                <w:u w:val="single"/>
+                <w:lang w:val="en-US"/>
+              </w:rPr>
+              <w:t>cors</w:t>
+            </w:r>
+            <w:proofErr w:type="spellEnd"/>
+          </w:p>
+        </w:tc>
+        <w:tc>
+          <w:tcPr>
+            <w:tcW w:w="4506" w:type="dxa"/>
+            <w:vMerge/>
+          </w:tcPr>
+          <w:p>
+            <w:pPr>
+              <w:jc w:val="center"/>
+              <w:rPr>
+                <w:noProof/>
+              </w:rPr>
+            </w:pPr>
+          </w:p>
+        </w:tc>
+      </w:tr>
+      <w:tr>
+        <w:tc>
+          <w:tcPr>
+            <w:tcW w:w="1054" w:type="dxa"/>
+          </w:tcPr>
+          <w:p>
+            <w:pPr>
+              <w:rPr>
+                <w:rFonts w:hint="cs"/>
+                <w:rtl/>
+                <w:lang w:val="en-US"/>
+              </w:rPr>
+            </w:pPr>
+          </w:p>
+        </w:tc>
+        <w:tc>
+          <w:tcPr>
+            <w:tcW w:w="2202" w:type="dxa"/>
+            <w:gridSpan w:val="2"/>
+          </w:tcPr>
+          <w:p>
+            <w:pPr>
+              <w:rPr>
+                <w:lang w:val="en-US"/>
+              </w:rPr>
+            </w:pPr>
+          </w:p>
+        </w:tc>
+        <w:tc>
+          <w:tcPr>
+            <w:tcW w:w="2694" w:type="dxa"/>
+          </w:tcPr>
+          <w:p>
+            <w:pPr>
+              <w:rPr>
+                <w:lang w:val="en-US"/>
+              </w:rPr>
+            </w:pPr>
+          </w:p>
+        </w:tc>
+        <w:tc>
+          <w:tcPr>
+            <w:tcW w:w="4506" w:type="dxa"/>
+          </w:tcPr>
+          <w:p>
+            <w:pPr>
+              <w:jc w:val="center"/>
+              <w:rPr>
+                <w:lang w:val="en-US"/>
+              </w:rPr>
+            </w:pPr>
+          </w:p>
+        </w:tc>
+      </w:tr>
+      <w:tr>
+        <w:tc>
+          <w:tcPr>
+            <w:tcW w:w="1054" w:type="dxa"/>
+          </w:tcPr>
+          <w:p>
+            <w:pPr>
+              <w:jc w:val="center"/>
+              <w:rPr>
+                <w:lang w:val="en-US"/>
+              </w:rPr>
+            </w:pPr>
+          </w:p>
+        </w:tc>
+        <w:tc>
+          <w:tcPr>
+            <w:tcW w:w="2202" w:type="dxa"/>
+            <w:gridSpan w:val="2"/>
+          </w:tcPr>
+          <w:p>
+            <w:pPr>
+              <w:rPr>
+                <w:lang w:val="en-US"/>
+              </w:rPr>
+            </w:pPr>
+          </w:p>
+        </w:tc>
+        <w:tc>
+          <w:tcPr>
+            <w:tcW w:w="2694" w:type="dxa"/>
+          </w:tcPr>
+          <w:p>
+            <w:pPr>
+              <w:rPr>
+                <w:lang w:val="en-US"/>
+              </w:rPr>
+            </w:pPr>
+          </w:p>
+        </w:tc>
+        <w:tc>
+          <w:tcPr>
+            <w:tcW w:w="4506" w:type="dxa"/>
+          </w:tcPr>
+          <w:p>
+            <w:pPr>
+              <w:jc w:val="center"/>
+              <w:rPr>
+                <w:lang w:val="en-US"/>
+              </w:rPr>
+            </w:pPr>
+          </w:p>
+        </w:tc>
+      </w:tr>
+      <w:tr>
+        <w:tc>
+          <w:tcPr>
+            <w:tcW w:w="1054" w:type="dxa"/>
+          </w:tcPr>
+          <w:p>
+            <w:pPr>
+              <w:jc w:val="center"/>
+              <w:rPr>
+                <w:lang w:val="en-US"/>
+              </w:rPr>
+            </w:pPr>
+          </w:p>
+        </w:tc>
+        <w:tc>
+          <w:tcPr>
+            <w:tcW w:w="2202" w:type="dxa"/>
+            <w:gridSpan w:val="2"/>
+          </w:tcPr>
+          <w:p>
+            <w:pPr>
+              <w:rPr>
+                <w:lang w:val="en-US"/>
+              </w:rPr>
+            </w:pPr>
+          </w:p>
+        </w:tc>
+        <w:tc>
+          <w:tcPr>
+            <w:tcW w:w="2694" w:type="dxa"/>
+          </w:tcPr>
+          <w:p>
+            <w:pPr>
+              <w:rPr>
+                <w:lang w:val="en-US"/>
+              </w:rPr>
+            </w:pPr>
+          </w:p>
+        </w:tc>
+        <w:tc>
+          <w:tcPr>
+            <w:tcW w:w="4506" w:type="dxa"/>
+          </w:tcPr>
+          <w:p>
+            <w:pPr>
+              <w:jc w:val="center"/>
+              <w:rPr>
+                <w:lang w:val="en-US"/>
+              </w:rPr>
+            </w:pPr>
+          </w:p>
+        </w:tc>
+      </w:tr>
+      <w:tr>
+        <w:tc>
+          <w:tcPr>
+            <w:tcW w:w="1054" w:type="dxa"/>
+          </w:tcPr>
+          <w:p>
+            <w:pPr>
+              <w:jc w:val="center"/>
+              <w:rPr>
+                <w:lang w:val="en-US"/>
+              </w:rPr>
+            </w:pPr>
+          </w:p>
+        </w:tc>
+        <w:tc>
+          <w:tcPr>
+            <w:tcW w:w="2202" w:type="dxa"/>
+            <w:gridSpan w:val="2"/>
+          </w:tcPr>
+          <w:p>
+            <w:pPr>
+              <w:rPr>
+                <w:lang w:val="en-US"/>
+              </w:rPr>
+            </w:pPr>
+          </w:p>
+        </w:tc>
+        <w:tc>
+          <w:tcPr>
+            <w:tcW w:w="2694" w:type="dxa"/>
+          </w:tcPr>
+          <w:p>
+            <w:pPr>
+              <w:rPr>
+                <w:lang w:val="en-US"/>
+              </w:rPr>
+            </w:pPr>
+          </w:p>
+        </w:tc>
+        <w:tc>
+          <w:tcPr>
+            <w:tcW w:w="4506" w:type="dxa"/>
+          </w:tcPr>
+          <w:p>
+            <w:pPr>
+              <w:jc w:val="center"/>
+              <w:rPr>
+                <w:lang w:val="en-US"/>
+              </w:rPr>
+            </w:pPr>
+          </w:p>
+        </w:tc>
+      </w:tr>
+      <w:tr>
+        <w:tc>
+          <w:tcPr>
+            <w:tcW w:w="1054" w:type="dxa"/>
+          </w:tcPr>
+          <w:p>
+            <w:pPr>
+              <w:jc w:val="center"/>
+              <w:rPr>
+                <w:lang w:val="en-US"/>
+              </w:rPr>
+            </w:pPr>
+          </w:p>
+        </w:tc>
+        <w:tc>
+          <w:tcPr>
+            <w:tcW w:w="2202" w:type="dxa"/>
+            <w:gridSpan w:val="2"/>
+          </w:tcPr>
+          <w:p>
+            <w:pPr>
+              <w:rPr>
+                <w:lang w:val="en-US"/>
+              </w:rPr>
+            </w:pPr>
+          </w:p>
+        </w:tc>
+        <w:tc>
+          <w:tcPr>
+            <w:tcW w:w="2694" w:type="dxa"/>
+          </w:tcPr>
+          <w:p>
+            <w:pPr>
+              <w:rPr>
+                <w:lang w:val="en-US"/>
+              </w:rPr>
+            </w:pPr>
+          </w:p>
+        </w:tc>
+        <w:tc>
+          <w:tcPr>
+            <w:tcW w:w="4506" w:type="dxa"/>
+          </w:tcPr>
+          <w:p>
+            <w:pPr>
+              <w:jc w:val="center"/>
+              <w:rPr>
+                <w:lang w:val="en-US"/>
+              </w:rPr>
+            </w:pPr>
+          </w:p>
+        </w:tc>
+      </w:tr>
+      <w:tr>
+        <w:tc>
+          <w:tcPr>
+            <w:tcW w:w="1054" w:type="dxa"/>
+          </w:tcPr>
+          <w:p>
+            <w:pPr>
+              <w:jc w:val="center"/>
+              <w:rPr>
+                <w:lang w:val="en-US"/>
+              </w:rPr>
+            </w:pPr>
+          </w:p>
+        </w:tc>
+        <w:tc>
+          <w:tcPr>
+            <w:tcW w:w="2202" w:type="dxa"/>
+            <w:gridSpan w:val="2"/>
+          </w:tcPr>
+          <w:p>
+            <w:pPr>
+              <w:rPr>
+                <w:lang w:val="en-US"/>
+              </w:rPr>
+            </w:pPr>
+          </w:p>
+        </w:tc>
+        <w:tc>
+          <w:tcPr>
+            <w:tcW w:w="2694" w:type="dxa"/>
           </w:tcPr>
           <w:p>
             <w:pPr>
@@ -2591,11 +4464,195 @@
       </w:pPr>
     </w:lvl>
   </w:abstractNum>
+  <w:abstractNum w:abstractNumId="2" w15:restartNumberingAfterBreak="0">
+    <w:nsid w:val="6B073167"/>
+    <w:multiLevelType w:val="hybridMultilevel"/>
+    <w:tmpl w:val="15662E30"/>
+    <w:lvl w:ilvl="0" w:tplc="2000000F">
+      <w:start w:val="1"/>
+      <w:numFmt w:val="decimal"/>
+      <w:lvlText w:val="%1."/>
+      <w:lvlJc w:val="left"/>
+      <w:pPr>
+        <w:ind w:left="502" w:hanging="360"/>
+      </w:pPr>
+      <w:rPr>
+        <w:rFonts w:hint="default"/>
+      </w:rPr>
+    </w:lvl>
+    <w:lvl w:ilvl="1" w:tplc="20000019" w:tentative="1">
+      <w:start w:val="1"/>
+      <w:numFmt w:val="lowerLetter"/>
+      <w:lvlText w:val="%2."/>
+      <w:lvlJc w:val="left"/>
+      <w:pPr>
+        <w:ind w:left="1222" w:hanging="360"/>
+      </w:pPr>
+    </w:lvl>
+    <w:lvl w:ilvl="2" w:tplc="2000001B" w:tentative="1">
+      <w:start w:val="1"/>
+      <w:numFmt w:val="lowerRoman"/>
+      <w:lvlText w:val="%3."/>
+      <w:lvlJc w:val="right"/>
+      <w:pPr>
+        <w:ind w:left="1942" w:hanging="180"/>
+      </w:pPr>
+    </w:lvl>
+    <w:lvl w:ilvl="3" w:tplc="2000000F" w:tentative="1">
+      <w:start w:val="1"/>
+      <w:numFmt w:val="decimal"/>
+      <w:lvlText w:val="%4."/>
+      <w:lvlJc w:val="left"/>
+      <w:pPr>
+        <w:ind w:left="2662" w:hanging="360"/>
+      </w:pPr>
+    </w:lvl>
+    <w:lvl w:ilvl="4" w:tplc="20000019" w:tentative="1">
+      <w:start w:val="1"/>
+      <w:numFmt w:val="lowerLetter"/>
+      <w:lvlText w:val="%5."/>
+      <w:lvlJc w:val="left"/>
+      <w:pPr>
+        <w:ind w:left="3382" w:hanging="360"/>
+      </w:pPr>
+    </w:lvl>
+    <w:lvl w:ilvl="5" w:tplc="2000001B" w:tentative="1">
+      <w:start w:val="1"/>
+      <w:numFmt w:val="lowerRoman"/>
+      <w:lvlText w:val="%6."/>
+      <w:lvlJc w:val="right"/>
+      <w:pPr>
+        <w:ind w:left="4102" w:hanging="180"/>
+      </w:pPr>
+    </w:lvl>
+    <w:lvl w:ilvl="6" w:tplc="2000000F" w:tentative="1">
+      <w:start w:val="1"/>
+      <w:numFmt w:val="decimal"/>
+      <w:lvlText w:val="%7."/>
+      <w:lvlJc w:val="left"/>
+      <w:pPr>
+        <w:ind w:left="4822" w:hanging="360"/>
+      </w:pPr>
+    </w:lvl>
+    <w:lvl w:ilvl="7" w:tplc="20000019" w:tentative="1">
+      <w:start w:val="1"/>
+      <w:numFmt w:val="lowerLetter"/>
+      <w:lvlText w:val="%8."/>
+      <w:lvlJc w:val="left"/>
+      <w:pPr>
+        <w:ind w:left="5542" w:hanging="360"/>
+      </w:pPr>
+    </w:lvl>
+    <w:lvl w:ilvl="8" w:tplc="2000001B" w:tentative="1">
+      <w:start w:val="1"/>
+      <w:numFmt w:val="lowerRoman"/>
+      <w:lvlText w:val="%9."/>
+      <w:lvlJc w:val="right"/>
+      <w:pPr>
+        <w:ind w:left="6262" w:hanging="180"/>
+      </w:pPr>
+    </w:lvl>
+  </w:abstractNum>
+  <w:abstractNum w:abstractNumId="3" w15:restartNumberingAfterBreak="0">
+    <w:nsid w:val="7B3447A9"/>
+    <w:multiLevelType w:val="hybridMultilevel"/>
+    <w:tmpl w:val="3462115E"/>
+    <w:lvl w:ilvl="0" w:tplc="2000000F">
+      <w:start w:val="1"/>
+      <w:numFmt w:val="decimal"/>
+      <w:lvlText w:val="%1."/>
+      <w:lvlJc w:val="left"/>
+      <w:pPr>
+        <w:ind w:left="360" w:hanging="360"/>
+      </w:pPr>
+      <w:rPr>
+        <w:rFonts w:hint="default"/>
+      </w:rPr>
+    </w:lvl>
+    <w:lvl w:ilvl="1" w:tplc="20000019" w:tentative="1">
+      <w:start w:val="1"/>
+      <w:numFmt w:val="lowerLetter"/>
+      <w:lvlText w:val="%2."/>
+      <w:lvlJc w:val="left"/>
+      <w:pPr>
+        <w:ind w:left="1080" w:hanging="360"/>
+      </w:pPr>
+    </w:lvl>
+    <w:lvl w:ilvl="2" w:tplc="2000001B" w:tentative="1">
+      <w:start w:val="1"/>
+      <w:numFmt w:val="lowerRoman"/>
+      <w:lvlText w:val="%3."/>
+      <w:lvlJc w:val="right"/>
+      <w:pPr>
+        <w:ind w:left="1800" w:hanging="180"/>
+      </w:pPr>
+    </w:lvl>
+    <w:lvl w:ilvl="3" w:tplc="2000000F" w:tentative="1">
+      <w:start w:val="1"/>
+      <w:numFmt w:val="decimal"/>
+      <w:lvlText w:val="%4."/>
+      <w:lvlJc w:val="left"/>
+      <w:pPr>
+        <w:ind w:left="2520" w:hanging="360"/>
+      </w:pPr>
+    </w:lvl>
+    <w:lvl w:ilvl="4" w:tplc="20000019" w:tentative="1">
+      <w:start w:val="1"/>
+      <w:numFmt w:val="lowerLetter"/>
+      <w:lvlText w:val="%5."/>
+      <w:lvlJc w:val="left"/>
+      <w:pPr>
+        <w:ind w:left="3240" w:hanging="360"/>
+      </w:pPr>
+    </w:lvl>
+    <w:lvl w:ilvl="5" w:tplc="2000001B" w:tentative="1">
+      <w:start w:val="1"/>
+      <w:numFmt w:val="lowerRoman"/>
+      <w:lvlText w:val="%6."/>
+      <w:lvlJc w:val="right"/>
+      <w:pPr>
+        <w:ind w:left="3960" w:hanging="180"/>
+      </w:pPr>
+    </w:lvl>
+    <w:lvl w:ilvl="6" w:tplc="2000000F" w:tentative="1">
+      <w:start w:val="1"/>
+      <w:numFmt w:val="decimal"/>
+      <w:lvlText w:val="%7."/>
+      <w:lvlJc w:val="left"/>
+      <w:pPr>
+        <w:ind w:left="4680" w:hanging="360"/>
+      </w:pPr>
+    </w:lvl>
+    <w:lvl w:ilvl="7" w:tplc="20000019" w:tentative="1">
+      <w:start w:val="1"/>
+      <w:numFmt w:val="lowerLetter"/>
+      <w:lvlText w:val="%8."/>
+      <w:lvlJc w:val="left"/>
+      <w:pPr>
+        <w:ind w:left="5400" w:hanging="360"/>
+      </w:pPr>
+    </w:lvl>
+    <w:lvl w:ilvl="8" w:tplc="2000001B" w:tentative="1">
+      <w:start w:val="1"/>
+      <w:numFmt w:val="lowerRoman"/>
+      <w:lvlText w:val="%9."/>
+      <w:lvlJc w:val="right"/>
+      <w:pPr>
+        <w:ind w:left="6120" w:hanging="180"/>
+      </w:pPr>
+    </w:lvl>
+  </w:abstractNum>
   <w:num w:numId="1" w16cid:durableId="198205630">
     <w:abstractNumId w:val="0"/>
   </w:num>
   <w:num w:numId="2" w16cid:durableId="2118134085">
     <w:abstractNumId w:val="1"/>
+  </w:num>
+  <w:num w:numId="3" w16cid:durableId="1949507879">
+    <w:abstractNumId w:val="2"/>
+  </w:num>
+  <w:num w:numId="4" w16cid:durableId="1584294926">
+    <w:abstractNumId w:val="3"/>
   </w:num>
 </w:numbering>
 </file>
@@ -3000,7 +5057,7 @@
   <w:style w:type="paragraph" w:default="1" w:styleId="Normal">
     <w:name w:val="Normal"/>
     <w:qFormat/>
-    <w:rsid w:val="00F41DA7"/>
+    <w:rsid w:val="004269D7"/>
     <w:pPr>
       <w:spacing w:line="259" w:lineRule="auto"/>
     </w:pPr>

</xml_diff>

<commit_message>
Lesson 06 + Lesson 07: socket io, JWT, GraphQL server, graphQL with MongoDB, MERN stack
</commit_message>
<xml_diff>
--- a/Node 54.docx
+++ b/Node 54.docx
@@ -604,14 +604,16 @@
                 <w:lang w:val="en-US"/>
               </w:rPr>
             </w:pPr>
+            <w:proofErr w:type="spellStart"/>
             <w:r>
               <w:rPr>
                 <w:i/>
                 <w:iCs/>
                 <w:lang w:val="en-US"/>
               </w:rPr>
-              <w:t>npm init</w:t>
-            </w:r>
+              <w:t>npm</w:t>
+            </w:r>
+            <w:proofErr w:type="spellEnd"/>
             <w:r>
               <w:rPr>
                 <w:i/>
@@ -620,6 +622,24 @@
               </w:rPr>
               <w:t xml:space="preserve"> </w:t>
             </w:r>
+            <w:proofErr w:type="spellStart"/>
+            <w:r>
+              <w:rPr>
+                <w:i/>
+                <w:iCs/>
+                <w:lang w:val="en-US"/>
+              </w:rPr>
+              <w:t>init</w:t>
+            </w:r>
+            <w:proofErr w:type="spellEnd"/>
+            <w:r>
+              <w:rPr>
+                <w:i/>
+                <w:iCs/>
+                <w:lang w:val="en-US"/>
+              </w:rPr>
+              <w:t xml:space="preserve"> </w:t>
+            </w:r>
             <w:r>
               <w:rPr>
                 <w:b/>
@@ -634,7 +654,43 @@
                 <w:iCs/>
                 <w:lang w:val="en-US"/>
               </w:rPr>
-              <w:t xml:space="preserve"> npm init -y</w:t>
+              <w:t xml:space="preserve"> </w:t>
+            </w:r>
+            <w:proofErr w:type="spellStart"/>
+            <w:r>
+              <w:rPr>
+                <w:i/>
+                <w:iCs/>
+                <w:lang w:val="en-US"/>
+              </w:rPr>
+              <w:t>npm</w:t>
+            </w:r>
+            <w:proofErr w:type="spellEnd"/>
+            <w:r>
+              <w:rPr>
+                <w:i/>
+                <w:iCs/>
+                <w:lang w:val="en-US"/>
+              </w:rPr>
+              <w:t xml:space="preserve"> </w:t>
+            </w:r>
+            <w:proofErr w:type="spellStart"/>
+            <w:r>
+              <w:rPr>
+                <w:i/>
+                <w:iCs/>
+                <w:lang w:val="en-US"/>
+              </w:rPr>
+              <w:t>init</w:t>
+            </w:r>
+            <w:proofErr w:type="spellEnd"/>
+            <w:r>
+              <w:rPr>
+                <w:i/>
+                <w:iCs/>
+                <w:lang w:val="en-US"/>
+              </w:rPr>
+              <w:t xml:space="preserve"> -y</w:t>
             </w:r>
           </w:p>
           <w:p>
@@ -652,7 +708,21 @@
               <w:rPr>
                 <w:lang w:val="en-US"/>
               </w:rPr>
-              <w:t>OR Create package.json file into the folder  -&gt; all project information</w:t>
+              <w:t xml:space="preserve">OR Create </w:t>
+            </w:r>
+            <w:proofErr w:type="spellStart"/>
+            <w:r>
+              <w:rPr>
+                <w:lang w:val="en-US"/>
+              </w:rPr>
+              <w:t>package.json</w:t>
+            </w:r>
+            <w:proofErr w:type="spellEnd"/>
+            <w:r>
+              <w:rPr>
+                <w:lang w:val="en-US"/>
+              </w:rPr>
+              <w:t xml:space="preserve"> file into the folder  -&gt; all project information</w:t>
             </w:r>
           </w:p>
           <w:p>
@@ -670,7 +740,21 @@
               <w:rPr>
                 <w:lang w:val="en-US"/>
               </w:rPr>
-              <w:t>Create entrypoint -&gt; index.js</w:t>
+              <w:t xml:space="preserve">Create </w:t>
+            </w:r>
+            <w:proofErr w:type="spellStart"/>
+            <w:r>
+              <w:rPr>
+                <w:lang w:val="en-US"/>
+              </w:rPr>
+              <w:t>entrypoint</w:t>
+            </w:r>
+            <w:proofErr w:type="spellEnd"/>
+            <w:r>
+              <w:rPr>
+                <w:lang w:val="en-US"/>
+              </w:rPr>
+              <w:t xml:space="preserve"> -&gt; index.js</w:t>
             </w:r>
           </w:p>
         </w:tc>
@@ -748,8 +832,16 @@
               <w:rPr>
                 <w:lang w:val="en-US"/>
               </w:rPr>
-              <w:t>Template leterals</w:t>
-            </w:r>
+              <w:t xml:space="preserve">Template </w:t>
+            </w:r>
+            <w:proofErr w:type="spellStart"/>
+            <w:r>
+              <w:rPr>
+                <w:lang w:val="en-US"/>
+              </w:rPr>
+              <w:t>leterals</w:t>
+            </w:r>
+            <w:proofErr w:type="spellEnd"/>
           </w:p>
         </w:tc>
         <w:tc>
@@ -1014,7 +1106,21 @@
               <w:rPr>
                 <w:lang w:val="en-US"/>
               </w:rPr>
-              <w:t>Import functions to my js file</w:t>
+              <w:t xml:space="preserve">Import functions to my </w:t>
+            </w:r>
+            <w:proofErr w:type="spellStart"/>
+            <w:r>
+              <w:rPr>
+                <w:lang w:val="en-US"/>
+              </w:rPr>
+              <w:t>js</w:t>
+            </w:r>
+            <w:proofErr w:type="spellEnd"/>
+            <w:r>
+              <w:rPr>
+                <w:lang w:val="en-US"/>
+              </w:rPr>
+              <w:t xml:space="preserve"> file</w:t>
             </w:r>
           </w:p>
         </w:tc>
@@ -1187,6 +1293,7 @@
                 <w:lang w:val="en-US"/>
               </w:rPr>
             </w:pPr>
+            <w:proofErr w:type="spellStart"/>
             <w:r>
               <w:rPr>
                 <w:lang w:val="en-US"/>
@@ -1200,7 +1307,17 @@
                 <w:highlight w:val="yellow"/>
                 <w:lang w:val="en-US"/>
               </w:rPr>
-              <w:t>reduce()</w:t>
+              <w:t>reduce</w:t>
+            </w:r>
+            <w:proofErr w:type="spellEnd"/>
+            <w:r>
+              <w:rPr>
+                <w:b/>
+                <w:bCs/>
+                <w:highlight w:val="yellow"/>
+                <w:lang w:val="en-US"/>
+              </w:rPr>
+              <w:t>()</w:t>
             </w:r>
           </w:p>
         </w:tc>
@@ -7965,6 +8082,505 @@
                 </wp:inline>
               </w:drawing>
             </w:r>
+          </w:p>
+        </w:tc>
+      </w:tr>
+      <w:tr>
+        <w:tc>
+          <w:tcPr>
+            <w:tcW w:w="1054" w:type="dxa"/>
+            <w:tcBorders>
+              <w:bottom w:val="single" w:sz="4" w:space="0" w:color="auto"/>
+            </w:tcBorders>
+          </w:tcPr>
+          <w:p>
+            <w:pPr>
+              <w:jc w:val="center"/>
+              <w:rPr>
+                <w:lang w:val="en-US"/>
+              </w:rPr>
+            </w:pPr>
+            <w:r>
+              <w:rPr>
+                <w:lang w:val="en-US"/>
+              </w:rPr>
+              <w:t>Time</w:t>
+            </w:r>
+          </w:p>
+        </w:tc>
+        <w:tc>
+          <w:tcPr>
+            <w:tcW w:w="2343" w:type="dxa"/>
+            <w:gridSpan w:val="2"/>
+            <w:tcBorders>
+              <w:bottom w:val="single" w:sz="4" w:space="0" w:color="auto"/>
+            </w:tcBorders>
+          </w:tcPr>
+          <w:p>
+            <w:pPr>
+              <w:jc w:val="center"/>
+              <w:rPr>
+                <w:lang w:val="en-US"/>
+              </w:rPr>
+            </w:pPr>
+            <w:r>
+              <w:rPr>
+                <w:lang w:val="en-US"/>
+              </w:rPr>
+              <w:t>Concept</w:t>
+            </w:r>
+          </w:p>
+        </w:tc>
+        <w:tc>
+          <w:tcPr>
+            <w:tcW w:w="2553" w:type="dxa"/>
+            <w:tcBorders>
+              <w:bottom w:val="single" w:sz="4" w:space="0" w:color="auto"/>
+            </w:tcBorders>
+          </w:tcPr>
+          <w:p>
+            <w:pPr>
+              <w:jc w:val="center"/>
+              <w:rPr>
+                <w:lang w:val="en-US"/>
+              </w:rPr>
+            </w:pPr>
+            <w:r>
+              <w:rPr>
+                <w:lang w:val="en-US"/>
+              </w:rPr>
+              <w:t>E</w:t>
+            </w:r>
+            <w:r>
+              <w:rPr>
+                <w:lang w:val="en-US"/>
+              </w:rPr>
+              <w:t>xplanation</w:t>
+            </w:r>
+          </w:p>
+        </w:tc>
+        <w:tc>
+          <w:tcPr>
+            <w:tcW w:w="4506" w:type="dxa"/>
+            <w:gridSpan w:val="2"/>
+            <w:tcBorders>
+              <w:bottom w:val="single" w:sz="4" w:space="0" w:color="auto"/>
+            </w:tcBorders>
+          </w:tcPr>
+          <w:p>
+            <w:pPr>
+              <w:jc w:val="center"/>
+              <w:rPr>
+                <w:lang w:val="en-US"/>
+              </w:rPr>
+            </w:pPr>
+            <w:r>
+              <w:rPr>
+                <w:lang w:val="en-US"/>
+              </w:rPr>
+              <w:t>Example</w:t>
+            </w:r>
+          </w:p>
+        </w:tc>
+      </w:tr>
+      <w:tr>
+        <w:tc>
+          <w:tcPr>
+            <w:tcW w:w="10456" w:type="dxa"/>
+            <w:gridSpan w:val="6"/>
+            <w:shd w:val="clear" w:color="auto" w:fill="FFFF00"/>
+          </w:tcPr>
+          <w:p>
+            <w:pPr>
+              <w:jc w:val="center"/>
+              <w:rPr>
+                <w:sz w:val="28"/>
+                <w:szCs w:val="28"/>
+                <w:lang w:val="en-US"/>
+              </w:rPr>
+            </w:pPr>
+            <w:r>
+              <w:rPr>
+                <w:b/>
+                <w:bCs/>
+                <w:sz w:val="28"/>
+                <w:szCs w:val="28"/>
+                <w:lang w:val="en-US"/>
+              </w:rPr>
+              <w:t xml:space="preserve">Lesson </w:t>
+            </w:r>
+            <w:proofErr w:type="gramStart"/>
+            <w:r>
+              <w:rPr>
+                <w:b/>
+                <w:bCs/>
+                <w:sz w:val="28"/>
+                <w:szCs w:val="28"/>
+                <w:lang w:val="en-US"/>
+              </w:rPr>
+              <w:t>0</w:t>
+            </w:r>
+            <w:r>
+              <w:rPr>
+                <w:b/>
+                <w:bCs/>
+                <w:sz w:val="28"/>
+                <w:szCs w:val="28"/>
+                <w:lang w:val="en-US"/>
+              </w:rPr>
+              <w:t xml:space="preserve">7 </w:t>
+            </w:r>
+            <w:r>
+              <w:rPr>
+                <w:b/>
+                <w:bCs/>
+                <w:sz w:val="28"/>
+                <w:szCs w:val="28"/>
+                <w:lang w:val="en-US"/>
+              </w:rPr>
+              <w:t xml:space="preserve"> </w:t>
+            </w:r>
+            <w:r>
+              <w:rPr>
+                <w:b/>
+                <w:bCs/>
+                <w:sz w:val="28"/>
+                <w:szCs w:val="28"/>
+                <w:lang w:val="en-US"/>
+              </w:rPr>
+              <w:t>MERN</w:t>
+            </w:r>
+            <w:proofErr w:type="gramEnd"/>
+          </w:p>
+          <w:p>
+            <w:pPr>
+              <w:jc w:val="center"/>
+              <w:rPr>
+                <w:b/>
+                <w:bCs/>
+                <w:sz w:val="28"/>
+                <w:szCs w:val="28"/>
+                <w:lang w:val="en-US"/>
+              </w:rPr>
+            </w:pPr>
+            <w:r>
+              <w:rPr>
+                <w:b/>
+                <w:bCs/>
+                <w:sz w:val="28"/>
+                <w:szCs w:val="28"/>
+                <w:lang w:val="en-US"/>
+              </w:rPr>
+              <w:t>Mongo + Express + React + NODE</w:t>
+            </w:r>
+          </w:p>
+        </w:tc>
+      </w:tr>
+      <w:tr>
+        <w:tc>
+          <w:tcPr>
+            <w:tcW w:w="1054" w:type="dxa"/>
+          </w:tcPr>
+          <w:p>
+            <w:pPr>
+              <w:jc w:val="center"/>
+              <w:rPr>
+                <w:lang w:val="en-US"/>
+              </w:rPr>
+            </w:pPr>
+            <w:r>
+              <w:rPr>
+                <w:lang w:val="en-US"/>
+              </w:rPr>
+              <w:t>18:10</w:t>
+            </w:r>
+          </w:p>
+        </w:tc>
+        <w:tc>
+          <w:tcPr>
+            <w:tcW w:w="2343" w:type="dxa"/>
+            <w:gridSpan w:val="2"/>
+          </w:tcPr>
+          <w:p>
+            <w:pPr>
+              <w:rPr>
+                <w:lang w:val="en-US"/>
+              </w:rPr>
+            </w:pPr>
+            <w:r>
+              <w:rPr>
+                <w:lang w:val="en-US"/>
+              </w:rPr>
+              <w:t xml:space="preserve">MERN \ </w:t>
+            </w:r>
+            <w:r>
+              <w:rPr>
+                <w:lang w:val="en-US"/>
+              </w:rPr>
+              <w:t>Full Stack</w:t>
+            </w:r>
+            <w:r>
+              <w:rPr>
+                <w:lang w:val="en-US"/>
+              </w:rPr>
+              <w:t xml:space="preserve"> app</w:t>
+            </w:r>
+          </w:p>
+        </w:tc>
+        <w:tc>
+          <w:tcPr>
+            <w:tcW w:w="2553" w:type="dxa"/>
+          </w:tcPr>
+          <w:p>
+            <w:pPr>
+              <w:rPr>
+                <w:lang w:val="en-US"/>
+              </w:rPr>
+            </w:pPr>
+            <w:r>
+              <w:rPr>
+                <w:lang w:val="en-US"/>
+              </w:rPr>
+              <w:t>Mongo + Express + React + NODE</w:t>
+            </w:r>
+          </w:p>
+        </w:tc>
+        <w:tc>
+          <w:tcPr>
+            <w:tcW w:w="4506" w:type="dxa"/>
+            <w:gridSpan w:val="2"/>
+          </w:tcPr>
+          <w:p>
+            <w:pPr>
+              <w:jc w:val="center"/>
+              <w:rPr>
+                <w:lang w:val="en-US"/>
+              </w:rPr>
+            </w:pPr>
+          </w:p>
+        </w:tc>
+      </w:tr>
+      <w:tr>
+        <w:tc>
+          <w:tcPr>
+            <w:tcW w:w="10456" w:type="dxa"/>
+            <w:gridSpan w:val="6"/>
+          </w:tcPr>
+          <w:p>
+            <w:pPr>
+              <w:jc w:val="center"/>
+              <w:rPr>
+                <w:lang w:val="en-US"/>
+              </w:rPr>
+            </w:pPr>
+            <w:r>
+              <w:rPr>
+                <w:noProof/>
+              </w:rPr>
+              <w:drawing>
+                <wp:inline distT="0" distB="0" distL="0" distR="0" wp14:anchorId="7AF5336B" wp14:editId="630C7FA0">
+                  <wp:extent cx="6254750" cy="3515243"/>
+                  <wp:effectExtent l="0" t="0" r="0" b="9525"/>
+                  <wp:docPr id="1898966262" name="Picture 1"/>
+                  <wp:cNvGraphicFramePr>
+                    <a:graphicFrameLocks xmlns:a="http://schemas.openxmlformats.org/drawingml/2006/main" noChangeAspect="1"/>
+                  </wp:cNvGraphicFramePr>
+                  <a:graphic xmlns:a="http://schemas.openxmlformats.org/drawingml/2006/main">
+                    <a:graphicData uri="http://schemas.openxmlformats.org/drawingml/2006/picture">
+                      <pic:pic xmlns:pic="http://schemas.openxmlformats.org/drawingml/2006/picture">
+                        <pic:nvPicPr>
+                          <pic:cNvPr id="1898966262" name=""/>
+                          <pic:cNvPicPr/>
+                        </pic:nvPicPr>
+                        <pic:blipFill>
+                          <a:blip r:embed="rId50"/>
+                          <a:stretch>
+                            <a:fillRect/>
+                          </a:stretch>
+                        </pic:blipFill>
+                        <pic:spPr>
+                          <a:xfrm>
+                            <a:off x="0" y="0"/>
+                            <a:ext cx="6261623" cy="3519106"/>
+                          </a:xfrm>
+                          <a:prstGeom prst="rect">
+                            <a:avLst/>
+                          </a:prstGeom>
+                        </pic:spPr>
+                      </pic:pic>
+                    </a:graphicData>
+                  </a:graphic>
+                </wp:inline>
+              </w:drawing>
+            </w:r>
+          </w:p>
+        </w:tc>
+      </w:tr>
+      <w:tr>
+        <w:tc>
+          <w:tcPr>
+            <w:tcW w:w="1054" w:type="dxa"/>
+          </w:tcPr>
+          <w:p>
+            <w:pPr>
+              <w:jc w:val="center"/>
+              <w:rPr>
+                <w:lang w:val="en-US"/>
+              </w:rPr>
+            </w:pPr>
+            <w:r>
+              <w:rPr>
+                <w:lang w:val="en-US"/>
+              </w:rPr>
+              <w:t>18:</w:t>
+            </w:r>
+          </w:p>
+        </w:tc>
+        <w:tc>
+          <w:tcPr>
+            <w:tcW w:w="2343" w:type="dxa"/>
+            <w:gridSpan w:val="2"/>
+          </w:tcPr>
+          <w:p>
+            <w:pPr>
+              <w:rPr>
+                <w:lang w:val="en-US"/>
+              </w:rPr>
+            </w:pPr>
+          </w:p>
+        </w:tc>
+        <w:tc>
+          <w:tcPr>
+            <w:tcW w:w="2553" w:type="dxa"/>
+          </w:tcPr>
+          <w:p>
+            <w:pPr>
+              <w:rPr>
+                <w:lang w:val="en-US"/>
+              </w:rPr>
+            </w:pPr>
+          </w:p>
+        </w:tc>
+        <w:tc>
+          <w:tcPr>
+            <w:tcW w:w="4506" w:type="dxa"/>
+            <w:gridSpan w:val="2"/>
+          </w:tcPr>
+          <w:p>
+            <w:pPr>
+              <w:jc w:val="center"/>
+              <w:rPr>
+                <w:lang w:val="en-US"/>
+              </w:rPr>
+            </w:pPr>
+          </w:p>
+        </w:tc>
+      </w:tr>
+      <w:tr>
+        <w:tc>
+          <w:tcPr>
+            <w:tcW w:w="1054" w:type="dxa"/>
+          </w:tcPr>
+          <w:p>
+            <w:pPr>
+              <w:jc w:val="center"/>
+              <w:rPr>
+                <w:lang w:val="en-US"/>
+              </w:rPr>
+            </w:pPr>
+          </w:p>
+        </w:tc>
+        <w:tc>
+          <w:tcPr>
+            <w:tcW w:w="2343" w:type="dxa"/>
+            <w:gridSpan w:val="2"/>
+          </w:tcPr>
+          <w:p>
+            <w:pPr>
+              <w:rPr>
+                <w:lang w:val="en-US"/>
+              </w:rPr>
+            </w:pPr>
+          </w:p>
+        </w:tc>
+        <w:tc>
+          <w:tcPr>
+            <w:tcW w:w="2553" w:type="dxa"/>
+          </w:tcPr>
+          <w:p>
+            <w:pPr>
+              <w:rPr>
+                <w:lang w:val="en-US"/>
+              </w:rPr>
+            </w:pPr>
+          </w:p>
+        </w:tc>
+        <w:tc>
+          <w:tcPr>
+            <w:tcW w:w="4506" w:type="dxa"/>
+            <w:gridSpan w:val="2"/>
+          </w:tcPr>
+          <w:p>
+            <w:pPr>
+              <w:jc w:val="center"/>
+              <w:rPr>
+                <w:lang w:val="en-US"/>
+              </w:rPr>
+            </w:pPr>
+          </w:p>
+        </w:tc>
+      </w:tr>
+      <w:tr>
+        <w:tc>
+          <w:tcPr>
+            <w:tcW w:w="1054" w:type="dxa"/>
+          </w:tcPr>
+          <w:p>
+            <w:pPr>
+              <w:jc w:val="center"/>
+              <w:rPr>
+                <w:lang w:val="en-US"/>
+              </w:rPr>
+            </w:pPr>
+          </w:p>
+        </w:tc>
+        <w:tc>
+          <w:tcPr>
+            <w:tcW w:w="2343" w:type="dxa"/>
+            <w:gridSpan w:val="2"/>
+          </w:tcPr>
+          <w:p>
+            <w:pPr>
+              <w:rPr>
+                <w:lang w:val="en-US"/>
+              </w:rPr>
+            </w:pPr>
+          </w:p>
+        </w:tc>
+        <w:tc>
+          <w:tcPr>
+            <w:tcW w:w="2553" w:type="dxa"/>
+          </w:tcPr>
+          <w:p>
+            <w:pPr>
+              <w:rPr>
+                <w:lang w:val="en-US"/>
+              </w:rPr>
+            </w:pPr>
+          </w:p>
+        </w:tc>
+        <w:tc>
+          <w:tcPr>
+            <w:tcW w:w="4506" w:type="dxa"/>
+            <w:gridSpan w:val="2"/>
+          </w:tcPr>
+          <w:p>
+            <w:pPr>
+              <w:jc w:val="center"/>
+              <w:rPr>
+                <w:lang w:val="en-US"/>
+              </w:rPr>
+            </w:pPr>
           </w:p>
         </w:tc>
       </w:tr>
@@ -9404,7 +10020,7 @@
   <w:style w:type="paragraph" w:default="1" w:styleId="Normal">
     <w:name w:val="Normal"/>
     <w:qFormat/>
-    <w:rsid w:val="008325D7"/>
+    <w:rsid w:val="005145FF"/>
     <w:pPr>
       <w:spacing w:line="259" w:lineRule="auto"/>
     </w:pPr>

</xml_diff>

<commit_message>
Lesson 05: Lab 08 solution, socket.io
</commit_message>
<xml_diff>
--- a/Node 54.docx
+++ b/Node 54.docx
@@ -92,7 +92,7 @@
       <w:tr>
         <w:tc>
           <w:tcPr>
-            <w:tcW w:w="1271" w:type="dxa"/>
+            <w:tcW w:w="1270" w:type="dxa"/>
             <w:tcBorders>
               <w:bottom w:val="single" w:sz="4" w:space="0" w:color="auto"/>
             </w:tcBorders>
@@ -165,7 +165,7 @@
         </w:tc>
         <w:tc>
           <w:tcPr>
-            <w:tcW w:w="4507" w:type="dxa"/>
+            <w:tcW w:w="4508" w:type="dxa"/>
             <w:tcBorders>
               <w:bottom w:val="single" w:sz="4" w:space="0" w:color="auto"/>
             </w:tcBorders>
@@ -220,7 +220,7 @@
       <w:tr>
         <w:tc>
           <w:tcPr>
-            <w:tcW w:w="1271" w:type="dxa"/>
+            <w:tcW w:w="1270" w:type="dxa"/>
           </w:tcPr>
           <w:p>
             <w:pPr>
@@ -305,7 +305,7 @@
         </w:tc>
         <w:tc>
           <w:tcPr>
-            <w:tcW w:w="4507" w:type="dxa"/>
+            <w:tcW w:w="4508" w:type="dxa"/>
           </w:tcPr>
           <w:p>
             <w:pPr>
@@ -390,7 +390,7 @@
       <w:tr>
         <w:tc>
           <w:tcPr>
-            <w:tcW w:w="1271" w:type="dxa"/>
+            <w:tcW w:w="1270" w:type="dxa"/>
           </w:tcPr>
           <w:p>
             <w:pPr>
@@ -461,7 +461,7 @@
         </w:tc>
         <w:tc>
           <w:tcPr>
-            <w:tcW w:w="4507" w:type="dxa"/>
+            <w:tcW w:w="4508" w:type="dxa"/>
           </w:tcPr>
           <w:p>
             <w:pPr>
@@ -600,14 +600,16 @@
                 <w:lang w:val="en-US"/>
               </w:rPr>
             </w:pPr>
+            <w:proofErr w:type="spellStart"/>
             <w:r>
               <w:rPr>
                 <w:i/>
                 <w:iCs/>
                 <w:lang w:val="en-US"/>
               </w:rPr>
-              <w:t>npm init</w:t>
-            </w:r>
+              <w:t>npm</w:t>
+            </w:r>
+            <w:proofErr w:type="spellEnd"/>
             <w:r>
               <w:rPr>
                 <w:i/>
@@ -616,6 +618,24 @@
               </w:rPr>
               <w:t xml:space="preserve"> </w:t>
             </w:r>
+            <w:proofErr w:type="spellStart"/>
+            <w:r>
+              <w:rPr>
+                <w:i/>
+                <w:iCs/>
+                <w:lang w:val="en-US"/>
+              </w:rPr>
+              <w:t>init</w:t>
+            </w:r>
+            <w:proofErr w:type="spellEnd"/>
+            <w:r>
+              <w:rPr>
+                <w:i/>
+                <w:iCs/>
+                <w:lang w:val="en-US"/>
+              </w:rPr>
+              <w:t xml:space="preserve"> </w:t>
+            </w:r>
             <w:r>
               <w:rPr>
                 <w:b/>
@@ -630,7 +650,43 @@
                 <w:iCs/>
                 <w:lang w:val="en-US"/>
               </w:rPr>
-              <w:t xml:space="preserve"> npm init -y</w:t>
+              <w:t xml:space="preserve"> </w:t>
+            </w:r>
+            <w:proofErr w:type="spellStart"/>
+            <w:r>
+              <w:rPr>
+                <w:i/>
+                <w:iCs/>
+                <w:lang w:val="en-US"/>
+              </w:rPr>
+              <w:t>npm</w:t>
+            </w:r>
+            <w:proofErr w:type="spellEnd"/>
+            <w:r>
+              <w:rPr>
+                <w:i/>
+                <w:iCs/>
+                <w:lang w:val="en-US"/>
+              </w:rPr>
+              <w:t xml:space="preserve"> </w:t>
+            </w:r>
+            <w:proofErr w:type="spellStart"/>
+            <w:r>
+              <w:rPr>
+                <w:i/>
+                <w:iCs/>
+                <w:lang w:val="en-US"/>
+              </w:rPr>
+              <w:t>init</w:t>
+            </w:r>
+            <w:proofErr w:type="spellEnd"/>
+            <w:r>
+              <w:rPr>
+                <w:i/>
+                <w:iCs/>
+                <w:lang w:val="en-US"/>
+              </w:rPr>
+              <w:t xml:space="preserve"> -y</w:t>
             </w:r>
           </w:p>
           <w:p>
@@ -648,7 +704,35 @@
               <w:rPr>
                 <w:lang w:val="en-US"/>
               </w:rPr>
-              <w:t>OR Create package.json file into the folder  -&gt; all project information</w:t>
+              <w:t xml:space="preserve">OR Create </w:t>
+            </w:r>
+            <w:proofErr w:type="spellStart"/>
+            <w:r>
+              <w:rPr>
+                <w:lang w:val="en-US"/>
+              </w:rPr>
+              <w:t>package.json</w:t>
+            </w:r>
+            <w:proofErr w:type="spellEnd"/>
+            <w:r>
+              <w:rPr>
+                <w:lang w:val="en-US"/>
+              </w:rPr>
+              <w:t xml:space="preserve"> file into the </w:t>
+            </w:r>
+            <w:proofErr w:type="gramStart"/>
+            <w:r>
+              <w:rPr>
+                <w:lang w:val="en-US"/>
+              </w:rPr>
+              <w:t>folder  -</w:t>
+            </w:r>
+            <w:proofErr w:type="gramEnd"/>
+            <w:r>
+              <w:rPr>
+                <w:lang w:val="en-US"/>
+              </w:rPr>
+              <w:t>&gt; all project information</w:t>
             </w:r>
           </w:p>
           <w:p>
@@ -666,7 +750,21 @@
               <w:rPr>
                 <w:lang w:val="en-US"/>
               </w:rPr>
-              <w:t>Create entrypoint -&gt; index.js</w:t>
+              <w:t xml:space="preserve">Create </w:t>
+            </w:r>
+            <w:proofErr w:type="spellStart"/>
+            <w:r>
+              <w:rPr>
+                <w:lang w:val="en-US"/>
+              </w:rPr>
+              <w:t>entrypoint</w:t>
+            </w:r>
+            <w:proofErr w:type="spellEnd"/>
+            <w:r>
+              <w:rPr>
+                <w:lang w:val="en-US"/>
+              </w:rPr>
+              <w:t xml:space="preserve"> -&gt; index.js</w:t>
             </w:r>
           </w:p>
         </w:tc>
@@ -674,7 +772,7 @@
       <w:tr>
         <w:tc>
           <w:tcPr>
-            <w:tcW w:w="1271" w:type="dxa"/>
+            <w:tcW w:w="1270" w:type="dxa"/>
           </w:tcPr>
           <w:p>
             <w:pPr>
@@ -744,13 +842,21 @@
               <w:rPr>
                 <w:lang w:val="en-US"/>
               </w:rPr>
-              <w:t>Template leterals</w:t>
-            </w:r>
-          </w:p>
-        </w:tc>
-        <w:tc>
-          <w:tcPr>
-            <w:tcW w:w="4507" w:type="dxa"/>
+              <w:t xml:space="preserve">Template </w:t>
+            </w:r>
+            <w:proofErr w:type="spellStart"/>
+            <w:r>
+              <w:rPr>
+                <w:lang w:val="en-US"/>
+              </w:rPr>
+              <w:t>leterals</w:t>
+            </w:r>
+            <w:proofErr w:type="spellEnd"/>
+          </w:p>
+        </w:tc>
+        <w:tc>
+          <w:tcPr>
+            <w:tcW w:w="4508" w:type="dxa"/>
           </w:tcPr>
           <w:p>
             <w:pPr>
@@ -835,7 +941,7 @@
       <w:tr>
         <w:tc>
           <w:tcPr>
-            <w:tcW w:w="1271" w:type="dxa"/>
+            <w:tcW w:w="1270" w:type="dxa"/>
           </w:tcPr>
           <w:p>
             <w:pPr>
@@ -891,7 +997,7 @@
         </w:tc>
         <w:tc>
           <w:tcPr>
-            <w:tcW w:w="4507" w:type="dxa"/>
+            <w:tcW w:w="4508" w:type="dxa"/>
           </w:tcPr>
           <w:p>
             <w:pPr>
@@ -976,7 +1082,7 @@
       <w:tr>
         <w:tc>
           <w:tcPr>
-            <w:tcW w:w="1271" w:type="dxa"/>
+            <w:tcW w:w="1270" w:type="dxa"/>
           </w:tcPr>
           <w:p>
             <w:pPr>
@@ -1008,7 +1114,21 @@
               <w:rPr>
                 <w:lang w:val="en-US"/>
               </w:rPr>
-              <w:t>Import functions to my js file</w:t>
+              <w:t xml:space="preserve">Import functions to my </w:t>
+            </w:r>
+            <w:proofErr w:type="spellStart"/>
+            <w:r>
+              <w:rPr>
+                <w:lang w:val="en-US"/>
+              </w:rPr>
+              <w:t>js</w:t>
+            </w:r>
+            <w:proofErr w:type="spellEnd"/>
+            <w:r>
+              <w:rPr>
+                <w:lang w:val="en-US"/>
+              </w:rPr>
+              <w:t xml:space="preserve"> file</w:t>
             </w:r>
           </w:p>
         </w:tc>
@@ -1032,7 +1152,7 @@
         </w:tc>
         <w:tc>
           <w:tcPr>
-            <w:tcW w:w="4507" w:type="dxa"/>
+            <w:tcW w:w="4508" w:type="dxa"/>
           </w:tcPr>
           <w:p>
             <w:pPr>
@@ -1117,7 +1237,7 @@
       <w:tr>
         <w:tc>
           <w:tcPr>
-            <w:tcW w:w="1271" w:type="dxa"/>
+            <w:tcW w:w="1270" w:type="dxa"/>
           </w:tcPr>
           <w:p>
             <w:pPr>
@@ -1136,7 +1256,7 @@
         </w:tc>
         <w:tc>
           <w:tcPr>
-            <w:tcW w:w="9186" w:type="dxa"/>
+            <w:tcW w:w="9187" w:type="dxa"/>
             <w:gridSpan w:val="4"/>
           </w:tcPr>
           <w:p>
@@ -1158,7 +1278,7 @@
       <w:tr>
         <w:tc>
           <w:tcPr>
-            <w:tcW w:w="1271" w:type="dxa"/>
+            <w:tcW w:w="1270" w:type="dxa"/>
           </w:tcPr>
           <w:p>
             <w:pPr>
@@ -1180,6 +1300,7 @@
                 <w:lang w:val="en-US"/>
               </w:rPr>
             </w:pPr>
+            <w:proofErr w:type="spellStart"/>
             <w:r>
               <w:rPr>
                 <w:lang w:val="en-US"/>
@@ -1193,7 +1314,17 @@
                 <w:highlight w:val="yellow"/>
                 <w:lang w:val="en-US"/>
               </w:rPr>
-              <w:t>reduce()</w:t>
+              <w:t>reduce</w:t>
+            </w:r>
+            <w:proofErr w:type="spellEnd"/>
+            <w:r>
+              <w:rPr>
+                <w:b/>
+                <w:bCs/>
+                <w:highlight w:val="yellow"/>
+                <w:lang w:val="en-US"/>
+              </w:rPr>
+              <w:t>()</w:t>
             </w:r>
           </w:p>
         </w:tc>
@@ -1211,7 +1342,21 @@
               <w:rPr>
                 <w:lang w:val="en-US"/>
               </w:rPr>
-              <w:t>The way for count the values from array</w:t>
+              <w:t xml:space="preserve">The way </w:t>
+            </w:r>
+            <w:proofErr w:type="gramStart"/>
+            <w:r>
+              <w:rPr>
+                <w:lang w:val="en-US"/>
+              </w:rPr>
+              <w:t>for</w:t>
+            </w:r>
+            <w:proofErr w:type="gramEnd"/>
+            <w:r>
+              <w:rPr>
+                <w:lang w:val="en-US"/>
+              </w:rPr>
+              <w:t xml:space="preserve"> count the values from array</w:t>
             </w:r>
           </w:p>
           <w:p>
@@ -1230,7 +1375,7 @@
         </w:tc>
         <w:tc>
           <w:tcPr>
-            <w:tcW w:w="4507" w:type="dxa"/>
+            <w:tcW w:w="4508" w:type="dxa"/>
           </w:tcPr>
           <w:p>
             <w:pPr>
@@ -1329,7 +1474,21 @@
               <w:rPr>
                 <w:lang w:val="en-US"/>
               </w:rPr>
-              <w:t>Install the json files library reader</w:t>
+              <w:t xml:space="preserve">Install the </w:t>
+            </w:r>
+            <w:proofErr w:type="spellStart"/>
+            <w:r>
+              <w:rPr>
+                <w:lang w:val="en-US"/>
+              </w:rPr>
+              <w:t>json</w:t>
+            </w:r>
+            <w:proofErr w:type="spellEnd"/>
+            <w:r>
+              <w:rPr>
+                <w:lang w:val="en-US"/>
+              </w:rPr>
+              <w:t xml:space="preserve"> files library reader</w:t>
             </w:r>
           </w:p>
           <w:p>
@@ -1342,6 +1501,8 @@
                 <w:lang w:val="en-US"/>
               </w:rPr>
             </w:pPr>
+            <w:proofErr w:type="spellStart"/>
+            <w:proofErr w:type="gramStart"/>
             <w:r>
               <w:rPr>
                 <w:b/>
@@ -1349,8 +1510,30 @@
                 <w:u w:val="single"/>
                 <w:lang w:val="en-US"/>
               </w:rPr>
-              <w:t>npm I jsonfile</w:t>
-            </w:r>
+              <w:t>npm</w:t>
+            </w:r>
+            <w:proofErr w:type="spellEnd"/>
+            <w:proofErr w:type="gramEnd"/>
+            <w:r>
+              <w:rPr>
+                <w:b/>
+                <w:bCs/>
+                <w:u w:val="single"/>
+                <w:lang w:val="en-US"/>
+              </w:rPr>
+              <w:t xml:space="preserve"> I </w:t>
+            </w:r>
+            <w:proofErr w:type="spellStart"/>
+            <w:r>
+              <w:rPr>
+                <w:b/>
+                <w:bCs/>
+                <w:u w:val="single"/>
+                <w:lang w:val="en-US"/>
+              </w:rPr>
+              <w:t>jsonfile</w:t>
+            </w:r>
+            <w:proofErr w:type="spellEnd"/>
           </w:p>
         </w:tc>
       </w:tr>
@@ -1360,7 +1543,7 @@
         </w:trPr>
         <w:tc>
           <w:tcPr>
-            <w:tcW w:w="1271" w:type="dxa"/>
+            <w:tcW w:w="1270" w:type="dxa"/>
             <w:vMerge w:val="restart"/>
           </w:tcPr>
           <w:p>
@@ -1412,13 +1595,27 @@
               <w:rPr>
                 <w:lang w:val="en-US"/>
               </w:rPr>
-              <w:t>Import the library to the main file (file into you use the json file)</w:t>
-            </w:r>
-          </w:p>
-        </w:tc>
-        <w:tc>
-          <w:tcPr>
-            <w:tcW w:w="4507" w:type="dxa"/>
+              <w:t xml:space="preserve">Import the library to the main file (file into you use the </w:t>
+            </w:r>
+            <w:proofErr w:type="spellStart"/>
+            <w:r>
+              <w:rPr>
+                <w:lang w:val="en-US"/>
+              </w:rPr>
+              <w:t>json</w:t>
+            </w:r>
+            <w:proofErr w:type="spellEnd"/>
+            <w:r>
+              <w:rPr>
+                <w:lang w:val="en-US"/>
+              </w:rPr>
+              <w:t xml:space="preserve"> file)</w:t>
+            </w:r>
+          </w:p>
+        </w:tc>
+        <w:tc>
+          <w:tcPr>
+            <w:tcW w:w="4508" w:type="dxa"/>
           </w:tcPr>
           <w:p>
             <w:pPr>
@@ -1506,7 +1703,7 @@
         </w:trPr>
         <w:tc>
           <w:tcPr>
-            <w:tcW w:w="1271" w:type="dxa"/>
+            <w:tcW w:w="1270" w:type="dxa"/>
             <w:vMerge/>
           </w:tcPr>
           <w:p>
@@ -1552,7 +1749,7 @@
         </w:tc>
         <w:tc>
           <w:tcPr>
-            <w:tcW w:w="4507" w:type="dxa"/>
+            <w:tcW w:w="4508" w:type="dxa"/>
           </w:tcPr>
           <w:p>
             <w:pPr>
@@ -1716,7 +1913,7 @@
       <w:tr>
         <w:tc>
           <w:tcPr>
-            <w:tcW w:w="1271" w:type="dxa"/>
+            <w:tcW w:w="1270" w:type="dxa"/>
             <w:tcBorders>
               <w:bottom w:val="single" w:sz="4" w:space="0" w:color="auto"/>
             </w:tcBorders>
@@ -1790,7 +1987,7 @@
         </w:tc>
         <w:tc>
           <w:tcPr>
-            <w:tcW w:w="4507" w:type="dxa"/>
+            <w:tcW w:w="4508" w:type="dxa"/>
             <w:tcBorders>
               <w:bottom w:val="single" w:sz="4" w:space="0" w:color="auto"/>
             </w:tcBorders>
@@ -1845,7 +2042,7 @@
       <w:tr>
         <w:tc>
           <w:tcPr>
-            <w:tcW w:w="1271" w:type="dxa"/>
+            <w:tcW w:w="1270" w:type="dxa"/>
           </w:tcPr>
           <w:p>
             <w:pPr>
@@ -1864,7 +2061,7 @@
         </w:tc>
         <w:tc>
           <w:tcPr>
-            <w:tcW w:w="9186" w:type="dxa"/>
+            <w:tcW w:w="9187" w:type="dxa"/>
             <w:gridSpan w:val="4"/>
           </w:tcPr>
           <w:p>
@@ -1886,7 +2083,7 @@
       <w:tr>
         <w:tc>
           <w:tcPr>
-            <w:tcW w:w="1271" w:type="dxa"/>
+            <w:tcW w:w="1270" w:type="dxa"/>
           </w:tcPr>
           <w:p>
             <w:pPr>
@@ -1942,7 +2139,7 @@
         </w:tc>
         <w:tc>
           <w:tcPr>
-            <w:tcW w:w="4507" w:type="dxa"/>
+            <w:tcW w:w="4508" w:type="dxa"/>
           </w:tcPr>
           <w:p>
             <w:pPr>
@@ -2054,7 +2251,7 @@
       <w:tr>
         <w:tc>
           <w:tcPr>
-            <w:tcW w:w="1271" w:type="dxa"/>
+            <w:tcW w:w="1270" w:type="dxa"/>
             <w:tcBorders>
               <w:bottom w:val="single" w:sz="4" w:space="0" w:color="auto"/>
             </w:tcBorders>
@@ -2127,7 +2324,7 @@
         </w:tc>
         <w:tc>
           <w:tcPr>
-            <w:tcW w:w="4507" w:type="dxa"/>
+            <w:tcW w:w="4508" w:type="dxa"/>
             <w:tcBorders>
               <w:bottom w:val="single" w:sz="4" w:space="0" w:color="auto"/>
             </w:tcBorders>
@@ -2182,7 +2379,7 @@
       <w:tr>
         <w:tc>
           <w:tcPr>
-            <w:tcW w:w="1271" w:type="dxa"/>
+            <w:tcW w:w="1270" w:type="dxa"/>
           </w:tcPr>
           <w:p>
             <w:pPr>
@@ -2201,7 +2398,7 @@
         </w:tc>
         <w:tc>
           <w:tcPr>
-            <w:tcW w:w="9186" w:type="dxa"/>
+            <w:tcW w:w="9187" w:type="dxa"/>
             <w:gridSpan w:val="4"/>
           </w:tcPr>
           <w:p>
@@ -2223,7 +2420,7 @@
       <w:tr>
         <w:tc>
           <w:tcPr>
-            <w:tcW w:w="1271" w:type="dxa"/>
+            <w:tcW w:w="1270" w:type="dxa"/>
           </w:tcPr>
           <w:p>
             <w:pPr>
@@ -2303,7 +2500,7 @@
         </w:tc>
         <w:tc>
           <w:tcPr>
-            <w:tcW w:w="4507" w:type="dxa"/>
+            <w:tcW w:w="4508" w:type="dxa"/>
           </w:tcPr>
           <w:p>
             <w:pPr>
@@ -2366,7 +2563,7 @@
       <w:tr>
         <w:tc>
           <w:tcPr>
-            <w:tcW w:w="1271" w:type="dxa"/>
+            <w:tcW w:w="1270" w:type="dxa"/>
           </w:tcPr>
           <w:p>
             <w:pPr>
@@ -2435,7 +2632,7 @@
         </w:tc>
         <w:tc>
           <w:tcPr>
-            <w:tcW w:w="4507" w:type="dxa"/>
+            <w:tcW w:w="4508" w:type="dxa"/>
           </w:tcPr>
           <w:p>
             <w:pPr>
@@ -2491,7 +2688,29 @@
                 <w:u w:val="single"/>
                 <w:lang w:val="en-US"/>
               </w:rPr>
-              <w:t xml:space="preserve"> for create the Rest API Server with NODE:</w:t>
+              <w:t xml:space="preserve"> for </w:t>
+            </w:r>
+            <w:proofErr w:type="gramStart"/>
+            <w:r>
+              <w:rPr>
+                <w:b/>
+                <w:bCs/>
+                <w:highlight w:val="yellow"/>
+                <w:u w:val="single"/>
+                <w:lang w:val="en-US"/>
+              </w:rPr>
+              <w:t>create</w:t>
+            </w:r>
+            <w:proofErr w:type="gramEnd"/>
+            <w:r>
+              <w:rPr>
+                <w:b/>
+                <w:bCs/>
+                <w:highlight w:val="yellow"/>
+                <w:u w:val="single"/>
+                <w:lang w:val="en-US"/>
+              </w:rPr>
+              <w:t xml:space="preserve"> the Rest API Server with NODE:</w:t>
             </w:r>
           </w:p>
           <w:p>
@@ -2503,21 +2722,23 @@
                 <w:lang w:val="en-US"/>
               </w:rPr>
             </w:pPr>
+            <w:proofErr w:type="spellStart"/>
             <w:r>
               <w:rPr>
                 <w:i/>
                 <w:iCs/>
                 <w:lang w:val="en-US"/>
               </w:rPr>
-              <w:t xml:space="preserve">npm </w:t>
-            </w:r>
+              <w:t>npm</w:t>
+            </w:r>
+            <w:proofErr w:type="spellEnd"/>
             <w:r>
               <w:rPr>
                 <w:i/>
                 <w:iCs/>
                 <w:lang w:val="en-US"/>
               </w:rPr>
-              <w:t>i</w:t>
+              <w:t xml:space="preserve"> </w:t>
             </w:r>
             <w:r>
               <w:rPr>
@@ -2525,6 +2746,14 @@
                 <w:iCs/>
                 <w:lang w:val="en-US"/>
               </w:rPr>
+              <w:t>i</w:t>
+            </w:r>
+            <w:r>
+              <w:rPr>
+                <w:i/>
+                <w:iCs/>
+                <w:lang w:val="en-US"/>
+              </w:rPr>
               <w:t xml:space="preserve"> express</w:t>
             </w:r>
           </w:p>
@@ -2533,7 +2762,7 @@
       <w:tr>
         <w:tc>
           <w:tcPr>
-            <w:tcW w:w="1271" w:type="dxa"/>
+            <w:tcW w:w="1270" w:type="dxa"/>
           </w:tcPr>
           <w:p>
             <w:pPr>
@@ -2590,7 +2819,7 @@
         </w:tc>
         <w:tc>
           <w:tcPr>
-            <w:tcW w:w="4507" w:type="dxa"/>
+            <w:tcW w:w="4508" w:type="dxa"/>
           </w:tcPr>
           <w:p>
             <w:pPr>
@@ -2645,7 +2874,7 @@
       <w:tr>
         <w:tc>
           <w:tcPr>
-            <w:tcW w:w="1271" w:type="dxa"/>
+            <w:tcW w:w="1270" w:type="dxa"/>
           </w:tcPr>
           <w:p>
             <w:pPr>
@@ -2734,7 +2963,7 @@
         </w:tc>
         <w:tc>
           <w:tcPr>
-            <w:tcW w:w="4507" w:type="dxa"/>
+            <w:tcW w:w="4508" w:type="dxa"/>
           </w:tcPr>
           <w:p>
             <w:pPr>
@@ -2789,7 +3018,7 @@
       <w:tr>
         <w:tc>
           <w:tcPr>
-            <w:tcW w:w="1271" w:type="dxa"/>
+            <w:tcW w:w="1270" w:type="dxa"/>
           </w:tcPr>
           <w:p>
             <w:pPr>
@@ -2872,7 +3101,7 @@
         </w:tc>
         <w:tc>
           <w:tcPr>
-            <w:tcW w:w="4507" w:type="dxa"/>
+            <w:tcW w:w="4508" w:type="dxa"/>
           </w:tcPr>
           <w:p>
             <w:pPr>
@@ -2935,7 +3164,7 @@
       <w:tr>
         <w:tc>
           <w:tcPr>
-            <w:tcW w:w="1271" w:type="dxa"/>
+            <w:tcW w:w="1270" w:type="dxa"/>
             <w:tcBorders>
               <w:bottom w:val="single" w:sz="4" w:space="0" w:color="auto"/>
             </w:tcBorders>
@@ -2973,6 +3202,7 @@
                 <w:lang w:val="en-US"/>
               </w:rPr>
             </w:pPr>
+            <w:proofErr w:type="spellStart"/>
             <w:r>
               <w:rPr>
                 <w:b/>
@@ -2981,6 +3211,7 @@
               </w:rPr>
               <w:t>nodemon</w:t>
             </w:r>
+            <w:proofErr w:type="spellEnd"/>
             <w:r>
               <w:rPr>
                 <w:lang w:val="en-US"/>
@@ -3058,7 +3289,7 @@
         </w:tc>
         <w:tc>
           <w:tcPr>
-            <w:tcW w:w="4507" w:type="dxa"/>
+            <w:tcW w:w="4508" w:type="dxa"/>
             <w:tcBorders>
               <w:bottom w:val="single" w:sz="4" w:space="0" w:color="auto"/>
             </w:tcBorders>
@@ -3118,7 +3349,7 @@
         </w:trPr>
         <w:tc>
           <w:tcPr>
-            <w:tcW w:w="2689" w:type="dxa"/>
+            <w:tcW w:w="2688" w:type="dxa"/>
             <w:gridSpan w:val="2"/>
             <w:vMerge w:val="restart"/>
           </w:tcPr>
@@ -3142,7 +3373,7 @@
         </w:tc>
         <w:tc>
           <w:tcPr>
-            <w:tcW w:w="7768" w:type="dxa"/>
+            <w:tcW w:w="7769" w:type="dxa"/>
             <w:gridSpan w:val="3"/>
           </w:tcPr>
           <w:p>
@@ -3201,7 +3432,7 @@
         </w:trPr>
         <w:tc>
           <w:tcPr>
-            <w:tcW w:w="2689" w:type="dxa"/>
+            <w:tcW w:w="2688" w:type="dxa"/>
             <w:gridSpan w:val="2"/>
             <w:vMerge/>
             <w:tcBorders>
@@ -3220,7 +3451,7 @@
         </w:tc>
         <w:tc>
           <w:tcPr>
-            <w:tcW w:w="7768" w:type="dxa"/>
+            <w:tcW w:w="7769" w:type="dxa"/>
             <w:gridSpan w:val="3"/>
             <w:tcBorders>
               <w:bottom w:val="single" w:sz="4" w:space="0" w:color="auto"/>
@@ -3296,7 +3527,7 @@
       <w:tr>
         <w:tc>
           <w:tcPr>
-            <w:tcW w:w="1271" w:type="dxa"/>
+            <w:tcW w:w="1270" w:type="dxa"/>
           </w:tcPr>
           <w:p>
             <w:pPr>
@@ -3331,11 +3562,35 @@
                 <w:lang w:val="en-US"/>
               </w:rPr>
             </w:pPr>
-            <w:r>
-              <w:rPr>
-                <w:lang w:val="en-US"/>
-              </w:rPr>
-              <w:t>app.use(express.json())</w:t>
+            <w:proofErr w:type="spellStart"/>
+            <w:r>
+              <w:rPr>
+                <w:lang w:val="en-US"/>
+              </w:rPr>
+              <w:t>app.use</w:t>
+            </w:r>
+            <w:proofErr w:type="spellEnd"/>
+            <w:r>
+              <w:rPr>
+                <w:lang w:val="en-US"/>
+              </w:rPr>
+              <w:t>(</w:t>
+            </w:r>
+            <w:proofErr w:type="spellStart"/>
+            <w:proofErr w:type="gramStart"/>
+            <w:r>
+              <w:rPr>
+                <w:lang w:val="en-US"/>
+              </w:rPr>
+              <w:t>express.json</w:t>
+            </w:r>
+            <w:proofErr w:type="spellEnd"/>
+            <w:proofErr w:type="gramEnd"/>
+            <w:r>
+              <w:rPr>
+                <w:lang w:val="en-US"/>
+              </w:rPr>
+              <w:t>())</w:t>
             </w:r>
           </w:p>
         </w:tc>
@@ -3365,7 +3620,7 @@
         </w:tc>
         <w:tc>
           <w:tcPr>
-            <w:tcW w:w="4507" w:type="dxa"/>
+            <w:tcW w:w="4508" w:type="dxa"/>
           </w:tcPr>
           <w:p>
             <w:pPr>
@@ -3423,7 +3678,7 @@
         </w:trPr>
         <w:tc>
           <w:tcPr>
-            <w:tcW w:w="1271" w:type="dxa"/>
+            <w:tcW w:w="1270" w:type="dxa"/>
             <w:vMerge w:val="restart"/>
           </w:tcPr>
           <w:p>
@@ -3513,7 +3768,7 @@
         </w:tc>
         <w:tc>
           <w:tcPr>
-            <w:tcW w:w="4507" w:type="dxa"/>
+            <w:tcW w:w="4508" w:type="dxa"/>
             <w:vMerge w:val="restart"/>
           </w:tcPr>
           <w:p>
@@ -3572,7 +3827,7 @@
         </w:trPr>
         <w:tc>
           <w:tcPr>
-            <w:tcW w:w="1271" w:type="dxa"/>
+            <w:tcW w:w="1270" w:type="dxa"/>
             <w:vMerge/>
           </w:tcPr>
           <w:p>
@@ -3611,6 +3866,7 @@
                 <w:lang w:val="en-US"/>
               </w:rPr>
             </w:pPr>
+            <w:proofErr w:type="spellStart"/>
             <w:r>
               <w:rPr>
                 <w:b/>
@@ -3619,13 +3875,36 @@
                 <w:u w:val="single"/>
                 <w:lang w:val="en-US"/>
               </w:rPr>
-              <w:t>npm i cors</w:t>
-            </w:r>
-          </w:p>
-        </w:tc>
-        <w:tc>
-          <w:tcPr>
-            <w:tcW w:w="4507" w:type="dxa"/>
+              <w:t>npm</w:t>
+            </w:r>
+            <w:proofErr w:type="spellEnd"/>
+            <w:r>
+              <w:rPr>
+                <w:b/>
+                <w:bCs/>
+                <w:highlight w:val="yellow"/>
+                <w:u w:val="single"/>
+                <w:lang w:val="en-US"/>
+              </w:rPr>
+              <w:t xml:space="preserve"> i </w:t>
+            </w:r>
+            <w:proofErr w:type="spellStart"/>
+            <w:r>
+              <w:rPr>
+                <w:b/>
+                <w:bCs/>
+                <w:highlight w:val="yellow"/>
+                <w:u w:val="single"/>
+                <w:lang w:val="en-US"/>
+              </w:rPr>
+              <w:t>cors</w:t>
+            </w:r>
+            <w:proofErr w:type="spellEnd"/>
+          </w:p>
+        </w:tc>
+        <w:tc>
+          <w:tcPr>
+            <w:tcW w:w="4508" w:type="dxa"/>
             <w:vMerge/>
           </w:tcPr>
           <w:p>
@@ -3641,7 +3920,7 @@
       <w:tr>
         <w:tc>
           <w:tcPr>
-            <w:tcW w:w="1271" w:type="dxa"/>
+            <w:tcW w:w="1270" w:type="dxa"/>
             <w:tcBorders>
               <w:bottom w:val="single" w:sz="4" w:space="0" w:color="auto"/>
             </w:tcBorders>
@@ -3714,7 +3993,7 @@
         </w:tc>
         <w:tc>
           <w:tcPr>
-            <w:tcW w:w="4507" w:type="dxa"/>
+            <w:tcW w:w="4508" w:type="dxa"/>
             <w:tcBorders>
               <w:bottom w:val="single" w:sz="4" w:space="0" w:color="auto"/>
             </w:tcBorders>
@@ -3779,7 +4058,7 @@
       <w:tr>
         <w:tc>
           <w:tcPr>
-            <w:tcW w:w="1271" w:type="dxa"/>
+            <w:tcW w:w="1270" w:type="dxa"/>
           </w:tcPr>
           <w:p>
             <w:pPr>
@@ -3819,11 +4098,19 @@
                 <w:lang w:val="en-US"/>
               </w:rPr>
             </w:pPr>
-            <w:r>
-              <w:rPr>
-                <w:lang w:val="en-US"/>
-              </w:rPr>
-              <w:t xml:space="preserve">NoSql Database: data managed by collections\documents </w:t>
+            <w:proofErr w:type="spellStart"/>
+            <w:r>
+              <w:rPr>
+                <w:lang w:val="en-US"/>
+              </w:rPr>
+              <w:t>NoSql</w:t>
+            </w:r>
+            <w:proofErr w:type="spellEnd"/>
+            <w:r>
+              <w:rPr>
+                <w:lang w:val="en-US"/>
+              </w:rPr>
+              <w:t xml:space="preserve"> Database: data managed by collections\documents </w:t>
             </w:r>
             <w:r>
               <w:rPr>
@@ -3847,7 +4134,7 @@
         </w:tc>
         <w:tc>
           <w:tcPr>
-            <w:tcW w:w="4507" w:type="dxa"/>
+            <w:tcW w:w="4508" w:type="dxa"/>
           </w:tcPr>
           <w:p>
             <w:pPr>
@@ -3862,7 +4149,7 @@
       <w:tr>
         <w:tc>
           <w:tcPr>
-            <w:tcW w:w="1271" w:type="dxa"/>
+            <w:tcW w:w="1270" w:type="dxa"/>
           </w:tcPr>
           <w:p>
             <w:pPr>
@@ -3929,13 +4216,27 @@
               <w:rPr>
                 <w:lang w:val="en-US"/>
               </w:rPr>
-              <w:t>Functions who parse the data to json and send the data to Database</w:t>
-            </w:r>
-          </w:p>
-        </w:tc>
-        <w:tc>
-          <w:tcPr>
-            <w:tcW w:w="4507" w:type="dxa"/>
+              <w:t xml:space="preserve">Functions who parse the data to </w:t>
+            </w:r>
+            <w:proofErr w:type="spellStart"/>
+            <w:r>
+              <w:rPr>
+                <w:lang w:val="en-US"/>
+              </w:rPr>
+              <w:t>json</w:t>
+            </w:r>
+            <w:proofErr w:type="spellEnd"/>
+            <w:r>
+              <w:rPr>
+                <w:lang w:val="en-US"/>
+              </w:rPr>
+              <w:t xml:space="preserve"> and send the data to Database</w:t>
+            </w:r>
+          </w:p>
+        </w:tc>
+        <w:tc>
+          <w:tcPr>
+            <w:tcW w:w="4508" w:type="dxa"/>
           </w:tcPr>
           <w:p>
             <w:pPr>
@@ -3996,12 +4297,21 @@
                 <w:lang w:val="en-US"/>
               </w:rPr>
             </w:pPr>
+            <w:proofErr w:type="spellStart"/>
             <w:r>
               <w:rPr>
                 <w:highlight w:val="yellow"/>
                 <w:lang w:val="en-US"/>
               </w:rPr>
-              <w:t>npm i mongoose</w:t>
+              <w:t>npm</w:t>
+            </w:r>
+            <w:proofErr w:type="spellEnd"/>
+            <w:r>
+              <w:rPr>
+                <w:highlight w:val="yellow"/>
+                <w:lang w:val="en-US"/>
+              </w:rPr>
+              <w:t xml:space="preserve"> i mongoose</w:t>
             </w:r>
           </w:p>
         </w:tc>
@@ -4012,7 +4322,7 @@
         </w:trPr>
         <w:tc>
           <w:tcPr>
-            <w:tcW w:w="1271" w:type="dxa"/>
+            <w:tcW w:w="1270" w:type="dxa"/>
             <w:vMerge w:val="restart"/>
           </w:tcPr>
           <w:p>
@@ -4052,7 +4362,7 @@
         </w:tc>
         <w:tc>
           <w:tcPr>
-            <w:tcW w:w="7060" w:type="dxa"/>
+            <w:tcW w:w="7061" w:type="dxa"/>
             <w:gridSpan w:val="2"/>
           </w:tcPr>
           <w:p>
@@ -4111,7 +4421,7 @@
         </w:trPr>
         <w:tc>
           <w:tcPr>
-            <w:tcW w:w="1271" w:type="dxa"/>
+            <w:tcW w:w="1270" w:type="dxa"/>
             <w:vMerge/>
           </w:tcPr>
           <w:p>
@@ -4158,6 +4468,7 @@
               </w:rPr>
               <w:t xml:space="preserve">Import all packages for work: </w:t>
             </w:r>
+            <w:proofErr w:type="spellStart"/>
             <w:r>
               <w:rPr>
                 <w:i/>
@@ -4167,22 +4478,47 @@
                 <w:szCs w:val="20"/>
                 <w:lang w:val="en-US"/>
               </w:rPr>
-              <w:t>npm I express cors</w:t>
-            </w:r>
-            <w:r>
-              <w:rPr>
+              <w:t>npm</w:t>
+            </w:r>
+            <w:proofErr w:type="spellEnd"/>
+            <w:r>
+              <w:rPr>
+                <w:i/>
+                <w:iCs/>
                 <w:color w:val="C00000"/>
                 <w:sz w:val="20"/>
                 <w:szCs w:val="20"/>
                 <w:lang w:val="en-US"/>
               </w:rPr>
+              <w:t xml:space="preserve"> I express </w:t>
+            </w:r>
+            <w:proofErr w:type="spellStart"/>
+            <w:r>
+              <w:rPr>
+                <w:i/>
+                <w:iCs/>
+                <w:color w:val="C00000"/>
+                <w:sz w:val="20"/>
+                <w:szCs w:val="20"/>
+                <w:lang w:val="en-US"/>
+              </w:rPr>
+              <w:t>cors</w:t>
+            </w:r>
+            <w:proofErr w:type="spellEnd"/>
+            <w:r>
+              <w:rPr>
+                <w:color w:val="C00000"/>
+                <w:sz w:val="20"/>
+                <w:szCs w:val="20"/>
+                <w:lang w:val="en-US"/>
+              </w:rPr>
               <w:t xml:space="preserve"> mongoose</w:t>
             </w:r>
           </w:p>
         </w:tc>
         <w:tc>
           <w:tcPr>
-            <w:tcW w:w="4507" w:type="dxa"/>
+            <w:tcW w:w="4508" w:type="dxa"/>
           </w:tcPr>
           <w:p>
             <w:pPr>
@@ -4240,7 +4576,7 @@
         </w:trPr>
         <w:tc>
           <w:tcPr>
-            <w:tcW w:w="1271" w:type="dxa"/>
+            <w:tcW w:w="1270" w:type="dxa"/>
             <w:vMerge/>
           </w:tcPr>
           <w:p>
@@ -4292,7 +4628,7 @@
         </w:tc>
         <w:tc>
           <w:tcPr>
-            <w:tcW w:w="4507" w:type="dxa"/>
+            <w:tcW w:w="4508" w:type="dxa"/>
           </w:tcPr>
           <w:p>
             <w:pPr>
@@ -4350,7 +4686,7 @@
         </w:trPr>
         <w:tc>
           <w:tcPr>
-            <w:tcW w:w="1271" w:type="dxa"/>
+            <w:tcW w:w="1270" w:type="dxa"/>
             <w:vMerge/>
           </w:tcPr>
           <w:p>
@@ -4413,8 +4749,23 @@
               <w:rPr>
                 <w:lang w:val="en-US"/>
               </w:rPr>
-              <w:t xml:space="preserve">Create a db connection file into </w:t>
-            </w:r>
+              <w:t xml:space="preserve">Create a </w:t>
+            </w:r>
+            <w:proofErr w:type="spellStart"/>
+            <w:r>
+              <w:rPr>
+                <w:lang w:val="en-US"/>
+              </w:rPr>
+              <w:t>db</w:t>
+            </w:r>
+            <w:proofErr w:type="spellEnd"/>
+            <w:r>
+              <w:rPr>
+                <w:lang w:val="en-US"/>
+              </w:rPr>
+              <w:t xml:space="preserve"> connection file into </w:t>
+            </w:r>
+            <w:proofErr w:type="spellStart"/>
             <w:r>
               <w:rPr>
                 <w:i/>
@@ -4423,6 +4774,7 @@
               </w:rPr>
               <w:t>comfigs</w:t>
             </w:r>
+            <w:proofErr w:type="spellEnd"/>
             <w:r>
               <w:rPr>
                 <w:lang w:val="en-US"/>
@@ -4433,7 +4785,7 @@
         </w:tc>
         <w:tc>
           <w:tcPr>
-            <w:tcW w:w="4507" w:type="dxa"/>
+            <w:tcW w:w="4508" w:type="dxa"/>
           </w:tcPr>
           <w:p>
             <w:pPr>
@@ -4539,7 +4891,7 @@
         </w:trPr>
         <w:tc>
           <w:tcPr>
-            <w:tcW w:w="1271" w:type="dxa"/>
+            <w:tcW w:w="1270" w:type="dxa"/>
             <w:vMerge/>
           </w:tcPr>
           <w:p>
@@ -4584,7 +4936,35 @@
               <w:rPr>
                 <w:lang w:val="en-US"/>
               </w:rPr>
-              <w:t>Create a models\schemes into models folder (convention)</w:t>
+              <w:t xml:space="preserve">Create </w:t>
+            </w:r>
+            <w:proofErr w:type="gramStart"/>
+            <w:r>
+              <w:rPr>
+                <w:lang w:val="en-US"/>
+              </w:rPr>
+              <w:t>a models</w:t>
+            </w:r>
+            <w:proofErr w:type="gramEnd"/>
+            <w:r>
+              <w:rPr>
+                <w:lang w:val="en-US"/>
+              </w:rPr>
+              <w:t xml:space="preserve">\schemes into </w:t>
+            </w:r>
+            <w:proofErr w:type="gramStart"/>
+            <w:r>
+              <w:rPr>
+                <w:lang w:val="en-US"/>
+              </w:rPr>
+              <w:t>models</w:t>
+            </w:r>
+            <w:proofErr w:type="gramEnd"/>
+            <w:r>
+              <w:rPr>
+                <w:lang w:val="en-US"/>
+              </w:rPr>
+              <w:t xml:space="preserve"> folder (convention)</w:t>
             </w:r>
           </w:p>
           <w:p>
@@ -4608,7 +4988,7 @@
         </w:tc>
         <w:tc>
           <w:tcPr>
-            <w:tcW w:w="4507" w:type="dxa"/>
+            <w:tcW w:w="4508" w:type="dxa"/>
           </w:tcPr>
           <w:p>
             <w:pPr>
@@ -4714,7 +5094,7 @@
         </w:trPr>
         <w:tc>
           <w:tcPr>
-            <w:tcW w:w="1271" w:type="dxa"/>
+            <w:tcW w:w="1270" w:type="dxa"/>
             <w:vMerge/>
           </w:tcPr>
           <w:p>
@@ -4765,7 +5145,7 @@
         </w:tc>
         <w:tc>
           <w:tcPr>
-            <w:tcW w:w="4507" w:type="dxa"/>
+            <w:tcW w:w="4508" w:type="dxa"/>
           </w:tcPr>
           <w:p>
             <w:pPr>
@@ -4831,7 +5211,7 @@
         </w:trPr>
         <w:tc>
           <w:tcPr>
-            <w:tcW w:w="1271" w:type="dxa"/>
+            <w:tcW w:w="1270" w:type="dxa"/>
             <w:vMerge/>
           </w:tcPr>
           <w:p>
@@ -4898,7 +5278,25 @@
                 <w:bCs/>
                 <w:lang w:val="en-US"/>
               </w:rPr>
-              <w:t xml:space="preserve">Import the ‘express’ package to routers module for using a </w:t>
+              <w:t>Import the ‘</w:t>
+            </w:r>
+            <w:proofErr w:type="spellStart"/>
+            <w:r>
+              <w:rPr>
+                <w:b/>
+                <w:bCs/>
+                <w:lang w:val="en-US"/>
+              </w:rPr>
+              <w:t>express’</w:t>
+            </w:r>
+            <w:proofErr w:type="spellEnd"/>
+            <w:r>
+              <w:rPr>
+                <w:b/>
+                <w:bCs/>
+                <w:lang w:val="en-US"/>
+              </w:rPr>
+              <w:t xml:space="preserve"> package to routers module for using a </w:t>
             </w:r>
             <w:r>
               <w:rPr>
@@ -4936,7 +5334,7 @@
         </w:tc>
         <w:tc>
           <w:tcPr>
-            <w:tcW w:w="4507" w:type="dxa"/>
+            <w:tcW w:w="4508" w:type="dxa"/>
           </w:tcPr>
           <w:p>
             <w:pPr>
@@ -4994,7 +5392,7 @@
         </w:trPr>
         <w:tc>
           <w:tcPr>
-            <w:tcW w:w="1271" w:type="dxa"/>
+            <w:tcW w:w="1270" w:type="dxa"/>
             <w:vMerge w:val="restart"/>
           </w:tcPr>
           <w:p>
@@ -5046,7 +5444,7 @@
         </w:tc>
         <w:tc>
           <w:tcPr>
-            <w:tcW w:w="4507" w:type="dxa"/>
+            <w:tcW w:w="4508" w:type="dxa"/>
           </w:tcPr>
           <w:p>
             <w:pPr>
@@ -5064,7 +5462,7 @@
         </w:trPr>
         <w:tc>
           <w:tcPr>
-            <w:tcW w:w="1271" w:type="dxa"/>
+            <w:tcW w:w="1270" w:type="dxa"/>
             <w:vMerge/>
           </w:tcPr>
           <w:p>
@@ -5090,6 +5488,8 @@
               </w:numPr>
               <w:spacing w:after="160"/>
             </w:pPr>
+            <w:proofErr w:type="spellStart"/>
+            <w:proofErr w:type="gramStart"/>
             <w:r>
               <w:t>mongoose.</w:t>
             </w:r>
@@ -5099,6 +5499,8 @@
               </w:rPr>
               <w:t>Schema</w:t>
             </w:r>
+            <w:proofErr w:type="spellEnd"/>
+            <w:proofErr w:type="gramEnd"/>
           </w:p>
         </w:tc>
         <w:tc>
@@ -5115,13 +5517,41 @@
               <w:rPr>
                 <w:lang w:val="en-US"/>
               </w:rPr>
-              <w:t>For create a model \ schema of entity taked from mongodb.</w:t>
-            </w:r>
-          </w:p>
-        </w:tc>
-        <w:tc>
-          <w:tcPr>
-            <w:tcW w:w="4507" w:type="dxa"/>
+              <w:t xml:space="preserve">For create a model \ schema of entity </w:t>
+            </w:r>
+            <w:proofErr w:type="spellStart"/>
+            <w:r>
+              <w:rPr>
+                <w:lang w:val="en-US"/>
+              </w:rPr>
+              <w:t>taked</w:t>
+            </w:r>
+            <w:proofErr w:type="spellEnd"/>
+            <w:r>
+              <w:rPr>
+                <w:lang w:val="en-US"/>
+              </w:rPr>
+              <w:t xml:space="preserve"> from </w:t>
+            </w:r>
+            <w:proofErr w:type="spellStart"/>
+            <w:r>
+              <w:rPr>
+                <w:lang w:val="en-US"/>
+              </w:rPr>
+              <w:t>mongodb</w:t>
+            </w:r>
+            <w:proofErr w:type="spellEnd"/>
+            <w:r>
+              <w:rPr>
+                <w:lang w:val="en-US"/>
+              </w:rPr>
+              <w:t>.</w:t>
+            </w:r>
+          </w:p>
+        </w:tc>
+        <w:tc>
+          <w:tcPr>
+            <w:tcW w:w="4508" w:type="dxa"/>
           </w:tcPr>
           <w:p>
             <w:pPr>
@@ -5179,7 +5609,7 @@
         </w:trPr>
         <w:tc>
           <w:tcPr>
-            <w:tcW w:w="1271" w:type="dxa"/>
+            <w:tcW w:w="1270" w:type="dxa"/>
             <w:vMerge/>
           </w:tcPr>
           <w:p>
@@ -5204,6 +5634,7 @@
                 <w:numId w:val="7"/>
               </w:numPr>
             </w:pPr>
+            <w:proofErr w:type="gramStart"/>
             <w:r>
               <w:t>mongoose.</w:t>
             </w:r>
@@ -5214,6 +5645,7 @@
               </w:rPr>
               <w:t>find</w:t>
             </w:r>
+            <w:proofErr w:type="gramEnd"/>
           </w:p>
         </w:tc>
         <w:tc>
@@ -5227,17 +5659,25 @@
                 <w:lang w:val="en-US"/>
               </w:rPr>
             </w:pPr>
-            <w:r>
-              <w:rPr>
-                <w:lang w:val="en-US"/>
-              </w:rPr>
-              <w:t>For get all or specific entity\document from MongoDB</w:t>
-            </w:r>
-          </w:p>
-        </w:tc>
-        <w:tc>
-          <w:tcPr>
-            <w:tcW w:w="4507" w:type="dxa"/>
+            <w:proofErr w:type="spellStart"/>
+            <w:r>
+              <w:rPr>
+                <w:lang w:val="en-US"/>
+              </w:rPr>
+              <w:t>For get</w:t>
+            </w:r>
+            <w:proofErr w:type="spellEnd"/>
+            <w:r>
+              <w:rPr>
+                <w:lang w:val="en-US"/>
+              </w:rPr>
+              <w:t xml:space="preserve"> all or specific entity\document from MongoDB</w:t>
+            </w:r>
+          </w:p>
+        </w:tc>
+        <w:tc>
+          <w:tcPr>
+            <w:tcW w:w="4508" w:type="dxa"/>
           </w:tcPr>
           <w:p>
             <w:pPr>
@@ -5295,7 +5735,7 @@
         </w:trPr>
         <w:tc>
           <w:tcPr>
-            <w:tcW w:w="1271" w:type="dxa"/>
+            <w:tcW w:w="1270" w:type="dxa"/>
             <w:vMerge/>
           </w:tcPr>
           <w:p>
@@ -5320,9 +5760,11 @@
                 <w:numId w:val="7"/>
               </w:numPr>
             </w:pPr>
+            <w:proofErr w:type="gramStart"/>
             <w:r>
               <w:t>mongoose.</w:t>
             </w:r>
+            <w:proofErr w:type="spellStart"/>
             <w:r>
               <w:rPr>
                 <w:highlight w:val="yellow"/>
@@ -5330,6 +5772,8 @@
               </w:rPr>
               <w:t>findById</w:t>
             </w:r>
+            <w:proofErr w:type="spellEnd"/>
+            <w:proofErr w:type="gramEnd"/>
           </w:p>
         </w:tc>
         <w:tc>
@@ -5343,12 +5787,21 @@
                 <w:lang w:val="en-US"/>
               </w:rPr>
             </w:pPr>
-            <w:r>
-              <w:rPr>
-                <w:lang w:val="en-US"/>
-              </w:rPr>
-              <w:t xml:space="preserve">For get specific document from </w:t>
-            </w:r>
+            <w:proofErr w:type="spellStart"/>
+            <w:r>
+              <w:rPr>
+                <w:lang w:val="en-US"/>
+              </w:rPr>
+              <w:t>For get</w:t>
+            </w:r>
+            <w:proofErr w:type="spellEnd"/>
+            <w:r>
+              <w:rPr>
+                <w:lang w:val="en-US"/>
+              </w:rPr>
+              <w:t xml:space="preserve"> specific document from </w:t>
+            </w:r>
+            <w:proofErr w:type="spellStart"/>
             <w:r>
               <w:rPr>
                 <w:b/>
@@ -5357,6 +5810,7 @@
               </w:rPr>
               <w:t>db</w:t>
             </w:r>
+            <w:proofErr w:type="spellEnd"/>
             <w:r>
               <w:rPr>
                 <w:lang w:val="en-US"/>
@@ -5367,7 +5821,7 @@
         </w:tc>
         <w:tc>
           <w:tcPr>
-            <w:tcW w:w="4507" w:type="dxa"/>
+            <w:tcW w:w="4508" w:type="dxa"/>
           </w:tcPr>
           <w:p>
             <w:pPr>
@@ -5425,7 +5879,7 @@
         </w:trPr>
         <w:tc>
           <w:tcPr>
-            <w:tcW w:w="1271" w:type="dxa"/>
+            <w:tcW w:w="1270" w:type="dxa"/>
             <w:vMerge/>
           </w:tcPr>
           <w:p>
@@ -5450,6 +5904,8 @@
                 <w:numId w:val="7"/>
               </w:numPr>
             </w:pPr>
+            <w:proofErr w:type="spellStart"/>
+            <w:proofErr w:type="gramStart"/>
             <w:r>
               <w:t>mongoose</w:t>
             </w:r>
@@ -5462,6 +5918,8 @@
               </w:rPr>
               <w:t>create</w:t>
             </w:r>
+            <w:proofErr w:type="spellEnd"/>
+            <w:proofErr w:type="gramEnd"/>
           </w:p>
         </w:tc>
         <w:tc>
@@ -5479,13 +5937,27 @@
               <w:rPr>
                 <w:lang w:val="en-US"/>
               </w:rPr>
-              <w:t>For create an new doc</w:t>
-            </w:r>
-          </w:p>
-        </w:tc>
-        <w:tc>
-          <w:tcPr>
-            <w:tcW w:w="4507" w:type="dxa"/>
+              <w:t xml:space="preserve">For create </w:t>
+            </w:r>
+            <w:proofErr w:type="gramStart"/>
+            <w:r>
+              <w:rPr>
+                <w:lang w:val="en-US"/>
+              </w:rPr>
+              <w:t>an</w:t>
+            </w:r>
+            <w:proofErr w:type="gramEnd"/>
+            <w:r>
+              <w:rPr>
+                <w:lang w:val="en-US"/>
+              </w:rPr>
+              <w:t xml:space="preserve"> new doc</w:t>
+            </w:r>
+          </w:p>
+        </w:tc>
+        <w:tc>
+          <w:tcPr>
+            <w:tcW w:w="4508" w:type="dxa"/>
           </w:tcPr>
           <w:p>
             <w:pPr>
@@ -5543,7 +6015,7 @@
         </w:trPr>
         <w:tc>
           <w:tcPr>
-            <w:tcW w:w="1271" w:type="dxa"/>
+            <w:tcW w:w="1270" w:type="dxa"/>
             <w:vMerge/>
           </w:tcPr>
           <w:p>
@@ -5568,6 +6040,8 @@
                 <w:numId w:val="7"/>
               </w:numPr>
             </w:pPr>
+            <w:proofErr w:type="spellStart"/>
+            <w:proofErr w:type="gramStart"/>
             <w:r>
               <w:t>mongoose</w:t>
             </w:r>
@@ -5580,6 +6054,8 @@
               </w:rPr>
               <w:t>findByIdAndUpdate</w:t>
             </w:r>
+            <w:proofErr w:type="spellEnd"/>
+            <w:proofErr w:type="gramEnd"/>
           </w:p>
         </w:tc>
         <w:tc>
@@ -5603,7 +6079,7 @@
         </w:tc>
         <w:tc>
           <w:tcPr>
-            <w:tcW w:w="4507" w:type="dxa"/>
+            <w:tcW w:w="4508" w:type="dxa"/>
           </w:tcPr>
           <w:p>
             <w:pPr>
@@ -5661,7 +6137,7 @@
         </w:trPr>
         <w:tc>
           <w:tcPr>
-            <w:tcW w:w="1271" w:type="dxa"/>
+            <w:tcW w:w="1270" w:type="dxa"/>
             <w:vMerge/>
           </w:tcPr>
           <w:p>
@@ -5686,6 +6162,8 @@
                 <w:numId w:val="7"/>
               </w:numPr>
             </w:pPr>
+            <w:proofErr w:type="spellStart"/>
+            <w:proofErr w:type="gramStart"/>
             <w:r>
               <w:t>mongoose</w:t>
             </w:r>
@@ -5698,6 +6176,8 @@
               </w:rPr>
               <w:t>findByIdAndDelete</w:t>
             </w:r>
+            <w:proofErr w:type="spellEnd"/>
+            <w:proofErr w:type="gramEnd"/>
           </w:p>
         </w:tc>
         <w:tc>
@@ -5715,7 +6195,7 @@
         </w:tc>
         <w:tc>
           <w:tcPr>
-            <w:tcW w:w="4507" w:type="dxa"/>
+            <w:tcW w:w="4508" w:type="dxa"/>
           </w:tcPr>
           <w:p>
             <w:pPr>
@@ -5909,7 +6389,7 @@
       <w:tr>
         <w:tc>
           <w:tcPr>
-            <w:tcW w:w="1271" w:type="dxa"/>
+            <w:tcW w:w="1270" w:type="dxa"/>
           </w:tcPr>
           <w:p>
             <w:pPr>
@@ -5947,7 +6427,7 @@
         </w:tc>
         <w:tc>
           <w:tcPr>
-            <w:tcW w:w="4507" w:type="dxa"/>
+            <w:tcW w:w="4508" w:type="dxa"/>
           </w:tcPr>
           <w:p>
             <w:pPr>
@@ -5962,7 +6442,7 @@
       <w:tr>
         <w:tc>
           <w:tcPr>
-            <w:tcW w:w="1271" w:type="dxa"/>
+            <w:tcW w:w="1270" w:type="dxa"/>
             <w:tcBorders>
               <w:bottom w:val="single" w:sz="4" w:space="0" w:color="auto"/>
             </w:tcBorders>
@@ -6035,7 +6515,7 @@
         </w:tc>
         <w:tc>
           <w:tcPr>
-            <w:tcW w:w="4507" w:type="dxa"/>
+            <w:tcW w:w="4508" w:type="dxa"/>
             <w:tcBorders>
               <w:bottom w:val="single" w:sz="4" w:space="0" w:color="auto"/>
             </w:tcBorders>
@@ -6100,7 +6580,7 @@
       <w:tr>
         <w:tc>
           <w:tcPr>
-            <w:tcW w:w="1271" w:type="dxa"/>
+            <w:tcW w:w="1270" w:type="dxa"/>
           </w:tcPr>
           <w:p>
             <w:pPr>
@@ -6138,7 +6618,7 @@
         </w:tc>
         <w:tc>
           <w:tcPr>
-            <w:tcW w:w="7060" w:type="dxa"/>
+            <w:tcW w:w="7061" w:type="dxa"/>
             <w:gridSpan w:val="2"/>
           </w:tcPr>
           <w:p>
@@ -6197,7 +6677,7 @@
         </w:trPr>
         <w:tc>
           <w:tcPr>
-            <w:tcW w:w="1271" w:type="dxa"/>
+            <w:tcW w:w="1270" w:type="dxa"/>
             <w:vMerge w:val="restart"/>
           </w:tcPr>
           <w:p>
@@ -6278,7 +6758,7 @@
         </w:tc>
         <w:tc>
           <w:tcPr>
-            <w:tcW w:w="4507" w:type="dxa"/>
+            <w:tcW w:w="4508" w:type="dxa"/>
           </w:tcPr>
           <w:p>
             <w:pPr>
@@ -6295,35 +6775,119 @@
                 <w:iCs/>
                 <w:lang w:val="en-US"/>
               </w:rPr>
-              <w:t>nap init -y</w:t>
-            </w:r>
-          </w:p>
-          <w:p>
-            <w:pPr>
-              <w:jc w:val="center"/>
+              <w:t xml:space="preserve">nap </w:t>
+            </w:r>
+            <w:proofErr w:type="spellStart"/>
+            <w:r>
               <w:rPr>
                 <w:i/>
                 <w:iCs/>
                 <w:lang w:val="en-US"/>
               </w:rPr>
-            </w:pPr>
-          </w:p>
-          <w:p>
-            <w:pPr>
-              <w:jc w:val="center"/>
+              <w:t>init</w:t>
+            </w:r>
+            <w:proofErr w:type="spellEnd"/>
+            <w:r>
               <w:rPr>
                 <w:i/>
                 <w:iCs/>
                 <w:lang w:val="en-US"/>
               </w:rPr>
-            </w:pPr>
-            <w:r>
+              <w:t xml:space="preserve"> -y</w:t>
+            </w:r>
+          </w:p>
+          <w:p>
+            <w:pPr>
+              <w:jc w:val="center"/>
               <w:rPr>
                 <w:i/>
                 <w:iCs/>
                 <w:lang w:val="en-US"/>
               </w:rPr>
-              <w:t>npm I express cors jsonfile axios mongoose</w:t>
+            </w:pPr>
+          </w:p>
+          <w:p>
+            <w:pPr>
+              <w:jc w:val="center"/>
+              <w:rPr>
+                <w:i/>
+                <w:iCs/>
+                <w:lang w:val="en-US"/>
+              </w:rPr>
+            </w:pPr>
+            <w:proofErr w:type="spellStart"/>
+            <w:proofErr w:type="gramStart"/>
+            <w:r>
+              <w:rPr>
+                <w:i/>
+                <w:iCs/>
+                <w:lang w:val="en-US"/>
+              </w:rPr>
+              <w:t>npm</w:t>
+            </w:r>
+            <w:proofErr w:type="spellEnd"/>
+            <w:proofErr w:type="gramEnd"/>
+            <w:r>
+              <w:rPr>
+                <w:i/>
+                <w:iCs/>
+                <w:lang w:val="en-US"/>
+              </w:rPr>
+              <w:t xml:space="preserve"> I express </w:t>
+            </w:r>
+            <w:proofErr w:type="spellStart"/>
+            <w:r>
+              <w:rPr>
+                <w:i/>
+                <w:iCs/>
+                <w:lang w:val="en-US"/>
+              </w:rPr>
+              <w:t>cors</w:t>
+            </w:r>
+            <w:proofErr w:type="spellEnd"/>
+            <w:r>
+              <w:rPr>
+                <w:i/>
+                <w:iCs/>
+                <w:lang w:val="en-US"/>
+              </w:rPr>
+              <w:t xml:space="preserve"> </w:t>
+            </w:r>
+            <w:proofErr w:type="spellStart"/>
+            <w:r>
+              <w:rPr>
+                <w:i/>
+                <w:iCs/>
+                <w:lang w:val="en-US"/>
+              </w:rPr>
+              <w:t>jsonfile</w:t>
+            </w:r>
+            <w:proofErr w:type="spellEnd"/>
+            <w:r>
+              <w:rPr>
+                <w:i/>
+                <w:iCs/>
+                <w:lang w:val="en-US"/>
+              </w:rPr>
+              <w:t xml:space="preserve"> </w:t>
+            </w:r>
+            <w:proofErr w:type="spellStart"/>
+            <w:r>
+              <w:rPr>
+                <w:i/>
+                <w:iCs/>
+                <w:lang w:val="en-US"/>
+              </w:rPr>
+              <w:t>axios</w:t>
+            </w:r>
+            <w:proofErr w:type="spellEnd"/>
+            <w:r>
+              <w:rPr>
+                <w:i/>
+                <w:iCs/>
+                <w:lang w:val="en-US"/>
+              </w:rPr>
+              <w:t xml:space="preserve"> mongoose</w:t>
             </w:r>
           </w:p>
         </w:tc>
@@ -6334,7 +6898,7 @@
         </w:trPr>
         <w:tc>
           <w:tcPr>
-            <w:tcW w:w="1271" w:type="dxa"/>
+            <w:tcW w:w="1270" w:type="dxa"/>
             <w:vMerge/>
           </w:tcPr>
           <w:p>
@@ -6379,13 +6943,27 @@
               <w:rPr>
                 <w:lang w:val="en-US"/>
               </w:rPr>
-              <w:t>Create db connection file</w:t>
-            </w:r>
-          </w:p>
-        </w:tc>
-        <w:tc>
-          <w:tcPr>
-            <w:tcW w:w="4507" w:type="dxa"/>
+              <w:t xml:space="preserve">Create </w:t>
+            </w:r>
+            <w:proofErr w:type="spellStart"/>
+            <w:r>
+              <w:rPr>
+                <w:lang w:val="en-US"/>
+              </w:rPr>
+              <w:t>db</w:t>
+            </w:r>
+            <w:proofErr w:type="spellEnd"/>
+            <w:r>
+              <w:rPr>
+                <w:lang w:val="en-US"/>
+              </w:rPr>
+              <w:t xml:space="preserve"> connection file</w:t>
+            </w:r>
+          </w:p>
+        </w:tc>
+        <w:tc>
+          <w:tcPr>
+            <w:tcW w:w="4508" w:type="dxa"/>
           </w:tcPr>
           <w:p>
             <w:pPr>
@@ -6443,7 +7021,7 @@
         </w:trPr>
         <w:tc>
           <w:tcPr>
-            <w:tcW w:w="1271" w:type="dxa"/>
+            <w:tcW w:w="1270" w:type="dxa"/>
             <w:vMerge/>
           </w:tcPr>
           <w:p>
@@ -6494,7 +7072,7 @@
         </w:tc>
         <w:tc>
           <w:tcPr>
-            <w:tcW w:w="4507" w:type="dxa"/>
+            <w:tcW w:w="4508" w:type="dxa"/>
           </w:tcPr>
           <w:p>
             <w:pPr>
@@ -6552,7 +7130,7 @@
         </w:trPr>
         <w:tc>
           <w:tcPr>
-            <w:tcW w:w="1271" w:type="dxa"/>
+            <w:tcW w:w="1270" w:type="dxa"/>
             <w:vMerge/>
           </w:tcPr>
           <w:p>
@@ -6603,7 +7181,7 @@
         </w:tc>
         <w:tc>
           <w:tcPr>
-            <w:tcW w:w="4507" w:type="dxa"/>
+            <w:tcW w:w="4508" w:type="dxa"/>
           </w:tcPr>
           <w:p>
             <w:pPr>
@@ -6619,9 +7197,9 @@
                 <w:noProof/>
               </w:rPr>
               <w:drawing>
-                <wp:inline distT="0" distB="0" distL="0" distR="0" wp14:anchorId="4D9CC0FB" wp14:editId="11A429EA">
-                  <wp:extent cx="2724150" cy="2884170"/>
-                  <wp:effectExtent l="0" t="0" r="0" b="0"/>
+                <wp:inline distT="0" distB="0" distL="0" distR="0" wp14:anchorId="4D9CC0FB" wp14:editId="0C85DD08">
+                  <wp:extent cx="2692375" cy="2850528"/>
+                  <wp:effectExtent l="0" t="0" r="0" b="6985"/>
                   <wp:docPr id="562299382" name="Picture 1"/>
                   <wp:cNvGraphicFramePr>
                     <a:graphicFrameLocks xmlns:a="http://schemas.openxmlformats.org/drawingml/2006/main" noChangeAspect="1"/>
@@ -6642,7 +7220,7 @@
                         <pic:spPr>
                           <a:xfrm>
                             <a:off x="0" y="0"/>
-                            <a:ext cx="2724150" cy="2884170"/>
+                            <a:ext cx="2703163" cy="2861950"/>
                           </a:xfrm>
                           <a:prstGeom prst="rect">
                             <a:avLst/>
@@ -6655,6 +7233,54 @@
               </w:drawing>
             </w:r>
           </w:p>
+          <w:p>
+            <w:pPr>
+              <w:jc w:val="center"/>
+              <w:rPr>
+                <w:lang w:val="en-US"/>
+              </w:rPr>
+            </w:pPr>
+            <w:r>
+              <w:rPr>
+                <w:noProof/>
+              </w:rPr>
+              <w:drawing>
+                <wp:inline distT="0" distB="0" distL="0" distR="0" wp14:anchorId="149FD469" wp14:editId="52A4896C">
+                  <wp:extent cx="2725420" cy="1350645"/>
+                  <wp:effectExtent l="0" t="0" r="0" b="1905"/>
+                  <wp:docPr id="1918467157" name="Picture 1"/>
+                  <wp:cNvGraphicFramePr>
+                    <a:graphicFrameLocks xmlns:a="http://schemas.openxmlformats.org/drawingml/2006/main" noChangeAspect="1"/>
+                  </wp:cNvGraphicFramePr>
+                  <a:graphic xmlns:a="http://schemas.openxmlformats.org/drawingml/2006/main">
+                    <a:graphicData uri="http://schemas.openxmlformats.org/drawingml/2006/picture">
+                      <pic:pic xmlns:pic="http://schemas.openxmlformats.org/drawingml/2006/picture">
+                        <pic:nvPicPr>
+                          <pic:cNvPr id="1918467157" name=""/>
+                          <pic:cNvPicPr/>
+                        </pic:nvPicPr>
+                        <pic:blipFill>
+                          <a:blip r:embed="rId45"/>
+                          <a:stretch>
+                            <a:fillRect/>
+                          </a:stretch>
+                        </pic:blipFill>
+                        <pic:spPr>
+                          <a:xfrm>
+                            <a:off x="0" y="0"/>
+                            <a:ext cx="2725420" cy="1350645"/>
+                          </a:xfrm>
+                          <a:prstGeom prst="rect">
+                            <a:avLst/>
+                          </a:prstGeom>
+                        </pic:spPr>
+                      </pic:pic>
+                    </a:graphicData>
+                  </a:graphic>
+                </wp:inline>
+              </w:drawing>
+            </w:r>
+          </w:p>
         </w:tc>
       </w:tr>
       <w:tr>
@@ -6663,7 +7289,7 @@
         </w:trPr>
         <w:tc>
           <w:tcPr>
-            <w:tcW w:w="1271" w:type="dxa"/>
+            <w:tcW w:w="1270" w:type="dxa"/>
             <w:vMerge/>
           </w:tcPr>
           <w:p>
@@ -6714,7 +7340,7 @@
         </w:tc>
         <w:tc>
           <w:tcPr>
-            <w:tcW w:w="4507" w:type="dxa"/>
+            <w:tcW w:w="4508" w:type="dxa"/>
           </w:tcPr>
           <w:p>
             <w:pPr>
@@ -6745,7 +7371,7 @@
                           <pic:cNvPicPr/>
                         </pic:nvPicPr>
                         <pic:blipFill>
-                          <a:blip r:embed="rId45"/>
+                          <a:blip r:embed="rId46"/>
                           <a:stretch>
                             <a:fillRect/>
                           </a:stretch>
@@ -6774,7 +7400,7 @@
         </w:trPr>
         <w:tc>
           <w:tcPr>
-            <w:tcW w:w="1271" w:type="dxa"/>
+            <w:tcW w:w="1270" w:type="dxa"/>
             <w:vMerge/>
           </w:tcPr>
           <w:p>
@@ -6825,7 +7451,7 @@
         </w:tc>
         <w:tc>
           <w:tcPr>
-            <w:tcW w:w="4507" w:type="dxa"/>
+            <w:tcW w:w="4508" w:type="dxa"/>
           </w:tcPr>
           <w:p>
             <w:pPr>
@@ -6854,7 +7480,7 @@
                           <pic:cNvPicPr/>
                         </pic:nvPicPr>
                         <pic:blipFill>
-                          <a:blip r:embed="rId46"/>
+                          <a:blip r:embed="rId47"/>
                           <a:stretch>
                             <a:fillRect/>
                           </a:stretch>
@@ -6883,7 +7509,7 @@
         </w:trPr>
         <w:tc>
           <w:tcPr>
-            <w:tcW w:w="1271" w:type="dxa"/>
+            <w:tcW w:w="1270" w:type="dxa"/>
             <w:vMerge/>
           </w:tcPr>
           <w:p>
@@ -6979,11 +7605,27 @@
                 <w:lang w:val="en-US"/>
               </w:rPr>
             </w:pPr>
-            <w:r>
-              <w:rPr>
-                <w:lang w:val="en-US"/>
-              </w:rPr>
-              <w:t>app.use()</w:t>
+            <w:proofErr w:type="spellStart"/>
+            <w:proofErr w:type="gramStart"/>
+            <w:r>
+              <w:rPr>
+                <w:lang w:val="en-US"/>
+              </w:rPr>
+              <w:t>app.use</w:t>
+            </w:r>
+            <w:proofErr w:type="spellEnd"/>
+            <w:r>
+              <w:rPr>
+                <w:lang w:val="en-US"/>
+              </w:rPr>
+              <w:t>(</w:t>
+            </w:r>
+            <w:proofErr w:type="gramEnd"/>
+            <w:r>
+              <w:rPr>
+                <w:lang w:val="en-US"/>
+              </w:rPr>
+              <w:t>)</w:t>
             </w:r>
           </w:p>
           <w:p>
@@ -6999,18 +7641,58 @@
                 <w:lang w:val="en-US"/>
               </w:rPr>
             </w:pPr>
-            <w:r>
-              <w:rPr>
-                <w:lang w:val="en-US"/>
-              </w:rPr>
-              <w:t xml:space="preserve">app.use(express.json()) – for pars all getted </w:t>
-            </w:r>
+            <w:proofErr w:type="spellStart"/>
+            <w:r>
+              <w:rPr>
+                <w:lang w:val="en-US"/>
+              </w:rPr>
+              <w:t>app.use</w:t>
+            </w:r>
+            <w:proofErr w:type="spellEnd"/>
+            <w:r>
+              <w:rPr>
+                <w:lang w:val="en-US"/>
+              </w:rPr>
+              <w:t>(</w:t>
+            </w:r>
+            <w:proofErr w:type="spellStart"/>
+            <w:proofErr w:type="gramStart"/>
+            <w:r>
+              <w:rPr>
+                <w:lang w:val="en-US"/>
+              </w:rPr>
+              <w:t>express.json</w:t>
+            </w:r>
+            <w:proofErr w:type="spellEnd"/>
+            <w:proofErr w:type="gramEnd"/>
+            <w:r>
+              <w:rPr>
+                <w:lang w:val="en-US"/>
+              </w:rPr>
+              <w:t xml:space="preserve">()) – for pars all </w:t>
+            </w:r>
+            <w:proofErr w:type="spellStart"/>
+            <w:r>
+              <w:rPr>
+                <w:lang w:val="en-US"/>
+              </w:rPr>
+              <w:t>getted</w:t>
+            </w:r>
+            <w:proofErr w:type="spellEnd"/>
+            <w:r>
+              <w:rPr>
+                <w:lang w:val="en-US"/>
+              </w:rPr>
+              <w:t xml:space="preserve"> </w:t>
+            </w:r>
+            <w:proofErr w:type="spellStart"/>
             <w:r>
               <w:rPr>
                 <w:lang w:val="en-US"/>
               </w:rPr>
               <w:t>json</w:t>
             </w:r>
+            <w:proofErr w:type="spellEnd"/>
             <w:r>
               <w:rPr>
                 <w:lang w:val="en-US"/>
@@ -7027,7 +7709,7 @@
         </w:tc>
         <w:tc>
           <w:tcPr>
-            <w:tcW w:w="4507" w:type="dxa"/>
+            <w:tcW w:w="4508" w:type="dxa"/>
           </w:tcPr>
           <w:p>
             <w:pPr>
@@ -7058,7 +7740,7 @@
                           <pic:cNvPicPr/>
                         </pic:nvPicPr>
                         <pic:blipFill>
-                          <a:blip r:embed="rId47"/>
+                          <a:blip r:embed="rId48"/>
                           <a:stretch>
                             <a:fillRect/>
                           </a:stretch>
@@ -7084,15 +7766,21 @@
       <w:tr>
         <w:tc>
           <w:tcPr>
-            <w:tcW w:w="1271" w:type="dxa"/>
-          </w:tcPr>
-          <w:p>
-            <w:pPr>
-              <w:jc w:val="center"/>
-              <w:rPr>
-                <w:lang w:val="en-US"/>
-              </w:rPr>
-            </w:pPr>
+            <w:tcW w:w="1270" w:type="dxa"/>
+          </w:tcPr>
+          <w:p>
+            <w:pPr>
+              <w:jc w:val="center"/>
+              <w:rPr>
+                <w:lang w:val="en-US"/>
+              </w:rPr>
+            </w:pPr>
+            <w:r>
+              <w:rPr>
+                <w:lang w:val="en-US"/>
+              </w:rPr>
+              <w:t>03:37:20</w:t>
+            </w:r>
           </w:p>
         </w:tc>
         <w:tc>
@@ -7106,24 +7794,59 @@
                 <w:lang w:val="en-US"/>
               </w:rPr>
             </w:pPr>
-          </w:p>
-        </w:tc>
-        <w:tc>
-          <w:tcPr>
-            <w:tcW w:w="2552" w:type="dxa"/>
-          </w:tcPr>
-          <w:p>
-            <w:pPr>
-              <w:jc w:val="center"/>
-              <w:rPr>
-                <w:lang w:val="en-US"/>
-              </w:rPr>
-            </w:pPr>
-            <w:r>
-              <w:rPr>
-                <w:lang w:val="en-US"/>
-              </w:rPr>
-              <w:t>01:21:40</w:t>
+            <w:r>
+              <w:rPr>
+                <w:lang w:val="en-US"/>
+              </w:rPr>
+              <w:t>Socket.io</w:t>
+            </w:r>
+          </w:p>
+        </w:tc>
+        <w:tc>
+          <w:tcPr>
+            <w:tcW w:w="2553" w:type="dxa"/>
+          </w:tcPr>
+          <w:p>
+            <w:pPr>
+              <w:rPr>
+                <w:rFonts w:hint="cs"/>
+                <w:rtl/>
+                <w:lang w:val="en-US"/>
+              </w:rPr>
+            </w:pPr>
+            <w:r>
+              <w:rPr>
+                <w:lang w:val="en-US"/>
+              </w:rPr>
+              <w:t xml:space="preserve">Two ways </w:t>
+            </w:r>
+            <w:proofErr w:type="gramStart"/>
+            <w:r>
+              <w:rPr>
+                <w:lang w:val="en-US"/>
+              </w:rPr>
+              <w:t>open</w:t>
+            </w:r>
+            <w:proofErr w:type="gramEnd"/>
+            <w:r>
+              <w:rPr>
+                <w:lang w:val="en-US"/>
+              </w:rPr>
+              <w:t xml:space="preserve"> channel for online\on time update: </w:t>
+            </w:r>
+            <w:proofErr w:type="spellStart"/>
+            <w:r>
+              <w:rPr>
+                <w:lang w:val="en-US"/>
+              </w:rPr>
+              <w:t>Whatsapp</w:t>
+            </w:r>
+            <w:proofErr w:type="spellEnd"/>
+            <w:r>
+              <w:rPr>
+                <w:lang w:val="en-US"/>
+              </w:rPr>
+              <w:t xml:space="preserve"> Messager</w:t>
             </w:r>
           </w:p>
         </w:tc>
@@ -7144,7 +7867,137 @@
       <w:tr>
         <w:tc>
           <w:tcPr>
-            <w:tcW w:w="1271" w:type="dxa"/>
+            <w:tcW w:w="10457" w:type="dxa"/>
+            <w:gridSpan w:val="5"/>
+          </w:tcPr>
+          <w:p>
+            <w:pPr>
+              <w:jc w:val="center"/>
+              <w:rPr>
+                <w:lang w:val="en-US"/>
+              </w:rPr>
+            </w:pPr>
+            <w:r>
+              <w:rPr>
+                <w:lang w:val="en-US"/>
+              </w:rPr>
+              <w:t>Installation:</w:t>
+            </w:r>
+          </w:p>
+          <w:p>
+            <w:pPr>
+              <w:jc w:val="center"/>
+              <w:rPr>
+                <w:i/>
+                <w:iCs/>
+                <w:lang w:val="en-US"/>
+              </w:rPr>
+            </w:pPr>
+            <w:proofErr w:type="spellStart"/>
+            <w:r>
+              <w:rPr>
+                <w:i/>
+                <w:iCs/>
+                <w:highlight w:val="yellow"/>
+                <w:lang w:val="en-US"/>
+              </w:rPr>
+              <w:t>npm</w:t>
+            </w:r>
+            <w:proofErr w:type="spellEnd"/>
+            <w:r>
+              <w:rPr>
+                <w:i/>
+                <w:iCs/>
+                <w:highlight w:val="yellow"/>
+                <w:lang w:val="en-US"/>
+              </w:rPr>
+              <w:t xml:space="preserve"> socket.io</w:t>
+            </w:r>
+          </w:p>
+        </w:tc>
+      </w:tr>
+      <w:tr>
+        <w:trPr>
+          <w:trHeight w:val="57"/>
+        </w:trPr>
+        <w:tc>
+          <w:tcPr>
+            <w:tcW w:w="1270" w:type="dxa"/>
+          </w:tcPr>
+          <w:p>
+            <w:pPr>
+              <w:jc w:val="center"/>
+              <w:rPr>
+                <w:lang w:val="en-US"/>
+              </w:rPr>
+            </w:pPr>
+            <w:r>
+              <w:rPr>
+                <w:lang w:val="en-US"/>
+              </w:rPr>
+              <w:t>03:42:50</w:t>
+            </w:r>
+          </w:p>
+        </w:tc>
+        <w:tc>
+          <w:tcPr>
+            <w:tcW w:w="9187" w:type="dxa"/>
+            <w:gridSpan w:val="4"/>
+          </w:tcPr>
+          <w:p>
+            <w:pPr>
+              <w:jc w:val="center"/>
+              <w:rPr>
+                <w:lang w:val="en-US"/>
+              </w:rPr>
+            </w:pPr>
+            <w:r>
+              <w:rPr>
+                <w:noProof/>
+              </w:rPr>
+              <w:drawing>
+                <wp:inline distT="0" distB="0" distL="0" distR="0" wp14:anchorId="2D496D02" wp14:editId="74E7BA2B">
+                  <wp:extent cx="4155508" cy="1214323"/>
+                  <wp:effectExtent l="0" t="0" r="0" b="5080"/>
+                  <wp:docPr id="1738870094" name="Picture 1"/>
+                  <wp:cNvGraphicFramePr>
+                    <a:graphicFrameLocks xmlns:a="http://schemas.openxmlformats.org/drawingml/2006/main" noChangeAspect="1"/>
+                  </wp:cNvGraphicFramePr>
+                  <a:graphic xmlns:a="http://schemas.openxmlformats.org/drawingml/2006/main">
+                    <a:graphicData uri="http://schemas.openxmlformats.org/drawingml/2006/picture">
+                      <pic:pic xmlns:pic="http://schemas.openxmlformats.org/drawingml/2006/picture">
+                        <pic:nvPicPr>
+                          <pic:cNvPr id="1738870094" name=""/>
+                          <pic:cNvPicPr/>
+                        </pic:nvPicPr>
+                        <pic:blipFill>
+                          <a:blip r:embed="rId49"/>
+                          <a:stretch>
+                            <a:fillRect/>
+                          </a:stretch>
+                        </pic:blipFill>
+                        <pic:spPr>
+                          <a:xfrm>
+                            <a:off x="0" y="0"/>
+                            <a:ext cx="4237792" cy="1238368"/>
+                          </a:xfrm>
+                          <a:prstGeom prst="rect">
+                            <a:avLst/>
+                          </a:prstGeom>
+                        </pic:spPr>
+                      </pic:pic>
+                    </a:graphicData>
+                  </a:graphic>
+                </wp:inline>
+              </w:drawing>
+            </w:r>
+          </w:p>
+        </w:tc>
+      </w:tr>
+      <w:tr>
+        <w:tc>
+          <w:tcPr>
+            <w:tcW w:w="1270" w:type="dxa"/>
           </w:tcPr>
           <w:p>
             <w:pPr>
@@ -7182,7 +8035,7 @@
         </w:tc>
         <w:tc>
           <w:tcPr>
-            <w:tcW w:w="4507" w:type="dxa"/>
+            <w:tcW w:w="4508" w:type="dxa"/>
           </w:tcPr>
           <w:p>
             <w:pPr>
@@ -7197,7 +8050,7 @@
       <w:tr>
         <w:tc>
           <w:tcPr>
-            <w:tcW w:w="1271" w:type="dxa"/>
+            <w:tcW w:w="1270" w:type="dxa"/>
           </w:tcPr>
           <w:p>
             <w:pPr>
@@ -7235,7 +8088,7 @@
         </w:tc>
         <w:tc>
           <w:tcPr>
-            <w:tcW w:w="4507" w:type="dxa"/>
+            <w:tcW w:w="4508" w:type="dxa"/>
           </w:tcPr>
           <w:p>
             <w:pPr>
@@ -7250,749 +8103,7 @@
       <w:tr>
         <w:tc>
           <w:tcPr>
-            <w:tcW w:w="1271" w:type="dxa"/>
-          </w:tcPr>
-          <w:p>
-            <w:pPr>
-              <w:jc w:val="center"/>
-              <w:rPr>
-                <w:lang w:val="en-US"/>
-              </w:rPr>
-            </w:pPr>
-          </w:p>
-        </w:tc>
-        <w:tc>
-          <w:tcPr>
-            <w:tcW w:w="2126" w:type="dxa"/>
-            <w:gridSpan w:val="2"/>
-          </w:tcPr>
-          <w:p>
-            <w:pPr>
-              <w:rPr>
-                <w:lang w:val="en-US"/>
-              </w:rPr>
-            </w:pPr>
-          </w:p>
-        </w:tc>
-        <w:tc>
-          <w:tcPr>
-            <w:tcW w:w="2553" w:type="dxa"/>
-          </w:tcPr>
-          <w:p>
-            <w:pPr>
-              <w:rPr>
-                <w:lang w:val="en-US"/>
-              </w:rPr>
-            </w:pPr>
-          </w:p>
-        </w:tc>
-        <w:tc>
-          <w:tcPr>
-            <w:tcW w:w="4507" w:type="dxa"/>
-          </w:tcPr>
-          <w:p>
-            <w:pPr>
-              <w:jc w:val="center"/>
-              <w:rPr>
-                <w:lang w:val="en-US"/>
-              </w:rPr>
-            </w:pPr>
-          </w:p>
-        </w:tc>
-      </w:tr>
-      <w:tr>
-        <w:tc>
-          <w:tcPr>
-            <w:tcW w:w="1271" w:type="dxa"/>
-          </w:tcPr>
-          <w:p>
-            <w:pPr>
-              <w:jc w:val="center"/>
-              <w:rPr>
-                <w:lang w:val="en-US"/>
-              </w:rPr>
-            </w:pPr>
-          </w:p>
-        </w:tc>
-        <w:tc>
-          <w:tcPr>
-            <w:tcW w:w="2126" w:type="dxa"/>
-            <w:gridSpan w:val="2"/>
-          </w:tcPr>
-          <w:p>
-            <w:pPr>
-              <w:rPr>
-                <w:lang w:val="en-US"/>
-              </w:rPr>
-            </w:pPr>
-          </w:p>
-        </w:tc>
-        <w:tc>
-          <w:tcPr>
-            <w:tcW w:w="2553" w:type="dxa"/>
-          </w:tcPr>
-          <w:p>
-            <w:pPr>
-              <w:rPr>
-                <w:lang w:val="en-US"/>
-              </w:rPr>
-            </w:pPr>
-          </w:p>
-        </w:tc>
-        <w:tc>
-          <w:tcPr>
-            <w:tcW w:w="4507" w:type="dxa"/>
-          </w:tcPr>
-          <w:p>
-            <w:pPr>
-              <w:jc w:val="center"/>
-              <w:rPr>
-                <w:lang w:val="en-US"/>
-              </w:rPr>
-            </w:pPr>
-          </w:p>
-        </w:tc>
-      </w:tr>
-      <w:tr>
-        <w:tc>
-          <w:tcPr>
-            <w:tcW w:w="1271" w:type="dxa"/>
-          </w:tcPr>
-          <w:p>
-            <w:pPr>
-              <w:jc w:val="center"/>
-              <w:rPr>
-                <w:lang w:val="en-US"/>
-              </w:rPr>
-            </w:pPr>
-          </w:p>
-        </w:tc>
-        <w:tc>
-          <w:tcPr>
-            <w:tcW w:w="2126" w:type="dxa"/>
-            <w:gridSpan w:val="2"/>
-          </w:tcPr>
-          <w:p>
-            <w:pPr>
-              <w:rPr>
-                <w:lang w:val="en-US"/>
-              </w:rPr>
-            </w:pPr>
-          </w:p>
-        </w:tc>
-        <w:tc>
-          <w:tcPr>
-            <w:tcW w:w="2553" w:type="dxa"/>
-          </w:tcPr>
-          <w:p>
-            <w:pPr>
-              <w:rPr>
-                <w:lang w:val="en-US"/>
-              </w:rPr>
-            </w:pPr>
-          </w:p>
-        </w:tc>
-        <w:tc>
-          <w:tcPr>
-            <w:tcW w:w="4507" w:type="dxa"/>
-          </w:tcPr>
-          <w:p>
-            <w:pPr>
-              <w:jc w:val="center"/>
-              <w:rPr>
-                <w:lang w:val="en-US"/>
-              </w:rPr>
-            </w:pPr>
-          </w:p>
-        </w:tc>
-      </w:tr>
-      <w:tr>
-        <w:tc>
-          <w:tcPr>
-            <w:tcW w:w="1271" w:type="dxa"/>
-          </w:tcPr>
-          <w:p>
-            <w:pPr>
-              <w:jc w:val="center"/>
-              <w:rPr>
-                <w:lang w:val="en-US"/>
-              </w:rPr>
-            </w:pPr>
-          </w:p>
-        </w:tc>
-        <w:tc>
-          <w:tcPr>
-            <w:tcW w:w="2126" w:type="dxa"/>
-            <w:gridSpan w:val="2"/>
-          </w:tcPr>
-          <w:p>
-            <w:pPr>
-              <w:rPr>
-                <w:lang w:val="en-US"/>
-              </w:rPr>
-            </w:pPr>
-          </w:p>
-        </w:tc>
-        <w:tc>
-          <w:tcPr>
-            <w:tcW w:w="2553" w:type="dxa"/>
-          </w:tcPr>
-          <w:p>
-            <w:pPr>
-              <w:rPr>
-                <w:lang w:val="en-US"/>
-              </w:rPr>
-            </w:pPr>
-          </w:p>
-        </w:tc>
-        <w:tc>
-          <w:tcPr>
-            <w:tcW w:w="4507" w:type="dxa"/>
-          </w:tcPr>
-          <w:p>
-            <w:pPr>
-              <w:jc w:val="center"/>
-              <w:rPr>
-                <w:lang w:val="en-US"/>
-              </w:rPr>
-            </w:pPr>
-          </w:p>
-        </w:tc>
-      </w:tr>
-      <w:tr>
-        <w:tc>
-          <w:tcPr>
-            <w:tcW w:w="1271" w:type="dxa"/>
-          </w:tcPr>
-          <w:p>
-            <w:pPr>
-              <w:jc w:val="center"/>
-              <w:rPr>
-                <w:lang w:val="en-US"/>
-              </w:rPr>
-            </w:pPr>
-          </w:p>
-        </w:tc>
-        <w:tc>
-          <w:tcPr>
-            <w:tcW w:w="2126" w:type="dxa"/>
-            <w:gridSpan w:val="2"/>
-          </w:tcPr>
-          <w:p>
-            <w:pPr>
-              <w:rPr>
-                <w:lang w:val="en-US"/>
-              </w:rPr>
-            </w:pPr>
-          </w:p>
-        </w:tc>
-        <w:tc>
-          <w:tcPr>
-            <w:tcW w:w="2553" w:type="dxa"/>
-          </w:tcPr>
-          <w:p>
-            <w:pPr>
-              <w:rPr>
-                <w:lang w:val="en-US"/>
-              </w:rPr>
-            </w:pPr>
-          </w:p>
-        </w:tc>
-        <w:tc>
-          <w:tcPr>
-            <w:tcW w:w="4507" w:type="dxa"/>
-          </w:tcPr>
-          <w:p>
-            <w:pPr>
-              <w:jc w:val="center"/>
-              <w:rPr>
-                <w:lang w:val="en-US"/>
-              </w:rPr>
-            </w:pPr>
-          </w:p>
-        </w:tc>
-      </w:tr>
-      <w:tr>
-        <w:tc>
-          <w:tcPr>
-            <w:tcW w:w="1271" w:type="dxa"/>
-          </w:tcPr>
-          <w:p>
-            <w:pPr>
-              <w:jc w:val="center"/>
-              <w:rPr>
-                <w:lang w:val="en-US"/>
-              </w:rPr>
-            </w:pPr>
-          </w:p>
-        </w:tc>
-        <w:tc>
-          <w:tcPr>
-            <w:tcW w:w="2126" w:type="dxa"/>
-            <w:gridSpan w:val="2"/>
-          </w:tcPr>
-          <w:p>
-            <w:pPr>
-              <w:rPr>
-                <w:lang w:val="en-US"/>
-              </w:rPr>
-            </w:pPr>
-          </w:p>
-        </w:tc>
-        <w:tc>
-          <w:tcPr>
-            <w:tcW w:w="2553" w:type="dxa"/>
-          </w:tcPr>
-          <w:p>
-            <w:pPr>
-              <w:rPr>
-                <w:lang w:val="en-US"/>
-              </w:rPr>
-            </w:pPr>
-          </w:p>
-        </w:tc>
-        <w:tc>
-          <w:tcPr>
-            <w:tcW w:w="4507" w:type="dxa"/>
-          </w:tcPr>
-          <w:p>
-            <w:pPr>
-              <w:jc w:val="center"/>
-              <w:rPr>
-                <w:lang w:val="en-US"/>
-              </w:rPr>
-            </w:pPr>
-          </w:p>
-        </w:tc>
-      </w:tr>
-      <w:tr>
-        <w:tc>
-          <w:tcPr>
-            <w:tcW w:w="1271" w:type="dxa"/>
-          </w:tcPr>
-          <w:p>
-            <w:pPr>
-              <w:jc w:val="center"/>
-              <w:rPr>
-                <w:lang w:val="en-US"/>
-              </w:rPr>
-            </w:pPr>
-          </w:p>
-        </w:tc>
-        <w:tc>
-          <w:tcPr>
-            <w:tcW w:w="2126" w:type="dxa"/>
-            <w:gridSpan w:val="2"/>
-          </w:tcPr>
-          <w:p>
-            <w:pPr>
-              <w:rPr>
-                <w:lang w:val="en-US"/>
-              </w:rPr>
-            </w:pPr>
-          </w:p>
-        </w:tc>
-        <w:tc>
-          <w:tcPr>
-            <w:tcW w:w="2553" w:type="dxa"/>
-          </w:tcPr>
-          <w:p>
-            <w:pPr>
-              <w:rPr>
-                <w:lang w:val="en-US"/>
-              </w:rPr>
-            </w:pPr>
-          </w:p>
-        </w:tc>
-        <w:tc>
-          <w:tcPr>
-            <w:tcW w:w="4507" w:type="dxa"/>
-          </w:tcPr>
-          <w:p>
-            <w:pPr>
-              <w:jc w:val="center"/>
-              <w:rPr>
-                <w:lang w:val="en-US"/>
-              </w:rPr>
-            </w:pPr>
-          </w:p>
-        </w:tc>
-      </w:tr>
-      <w:tr>
-        <w:tc>
-          <w:tcPr>
-            <w:tcW w:w="1271" w:type="dxa"/>
-          </w:tcPr>
-          <w:p>
-            <w:pPr>
-              <w:jc w:val="center"/>
-              <w:rPr>
-                <w:lang w:val="en-US"/>
-              </w:rPr>
-            </w:pPr>
-          </w:p>
-        </w:tc>
-        <w:tc>
-          <w:tcPr>
-            <w:tcW w:w="2126" w:type="dxa"/>
-            <w:gridSpan w:val="2"/>
-          </w:tcPr>
-          <w:p>
-            <w:pPr>
-              <w:rPr>
-                <w:lang w:val="en-US"/>
-              </w:rPr>
-            </w:pPr>
-          </w:p>
-        </w:tc>
-        <w:tc>
-          <w:tcPr>
-            <w:tcW w:w="2553" w:type="dxa"/>
-          </w:tcPr>
-          <w:p>
-            <w:pPr>
-              <w:rPr>
-                <w:lang w:val="en-US"/>
-              </w:rPr>
-            </w:pPr>
-          </w:p>
-        </w:tc>
-        <w:tc>
-          <w:tcPr>
-            <w:tcW w:w="4507" w:type="dxa"/>
-          </w:tcPr>
-          <w:p>
-            <w:pPr>
-              <w:jc w:val="center"/>
-              <w:rPr>
-                <w:lang w:val="en-US"/>
-              </w:rPr>
-            </w:pPr>
-          </w:p>
-        </w:tc>
-      </w:tr>
-      <w:tr>
-        <w:tc>
-          <w:tcPr>
-            <w:tcW w:w="1271" w:type="dxa"/>
-          </w:tcPr>
-          <w:p>
-            <w:pPr>
-              <w:jc w:val="center"/>
-              <w:rPr>
-                <w:lang w:val="en-US"/>
-              </w:rPr>
-            </w:pPr>
-          </w:p>
-        </w:tc>
-        <w:tc>
-          <w:tcPr>
-            <w:tcW w:w="2126" w:type="dxa"/>
-            <w:gridSpan w:val="2"/>
-          </w:tcPr>
-          <w:p>
-            <w:pPr>
-              <w:rPr>
-                <w:lang w:val="en-US"/>
-              </w:rPr>
-            </w:pPr>
-          </w:p>
-        </w:tc>
-        <w:tc>
-          <w:tcPr>
-            <w:tcW w:w="2553" w:type="dxa"/>
-          </w:tcPr>
-          <w:p>
-            <w:pPr>
-              <w:rPr>
-                <w:lang w:val="en-US"/>
-              </w:rPr>
-            </w:pPr>
-          </w:p>
-        </w:tc>
-        <w:tc>
-          <w:tcPr>
-            <w:tcW w:w="4507" w:type="dxa"/>
-          </w:tcPr>
-          <w:p>
-            <w:pPr>
-              <w:jc w:val="center"/>
-              <w:rPr>
-                <w:lang w:val="en-US"/>
-              </w:rPr>
-            </w:pPr>
-          </w:p>
-        </w:tc>
-      </w:tr>
-      <w:tr>
-        <w:tc>
-          <w:tcPr>
-            <w:tcW w:w="1271" w:type="dxa"/>
-          </w:tcPr>
-          <w:p>
-            <w:pPr>
-              <w:jc w:val="center"/>
-              <w:rPr>
-                <w:lang w:val="en-US"/>
-              </w:rPr>
-            </w:pPr>
-          </w:p>
-        </w:tc>
-        <w:tc>
-          <w:tcPr>
-            <w:tcW w:w="2126" w:type="dxa"/>
-            <w:gridSpan w:val="2"/>
-          </w:tcPr>
-          <w:p>
-            <w:pPr>
-              <w:rPr>
-                <w:lang w:val="en-US"/>
-              </w:rPr>
-            </w:pPr>
-          </w:p>
-        </w:tc>
-        <w:tc>
-          <w:tcPr>
-            <w:tcW w:w="2553" w:type="dxa"/>
-          </w:tcPr>
-          <w:p>
-            <w:pPr>
-              <w:rPr>
-                <w:lang w:val="en-US"/>
-              </w:rPr>
-            </w:pPr>
-          </w:p>
-        </w:tc>
-        <w:tc>
-          <w:tcPr>
-            <w:tcW w:w="4507" w:type="dxa"/>
-          </w:tcPr>
-          <w:p>
-            <w:pPr>
-              <w:jc w:val="center"/>
-              <w:rPr>
-                <w:lang w:val="en-US"/>
-              </w:rPr>
-            </w:pPr>
-          </w:p>
-        </w:tc>
-      </w:tr>
-      <w:tr>
-        <w:tc>
-          <w:tcPr>
-            <w:tcW w:w="1271" w:type="dxa"/>
-          </w:tcPr>
-          <w:p>
-            <w:pPr>
-              <w:jc w:val="center"/>
-              <w:rPr>
-                <w:lang w:val="en-US"/>
-              </w:rPr>
-            </w:pPr>
-          </w:p>
-        </w:tc>
-        <w:tc>
-          <w:tcPr>
-            <w:tcW w:w="2126" w:type="dxa"/>
-            <w:gridSpan w:val="2"/>
-          </w:tcPr>
-          <w:p>
-            <w:pPr>
-              <w:rPr>
-                <w:lang w:val="en-US"/>
-              </w:rPr>
-            </w:pPr>
-          </w:p>
-        </w:tc>
-        <w:tc>
-          <w:tcPr>
-            <w:tcW w:w="2553" w:type="dxa"/>
-          </w:tcPr>
-          <w:p>
-            <w:pPr>
-              <w:rPr>
-                <w:lang w:val="en-US"/>
-              </w:rPr>
-            </w:pPr>
-          </w:p>
-        </w:tc>
-        <w:tc>
-          <w:tcPr>
-            <w:tcW w:w="4507" w:type="dxa"/>
-          </w:tcPr>
-          <w:p>
-            <w:pPr>
-              <w:jc w:val="center"/>
-              <w:rPr>
-                <w:lang w:val="en-US"/>
-              </w:rPr>
-            </w:pPr>
-          </w:p>
-        </w:tc>
-      </w:tr>
-      <w:tr>
-        <w:tc>
-          <w:tcPr>
-            <w:tcW w:w="1271" w:type="dxa"/>
-          </w:tcPr>
-          <w:p>
-            <w:pPr>
-              <w:jc w:val="center"/>
-              <w:rPr>
-                <w:lang w:val="en-US"/>
-              </w:rPr>
-            </w:pPr>
-          </w:p>
-        </w:tc>
-        <w:tc>
-          <w:tcPr>
-            <w:tcW w:w="2126" w:type="dxa"/>
-            <w:gridSpan w:val="2"/>
-          </w:tcPr>
-          <w:p>
-            <w:pPr>
-              <w:rPr>
-                <w:lang w:val="en-US"/>
-              </w:rPr>
-            </w:pPr>
-          </w:p>
-        </w:tc>
-        <w:tc>
-          <w:tcPr>
-            <w:tcW w:w="2553" w:type="dxa"/>
-          </w:tcPr>
-          <w:p>
-            <w:pPr>
-              <w:rPr>
-                <w:lang w:val="en-US"/>
-              </w:rPr>
-            </w:pPr>
-          </w:p>
-        </w:tc>
-        <w:tc>
-          <w:tcPr>
-            <w:tcW w:w="4507" w:type="dxa"/>
-          </w:tcPr>
-          <w:p>
-            <w:pPr>
-              <w:jc w:val="center"/>
-              <w:rPr>
-                <w:lang w:val="en-US"/>
-              </w:rPr>
-            </w:pPr>
-          </w:p>
-        </w:tc>
-      </w:tr>
-      <w:tr>
-        <w:tc>
-          <w:tcPr>
-            <w:tcW w:w="1271" w:type="dxa"/>
-          </w:tcPr>
-          <w:p>
-            <w:pPr>
-              <w:jc w:val="center"/>
-              <w:rPr>
-                <w:lang w:val="en-US"/>
-              </w:rPr>
-            </w:pPr>
-          </w:p>
-        </w:tc>
-        <w:tc>
-          <w:tcPr>
-            <w:tcW w:w="2126" w:type="dxa"/>
-            <w:gridSpan w:val="2"/>
-          </w:tcPr>
-          <w:p>
-            <w:pPr>
-              <w:rPr>
-                <w:lang w:val="en-US"/>
-              </w:rPr>
-            </w:pPr>
-          </w:p>
-        </w:tc>
-        <w:tc>
-          <w:tcPr>
-            <w:tcW w:w="2553" w:type="dxa"/>
-          </w:tcPr>
-          <w:p>
-            <w:pPr>
-              <w:rPr>
-                <w:lang w:val="en-US"/>
-              </w:rPr>
-            </w:pPr>
-          </w:p>
-        </w:tc>
-        <w:tc>
-          <w:tcPr>
-            <w:tcW w:w="4507" w:type="dxa"/>
-          </w:tcPr>
-          <w:p>
-            <w:pPr>
-              <w:jc w:val="center"/>
-              <w:rPr>
-                <w:lang w:val="en-US"/>
-              </w:rPr>
-            </w:pPr>
-          </w:p>
-        </w:tc>
-      </w:tr>
-      <w:tr>
-        <w:tc>
-          <w:tcPr>
-            <w:tcW w:w="1271" w:type="dxa"/>
-          </w:tcPr>
-          <w:p>
-            <w:pPr>
-              <w:jc w:val="center"/>
-              <w:rPr>
-                <w:lang w:val="en-US"/>
-              </w:rPr>
-            </w:pPr>
-          </w:p>
-        </w:tc>
-        <w:tc>
-          <w:tcPr>
-            <w:tcW w:w="2126" w:type="dxa"/>
-            <w:gridSpan w:val="2"/>
-          </w:tcPr>
-          <w:p>
-            <w:pPr>
-              <w:rPr>
-                <w:lang w:val="en-US"/>
-              </w:rPr>
-            </w:pPr>
-          </w:p>
-        </w:tc>
-        <w:tc>
-          <w:tcPr>
-            <w:tcW w:w="2553" w:type="dxa"/>
-          </w:tcPr>
-          <w:p>
-            <w:pPr>
-              <w:rPr>
-                <w:lang w:val="en-US"/>
-              </w:rPr>
-            </w:pPr>
-          </w:p>
-        </w:tc>
-        <w:tc>
-          <w:tcPr>
-            <w:tcW w:w="4507" w:type="dxa"/>
-          </w:tcPr>
-          <w:p>
-            <w:pPr>
-              <w:jc w:val="center"/>
-              <w:rPr>
-                <w:lang w:val="en-US"/>
-              </w:rPr>
-            </w:pPr>
-          </w:p>
-        </w:tc>
-      </w:tr>
-      <w:tr>
-        <w:tc>
-          <w:tcPr>
-            <w:tcW w:w="1271" w:type="dxa"/>
+            <w:tcW w:w="1270" w:type="dxa"/>
             <w:tcBorders>
               <w:bottom w:val="single" w:sz="4" w:space="0" w:color="auto"/>
             </w:tcBorders>
@@ -8065,7 +8176,7 @@
         </w:tc>
         <w:tc>
           <w:tcPr>
-            <w:tcW w:w="4507" w:type="dxa"/>
+            <w:tcW w:w="4508" w:type="dxa"/>
             <w:tcBorders>
               <w:bottom w:val="single" w:sz="4" w:space="0" w:color="auto"/>
             </w:tcBorders>
@@ -8130,7 +8241,7 @@
       <w:tr>
         <w:tc>
           <w:tcPr>
-            <w:tcW w:w="1271" w:type="dxa"/>
+            <w:tcW w:w="1270" w:type="dxa"/>
           </w:tcPr>
           <w:p>
             <w:pPr>
@@ -8262,55 +8373,83 @@
                 <w:bCs/>
                 <w:lang w:val="en-US"/>
               </w:rPr>
-              <w:t>Once user is existed into db</w:t>
-            </w:r>
-            <w:r>
-              <w:rPr>
-                <w:lang w:val="en-US"/>
-              </w:rPr>
-              <w:t xml:space="preserve">, </w:t>
-            </w:r>
+              <w:t xml:space="preserve">Once user </w:t>
+            </w:r>
+            <w:proofErr w:type="gramStart"/>
             <w:r>
               <w:rPr>
                 <w:b/>
                 <w:bCs/>
                 <w:lang w:val="en-US"/>
               </w:rPr>
-              <w:t>retrieve just created token</w:t>
-            </w:r>
-            <w:r>
-              <w:rPr>
-                <w:lang w:val="en-US"/>
-              </w:rPr>
-              <w:t xml:space="preserve">, </w:t>
-            </w:r>
+              <w:t>is existed</w:t>
+            </w:r>
+            <w:proofErr w:type="gramEnd"/>
             <w:r>
               <w:rPr>
                 <w:b/>
                 <w:bCs/>
                 <w:lang w:val="en-US"/>
               </w:rPr>
-              <w:t>save on storage</w:t>
-            </w:r>
-            <w:r>
-              <w:rPr>
-                <w:lang w:val="en-US"/>
-              </w:rPr>
-              <w:t xml:space="preserve"> and </w:t>
-            </w:r>
+              <w:t xml:space="preserve"> into </w:t>
+            </w:r>
+            <w:proofErr w:type="spellStart"/>
             <w:r>
               <w:rPr>
                 <w:b/>
                 <w:bCs/>
                 <w:lang w:val="en-US"/>
               </w:rPr>
+              <w:t>db</w:t>
+            </w:r>
+            <w:proofErr w:type="spellEnd"/>
+            <w:r>
+              <w:rPr>
+                <w:lang w:val="en-US"/>
+              </w:rPr>
+              <w:t xml:space="preserve">, </w:t>
+            </w:r>
+            <w:r>
+              <w:rPr>
+                <w:b/>
+                <w:bCs/>
+                <w:lang w:val="en-US"/>
+              </w:rPr>
+              <w:t>retrieve just created token</w:t>
+            </w:r>
+            <w:r>
+              <w:rPr>
+                <w:lang w:val="en-US"/>
+              </w:rPr>
+              <w:t xml:space="preserve">, </w:t>
+            </w:r>
+            <w:r>
+              <w:rPr>
+                <w:b/>
+                <w:bCs/>
+                <w:lang w:val="en-US"/>
+              </w:rPr>
+              <w:t>save on storage</w:t>
+            </w:r>
+            <w:r>
+              <w:rPr>
+                <w:lang w:val="en-US"/>
+              </w:rPr>
+              <w:t xml:space="preserve"> and </w:t>
+            </w:r>
+            <w:r>
+              <w:rPr>
+                <w:b/>
+                <w:bCs/>
+                <w:lang w:val="en-US"/>
+              </w:rPr>
               <w:t>go to the next path</w:t>
             </w:r>
           </w:p>
         </w:tc>
         <w:tc>
           <w:tcPr>
-            <w:tcW w:w="4507" w:type="dxa"/>
+            <w:tcW w:w="4508" w:type="dxa"/>
           </w:tcPr>
           <w:p>
             <w:pPr>
@@ -8353,7 +8492,7 @@
                           <pic:cNvPicPr/>
                         </pic:nvPicPr>
                         <pic:blipFill>
-                          <a:blip r:embed="rId48"/>
+                          <a:blip r:embed="rId50"/>
                           <a:stretch>
                             <a:fillRect/>
                           </a:stretch>
@@ -8438,7 +8577,6 @@
                 <w:u w:val="single"/>
                 <w:lang w:val="en-US"/>
               </w:rPr>
-              <w:lastRenderedPageBreak/>
               <w:t>JSON W</w:t>
             </w:r>
             <w:r>
@@ -8492,13 +8630,33 @@
                 <w:lang w:val="en-US"/>
               </w:rPr>
             </w:pPr>
+            <w:proofErr w:type="spellStart"/>
+            <w:proofErr w:type="gramStart"/>
             <w:r>
               <w:rPr>
                 <w:highlight w:val="yellow"/>
                 <w:lang w:val="en-US"/>
               </w:rPr>
-              <w:t>npm i jsonwebtoken</w:t>
-            </w:r>
+              <w:t>npm</w:t>
+            </w:r>
+            <w:proofErr w:type="spellEnd"/>
+            <w:r>
+              <w:rPr>
+                <w:highlight w:val="yellow"/>
+                <w:lang w:val="en-US"/>
+              </w:rPr>
+              <w:t xml:space="preserve"> i </w:t>
+            </w:r>
+            <w:proofErr w:type="spellStart"/>
+            <w:r>
+              <w:rPr>
+                <w:highlight w:val="yellow"/>
+                <w:lang w:val="en-US"/>
+              </w:rPr>
+              <w:t>jsonwebtoken</w:t>
+            </w:r>
+            <w:proofErr w:type="spellEnd"/>
+            <w:proofErr w:type="gramEnd"/>
           </w:p>
           <w:p>
             <w:pPr>
@@ -8529,7 +8687,7 @@
       <w:tr>
         <w:tc>
           <w:tcPr>
-            <w:tcW w:w="1271" w:type="dxa"/>
+            <w:tcW w:w="1270" w:type="dxa"/>
           </w:tcPr>
           <w:p>
             <w:pPr>
@@ -8557,11 +8715,21 @@
                 <w:lang w:val="en-US"/>
               </w:rPr>
             </w:pPr>
-            <w:r>
-              <w:rPr>
-                <w:lang w:val="en-US"/>
-              </w:rPr>
-              <w:t>jwt.verify()</w:t>
+            <w:proofErr w:type="spellStart"/>
+            <w:proofErr w:type="gramStart"/>
+            <w:r>
+              <w:rPr>
+                <w:lang w:val="en-US"/>
+              </w:rPr>
+              <w:t>jwt.verify</w:t>
+            </w:r>
+            <w:proofErr w:type="spellEnd"/>
+            <w:proofErr w:type="gramEnd"/>
+            <w:r>
+              <w:rPr>
+                <w:lang w:val="en-US"/>
+              </w:rPr>
+              <w:t>()</w:t>
             </w:r>
           </w:p>
         </w:tc>
@@ -8579,7 +8747,21 @@
               <w:rPr>
                 <w:lang w:val="en-US"/>
               </w:rPr>
-              <w:t>Check if the TOKEN includes the secret_key.</w:t>
+              <w:t xml:space="preserve">Check if the TOKEN includes the </w:t>
+            </w:r>
+            <w:proofErr w:type="spellStart"/>
+            <w:r>
+              <w:rPr>
+                <w:lang w:val="en-US"/>
+              </w:rPr>
+              <w:t>secret_key</w:t>
+            </w:r>
+            <w:proofErr w:type="spellEnd"/>
+            <w:r>
+              <w:rPr>
+                <w:lang w:val="en-US"/>
+              </w:rPr>
+              <w:t>.</w:t>
             </w:r>
           </w:p>
           <w:p>
@@ -8611,7 +8793,7 @@
         </w:tc>
         <w:tc>
           <w:tcPr>
-            <w:tcW w:w="4507" w:type="dxa"/>
+            <w:tcW w:w="4508" w:type="dxa"/>
           </w:tcPr>
           <w:p>
             <w:pPr>
@@ -8641,7 +8823,7 @@
                           <pic:cNvPicPr/>
                         </pic:nvPicPr>
                         <pic:blipFill>
-                          <a:blip r:embed="rId49"/>
+                          <a:blip r:embed="rId51"/>
                           <a:stretch>
                             <a:fillRect/>
                           </a:stretch>
@@ -8667,7 +8849,7 @@
       <w:tr>
         <w:tc>
           <w:tcPr>
-            <w:tcW w:w="1271" w:type="dxa"/>
+            <w:tcW w:w="1270" w:type="dxa"/>
           </w:tcPr>
           <w:p>
             <w:pPr>
@@ -8695,12 +8877,14 @@
                 <w:lang w:val="en-US"/>
               </w:rPr>
             </w:pPr>
+            <w:proofErr w:type="spellStart"/>
             <w:r>
               <w:rPr>
                 <w:lang w:val="en-US"/>
               </w:rPr>
               <w:t>GraphQL</w:t>
             </w:r>
+            <w:proofErr w:type="spellEnd"/>
           </w:p>
         </w:tc>
         <w:tc>
@@ -8772,7 +8956,7 @@
         </w:tc>
         <w:tc>
           <w:tcPr>
-            <w:tcW w:w="4507" w:type="dxa"/>
+            <w:tcW w:w="4508" w:type="dxa"/>
           </w:tcPr>
           <w:p>
             <w:pPr>
@@ -8801,7 +8985,7 @@
                           <pic:cNvPicPr/>
                         </pic:nvPicPr>
                         <pic:blipFill>
-                          <a:blip r:embed="rId50"/>
+                          <a:blip r:embed="rId52"/>
                           <a:stretch>
                             <a:fillRect/>
                           </a:stretch>
@@ -8865,6 +9049,7 @@
                 <w:lang w:val="en-US"/>
               </w:rPr>
             </w:pPr>
+            <w:proofErr w:type="spellStart"/>
             <w:r>
               <w:rPr>
                 <w:b/>
@@ -8874,6 +9059,7 @@
               </w:rPr>
               <w:t>GrafQl</w:t>
             </w:r>
+            <w:proofErr w:type="spellEnd"/>
             <w:r>
               <w:rPr>
                 <w:b/>
@@ -8914,18 +9100,28 @@
                 <w:lang w:val="en-US"/>
               </w:rPr>
             </w:pPr>
+            <w:proofErr w:type="spellStart"/>
+            <w:proofErr w:type="gramStart"/>
             <w:r>
               <w:rPr>
                 <w:highlight w:val="yellow"/>
                 <w:lang w:val="en-US"/>
               </w:rPr>
-              <w:t>npm i e</w:t>
-            </w:r>
+              <w:t>npm</w:t>
+            </w:r>
+            <w:proofErr w:type="spellEnd"/>
             <w:r>
               <w:rPr>
                 <w:highlight w:val="yellow"/>
                 <w:lang w:val="en-US"/>
               </w:rPr>
+              <w:t xml:space="preserve"> i e</w:t>
+            </w:r>
+            <w:r>
+              <w:rPr>
+                <w:highlight w:val="yellow"/>
+                <w:lang w:val="en-US"/>
+              </w:rPr>
               <w:t>x</w:t>
             </w:r>
             <w:r>
@@ -8933,8 +9129,17 @@
                 <w:highlight w:val="yellow"/>
                 <w:lang w:val="en-US"/>
               </w:rPr>
-              <w:t>press cors</w:t>
-            </w:r>
+              <w:t xml:space="preserve">press </w:t>
+            </w:r>
+            <w:proofErr w:type="spellStart"/>
+            <w:r>
+              <w:rPr>
+                <w:highlight w:val="yellow"/>
+                <w:lang w:val="en-US"/>
+              </w:rPr>
+              <w:t>cors</w:t>
+            </w:r>
+            <w:proofErr w:type="spellEnd"/>
             <w:r>
               <w:rPr>
                 <w:b/>
@@ -8944,6 +9149,7 @@
               </w:rPr>
               <w:t xml:space="preserve"> </w:t>
             </w:r>
+            <w:proofErr w:type="spellStart"/>
             <w:r>
               <w:rPr>
                 <w:b/>
@@ -8969,8 +9175,9 @@
                 <w:highlight w:val="yellow"/>
                 <w:lang w:val="en-US"/>
               </w:rPr>
-              <w:t>ql express-</w:t>
-            </w:r>
+              <w:t>ql</w:t>
+            </w:r>
+            <w:proofErr w:type="spellEnd"/>
             <w:r>
               <w:rPr>
                 <w:b/>
@@ -8978,8 +9185,9 @@
                 <w:highlight w:val="yellow"/>
                 <w:lang w:val="en-US"/>
               </w:rPr>
-              <w:t>g</w:t>
-            </w:r>
+              <w:t xml:space="preserve"> express-</w:t>
+            </w:r>
+            <w:proofErr w:type="spellStart"/>
             <w:r>
               <w:rPr>
                 <w:b/>
@@ -8987,7 +9195,7 @@
                 <w:highlight w:val="yellow"/>
                 <w:lang w:val="en-US"/>
               </w:rPr>
-              <w:t>ra</w:t>
+              <w:t>g</w:t>
             </w:r>
             <w:r>
               <w:rPr>
@@ -8996,7 +9204,7 @@
                 <w:highlight w:val="yellow"/>
                 <w:lang w:val="en-US"/>
               </w:rPr>
-              <w:t>ph</w:t>
+              <w:t>ra</w:t>
             </w:r>
             <w:r>
               <w:rPr>
@@ -9005,8 +9213,19 @@
                 <w:highlight w:val="yellow"/>
                 <w:lang w:val="en-US"/>
               </w:rPr>
+              <w:t>ph</w:t>
+            </w:r>
+            <w:r>
+              <w:rPr>
+                <w:b/>
+                <w:bCs/>
+                <w:highlight w:val="yellow"/>
+                <w:lang w:val="en-US"/>
+              </w:rPr>
               <w:t>ql</w:t>
             </w:r>
+            <w:proofErr w:type="spellEnd"/>
+            <w:proofErr w:type="gramEnd"/>
           </w:p>
           <w:p>
             <w:pPr>
@@ -9024,7 +9243,7 @@
         </w:trPr>
         <w:tc>
           <w:tcPr>
-            <w:tcW w:w="1271" w:type="dxa"/>
+            <w:tcW w:w="1270" w:type="dxa"/>
             <w:vMerge w:val="restart"/>
           </w:tcPr>
           <w:p>
@@ -9048,17 +9267,25 @@
                 <w:lang w:val="en-US"/>
               </w:rPr>
             </w:pPr>
-            <w:r>
-              <w:rPr>
-                <w:lang w:val="en-US"/>
-              </w:rPr>
-              <w:t>GraphQL using</w:t>
-            </w:r>
-          </w:p>
-        </w:tc>
-        <w:tc>
-          <w:tcPr>
-            <w:tcW w:w="2552" w:type="dxa"/>
+            <w:proofErr w:type="spellStart"/>
+            <w:r>
+              <w:rPr>
+                <w:lang w:val="en-US"/>
+              </w:rPr>
+              <w:t>GraphQL</w:t>
+            </w:r>
+            <w:proofErr w:type="spellEnd"/>
+            <w:r>
+              <w:rPr>
+                <w:lang w:val="en-US"/>
+              </w:rPr>
+              <w:t xml:space="preserve"> using</w:t>
+            </w:r>
+          </w:p>
+        </w:tc>
+        <w:tc>
+          <w:tcPr>
+            <w:tcW w:w="2553" w:type="dxa"/>
           </w:tcPr>
           <w:p>
             <w:pPr>
@@ -9075,7 +9302,21 @@
               <w:rPr>
                 <w:lang w:val="en-US"/>
               </w:rPr>
-              <w:t>Creating the server of GraphQl type</w:t>
+              <w:t xml:space="preserve">Creating the server of </w:t>
+            </w:r>
+            <w:proofErr w:type="spellStart"/>
+            <w:r>
+              <w:rPr>
+                <w:lang w:val="en-US"/>
+              </w:rPr>
+              <w:t>GraphQl</w:t>
+            </w:r>
+            <w:proofErr w:type="spellEnd"/>
+            <w:r>
+              <w:rPr>
+                <w:lang w:val="en-US"/>
+              </w:rPr>
+              <w:t xml:space="preserve"> type</w:t>
             </w:r>
           </w:p>
         </w:tc>
@@ -9110,7 +9351,7 @@
                           <pic:cNvPicPr/>
                         </pic:nvPicPr>
                         <pic:blipFill>
-                          <a:blip r:embed="rId51"/>
+                          <a:blip r:embed="rId53"/>
                           <a:stretch>
                             <a:fillRect/>
                           </a:stretch>
@@ -9139,7 +9380,7 @@
         </w:trPr>
         <w:tc>
           <w:tcPr>
-            <w:tcW w:w="1271" w:type="dxa"/>
+            <w:tcW w:w="1270" w:type="dxa"/>
             <w:vMerge/>
           </w:tcPr>
           <w:p>
@@ -9164,7 +9405,7 @@
         </w:tc>
         <w:tc>
           <w:tcPr>
-            <w:tcW w:w="2552" w:type="dxa"/>
+            <w:tcW w:w="2553" w:type="dxa"/>
           </w:tcPr>
           <w:p>
             <w:pPr>
@@ -9240,7 +9481,7 @@
                           <pic:cNvPicPr/>
                         </pic:nvPicPr>
                         <pic:blipFill>
-                          <a:blip r:embed="rId52"/>
+                          <a:blip r:embed="rId54"/>
                           <a:stretch>
                             <a:fillRect/>
                           </a:stretch>
@@ -9269,7 +9510,7 @@
         </w:trPr>
         <w:tc>
           <w:tcPr>
-            <w:tcW w:w="1271" w:type="dxa"/>
+            <w:tcW w:w="1270" w:type="dxa"/>
             <w:vMerge/>
           </w:tcPr>
           <w:p>
@@ -9294,7 +9535,7 @@
         </w:tc>
         <w:tc>
           <w:tcPr>
-            <w:tcW w:w="2552" w:type="dxa"/>
+            <w:tcW w:w="2553" w:type="dxa"/>
           </w:tcPr>
           <w:p>
             <w:pPr>
@@ -9346,7 +9587,7 @@
                           <pic:cNvPicPr/>
                         </pic:nvPicPr>
                         <pic:blipFill>
-                          <a:blip r:embed="rId53"/>
+                          <a:blip r:embed="rId55"/>
                           <a:stretch>
                             <a:fillRect/>
                           </a:stretch>
@@ -9375,7 +9616,7 @@
         </w:trPr>
         <w:tc>
           <w:tcPr>
-            <w:tcW w:w="1271" w:type="dxa"/>
+            <w:tcW w:w="1270" w:type="dxa"/>
             <w:vMerge/>
           </w:tcPr>
           <w:p>
@@ -9400,7 +9641,7 @@
         </w:tc>
         <w:tc>
           <w:tcPr>
-            <w:tcW w:w="2552" w:type="dxa"/>
+            <w:tcW w:w="2553" w:type="dxa"/>
           </w:tcPr>
           <w:p>
             <w:pPr>
@@ -9452,7 +9693,7 @@
                           <pic:cNvPicPr/>
                         </pic:nvPicPr>
                         <pic:blipFill>
-                          <a:blip r:embed="rId54"/>
+                          <a:blip r:embed="rId56"/>
                           <a:stretch>
                             <a:fillRect/>
                           </a:stretch>
@@ -9481,7 +9722,7 @@
         </w:trPr>
         <w:tc>
           <w:tcPr>
-            <w:tcW w:w="1271" w:type="dxa"/>
+            <w:tcW w:w="1270" w:type="dxa"/>
             <w:vMerge/>
           </w:tcPr>
           <w:p>
@@ -9506,7 +9747,7 @@
         </w:tc>
         <w:tc>
           <w:tcPr>
-            <w:tcW w:w="2552" w:type="dxa"/>
+            <w:tcW w:w="2553" w:type="dxa"/>
           </w:tcPr>
           <w:p>
             <w:pPr>
@@ -9558,7 +9799,7 @@
                           <pic:cNvPicPr/>
                         </pic:nvPicPr>
                         <pic:blipFill>
-                          <a:blip r:embed="rId55"/>
+                          <a:blip r:embed="rId57"/>
                           <a:stretch>
                             <a:fillRect/>
                           </a:stretch>
@@ -9584,7 +9825,7 @@
       <w:tr>
         <w:tc>
           <w:tcPr>
-            <w:tcW w:w="1271" w:type="dxa"/>
+            <w:tcW w:w="1270" w:type="dxa"/>
           </w:tcPr>
           <w:p>
             <w:pPr>
@@ -9613,17 +9854,25 @@
                 <w:lang w:val="en-US"/>
               </w:rPr>
             </w:pPr>
-            <w:r>
-              <w:rPr>
-                <w:lang w:val="en-US"/>
-              </w:rPr>
-              <w:t>GraphQL GUI</w:t>
-            </w:r>
-          </w:p>
-        </w:tc>
-        <w:tc>
-          <w:tcPr>
-            <w:tcW w:w="7060" w:type="dxa"/>
+            <w:proofErr w:type="spellStart"/>
+            <w:r>
+              <w:rPr>
+                <w:lang w:val="en-US"/>
+              </w:rPr>
+              <w:t>GraphQL</w:t>
+            </w:r>
+            <w:proofErr w:type="spellEnd"/>
+            <w:r>
+              <w:rPr>
+                <w:lang w:val="en-US"/>
+              </w:rPr>
+              <w:t xml:space="preserve"> GUI</w:t>
+            </w:r>
+          </w:p>
+        </w:tc>
+        <w:tc>
+          <w:tcPr>
+            <w:tcW w:w="7061" w:type="dxa"/>
             <w:gridSpan w:val="2"/>
           </w:tcPr>
           <w:p>
@@ -9653,7 +9902,7 @@
                           <pic:cNvPicPr/>
                         </pic:nvPicPr>
                         <pic:blipFill>
-                          <a:blip r:embed="rId56"/>
+                          <a:blip r:embed="rId58"/>
                           <a:stretch>
                             <a:fillRect/>
                           </a:stretch>
@@ -9679,7 +9928,7 @@
       <w:tr>
         <w:tc>
           <w:tcPr>
-            <w:tcW w:w="1271" w:type="dxa"/>
+            <w:tcW w:w="1270" w:type="dxa"/>
             <w:tcBorders>
               <w:bottom w:val="single" w:sz="4" w:space="0" w:color="auto"/>
             </w:tcBorders>
@@ -9752,7 +10001,7 @@
         </w:tc>
         <w:tc>
           <w:tcPr>
-            <w:tcW w:w="4507" w:type="dxa"/>
+            <w:tcW w:w="4508" w:type="dxa"/>
             <w:tcBorders>
               <w:bottom w:val="single" w:sz="4" w:space="0" w:color="auto"/>
             </w:tcBorders>
@@ -9797,8 +10046,9 @@
                 <w:szCs w:val="28"/>
                 <w:lang w:val="en-US"/>
               </w:rPr>
-              <w:t>Lesson 0</w:t>
-            </w:r>
+              <w:t xml:space="preserve">Lesson </w:t>
+            </w:r>
+            <w:proofErr w:type="gramStart"/>
             <w:r>
               <w:rPr>
                 <w:b/>
@@ -9807,12 +10057,9 @@
                 <w:szCs w:val="28"/>
                 <w:lang w:val="en-US"/>
               </w:rPr>
-              <w:t>7  MERN</w:t>
-            </w:r>
-          </w:p>
-          <w:p>
-            <w:pPr>
-              <w:jc w:val="center"/>
+              <w:t>0</w:t>
+            </w:r>
+            <w:r>
               <w:rPr>
                 <w:b/>
                 <w:bCs/>
@@ -9820,8 +10067,13 @@
                 <w:szCs w:val="28"/>
                 <w:lang w:val="en-US"/>
               </w:rPr>
-            </w:pPr>
-            <w:r>
+              <w:t>7  MERN</w:t>
+            </w:r>
+            <w:proofErr w:type="gramEnd"/>
+          </w:p>
+          <w:p>
+            <w:pPr>
+              <w:jc w:val="center"/>
               <w:rPr>
                 <w:b/>
                 <w:bCs/>
@@ -9829,6 +10081,15 @@
                 <w:szCs w:val="28"/>
                 <w:lang w:val="en-US"/>
               </w:rPr>
+            </w:pPr>
+            <w:r>
+              <w:rPr>
+                <w:b/>
+                <w:bCs/>
+                <w:sz w:val="28"/>
+                <w:szCs w:val="28"/>
+                <w:lang w:val="en-US"/>
+              </w:rPr>
               <w:t>Mongo + Express + React + NODE</w:t>
             </w:r>
           </w:p>
@@ -9837,7 +10098,7 @@
       <w:tr>
         <w:tc>
           <w:tcPr>
-            <w:tcW w:w="1271" w:type="dxa"/>
+            <w:tcW w:w="1270" w:type="dxa"/>
           </w:tcPr>
           <w:p>
             <w:pPr>
@@ -9893,7 +10154,7 @@
         </w:tc>
         <w:tc>
           <w:tcPr>
-            <w:tcW w:w="4507" w:type="dxa"/>
+            <w:tcW w:w="4508" w:type="dxa"/>
           </w:tcPr>
           <w:p>
             <w:pPr>
@@ -9938,7 +10199,7 @@
                           <pic:cNvPicPr/>
                         </pic:nvPicPr>
                         <pic:blipFill>
-                          <a:blip r:embed="rId57"/>
+                          <a:blip r:embed="rId59"/>
                           <a:stretch>
                             <a:fillRect/>
                           </a:stretch>
@@ -9964,7 +10225,7 @@
       <w:tr>
         <w:tc>
           <w:tcPr>
-            <w:tcW w:w="1271" w:type="dxa"/>
+            <w:tcW w:w="1270" w:type="dxa"/>
           </w:tcPr>
           <w:p>
             <w:pPr>
@@ -10008,7 +10269,7 @@
         </w:tc>
         <w:tc>
           <w:tcPr>
-            <w:tcW w:w="4507" w:type="dxa"/>
+            <w:tcW w:w="4508" w:type="dxa"/>
           </w:tcPr>
           <w:p>
             <w:pPr>
@@ -10023,7 +10284,7 @@
       <w:tr>
         <w:tc>
           <w:tcPr>
-            <w:tcW w:w="1271" w:type="dxa"/>
+            <w:tcW w:w="1270" w:type="dxa"/>
           </w:tcPr>
           <w:p>
             <w:pPr>
@@ -10061,7 +10322,7 @@
         </w:tc>
         <w:tc>
           <w:tcPr>
-            <w:tcW w:w="4507" w:type="dxa"/>
+            <w:tcW w:w="4508" w:type="dxa"/>
           </w:tcPr>
           <w:p>
             <w:pPr>
@@ -10076,7 +10337,7 @@
       <w:tr>
         <w:tc>
           <w:tcPr>
-            <w:tcW w:w="1271" w:type="dxa"/>
+            <w:tcW w:w="1270" w:type="dxa"/>
           </w:tcPr>
           <w:p>
             <w:pPr>
@@ -10114,7 +10375,7 @@
         </w:tc>
         <w:tc>
           <w:tcPr>
-            <w:tcW w:w="4507" w:type="dxa"/>
+            <w:tcW w:w="4508" w:type="dxa"/>
           </w:tcPr>
           <w:p>
             <w:pPr>
@@ -10129,7 +10390,7 @@
       <w:tr>
         <w:tc>
           <w:tcPr>
-            <w:tcW w:w="1271" w:type="dxa"/>
+            <w:tcW w:w="1270" w:type="dxa"/>
           </w:tcPr>
           <w:p>
             <w:pPr>
@@ -10167,7 +10428,7 @@
         </w:tc>
         <w:tc>
           <w:tcPr>
-            <w:tcW w:w="4507" w:type="dxa"/>
+            <w:tcW w:w="4508" w:type="dxa"/>
           </w:tcPr>
           <w:p>
             <w:pPr>
@@ -10182,7 +10443,7 @@
       <w:tr>
         <w:tc>
           <w:tcPr>
-            <w:tcW w:w="1271" w:type="dxa"/>
+            <w:tcW w:w="1270" w:type="dxa"/>
           </w:tcPr>
           <w:p>
             <w:pPr>
@@ -10220,7 +10481,7 @@
         </w:tc>
         <w:tc>
           <w:tcPr>
-            <w:tcW w:w="4507" w:type="dxa"/>
+            <w:tcW w:w="4508" w:type="dxa"/>
           </w:tcPr>
           <w:p>
             <w:pPr>
@@ -10235,7 +10496,7 @@
       <w:tr>
         <w:tc>
           <w:tcPr>
-            <w:tcW w:w="1271" w:type="dxa"/>
+            <w:tcW w:w="1270" w:type="dxa"/>
           </w:tcPr>
           <w:p>
             <w:pPr>
@@ -10273,7 +10534,7 @@
         </w:tc>
         <w:tc>
           <w:tcPr>
-            <w:tcW w:w="4507" w:type="dxa"/>
+            <w:tcW w:w="4508" w:type="dxa"/>
           </w:tcPr>
           <w:p>
             <w:pPr>
@@ -10418,6 +10679,95 @@
     </w:lvl>
   </w:abstractNum>
   <w:abstractNum w:abstractNumId="1" w15:restartNumberingAfterBreak="0">
+    <w:nsid w:val="09110FBE"/>
+    <w:multiLevelType w:val="hybridMultilevel"/>
+    <w:tmpl w:val="BA4EB0E8"/>
+    <w:lvl w:ilvl="0" w:tplc="2000000F">
+      <w:start w:val="1"/>
+      <w:numFmt w:val="decimal"/>
+      <w:lvlText w:val="%1."/>
+      <w:lvlJc w:val="left"/>
+      <w:pPr>
+        <w:ind w:left="360" w:hanging="360"/>
+      </w:pPr>
+      <w:rPr>
+        <w:rFonts w:hint="default"/>
+      </w:rPr>
+    </w:lvl>
+    <w:lvl w:ilvl="1" w:tplc="20000019" w:tentative="1">
+      <w:start w:val="1"/>
+      <w:numFmt w:val="lowerLetter"/>
+      <w:lvlText w:val="%2."/>
+      <w:lvlJc w:val="left"/>
+      <w:pPr>
+        <w:ind w:left="1080" w:hanging="360"/>
+      </w:pPr>
+    </w:lvl>
+    <w:lvl w:ilvl="2" w:tplc="2000001B" w:tentative="1">
+      <w:start w:val="1"/>
+      <w:numFmt w:val="lowerRoman"/>
+      <w:lvlText w:val="%3."/>
+      <w:lvlJc w:val="right"/>
+      <w:pPr>
+        <w:ind w:left="1800" w:hanging="180"/>
+      </w:pPr>
+    </w:lvl>
+    <w:lvl w:ilvl="3" w:tplc="2000000F" w:tentative="1">
+      <w:start w:val="1"/>
+      <w:numFmt w:val="decimal"/>
+      <w:lvlText w:val="%4."/>
+      <w:lvlJc w:val="left"/>
+      <w:pPr>
+        <w:ind w:left="2520" w:hanging="360"/>
+      </w:pPr>
+    </w:lvl>
+    <w:lvl w:ilvl="4" w:tplc="20000019" w:tentative="1">
+      <w:start w:val="1"/>
+      <w:numFmt w:val="lowerLetter"/>
+      <w:lvlText w:val="%5."/>
+      <w:lvlJc w:val="left"/>
+      <w:pPr>
+        <w:ind w:left="3240" w:hanging="360"/>
+      </w:pPr>
+    </w:lvl>
+    <w:lvl w:ilvl="5" w:tplc="2000001B" w:tentative="1">
+      <w:start w:val="1"/>
+      <w:numFmt w:val="lowerRoman"/>
+      <w:lvlText w:val="%6."/>
+      <w:lvlJc w:val="right"/>
+      <w:pPr>
+        <w:ind w:left="3960" w:hanging="180"/>
+      </w:pPr>
+    </w:lvl>
+    <w:lvl w:ilvl="6" w:tplc="2000000F" w:tentative="1">
+      <w:start w:val="1"/>
+      <w:numFmt w:val="decimal"/>
+      <w:lvlText w:val="%7."/>
+      <w:lvlJc w:val="left"/>
+      <w:pPr>
+        <w:ind w:left="4680" w:hanging="360"/>
+      </w:pPr>
+    </w:lvl>
+    <w:lvl w:ilvl="7" w:tplc="20000019" w:tentative="1">
+      <w:start w:val="1"/>
+      <w:numFmt w:val="lowerLetter"/>
+      <w:lvlText w:val="%8."/>
+      <w:lvlJc w:val="left"/>
+      <w:pPr>
+        <w:ind w:left="5400" w:hanging="360"/>
+      </w:pPr>
+    </w:lvl>
+    <w:lvl w:ilvl="8" w:tplc="2000001B" w:tentative="1">
+      <w:start w:val="1"/>
+      <w:numFmt w:val="lowerRoman"/>
+      <w:lvlText w:val="%9."/>
+      <w:lvlJc w:val="right"/>
+      <w:pPr>
+        <w:ind w:left="6120" w:hanging="180"/>
+      </w:pPr>
+    </w:lvl>
+  </w:abstractNum>
+  <w:abstractNum w:abstractNumId="2" w15:restartNumberingAfterBreak="0">
     <w:nsid w:val="10507EDA"/>
     <w:multiLevelType w:val="hybridMultilevel"/>
     <w:tmpl w:val="9B4C3776"/>
@@ -10530,7 +10880,96 @@
       </w:rPr>
     </w:lvl>
   </w:abstractNum>
-  <w:abstractNum w:abstractNumId="2" w15:restartNumberingAfterBreak="0">
+  <w:abstractNum w:abstractNumId="3" w15:restartNumberingAfterBreak="0">
+    <w:nsid w:val="15C42CCA"/>
+    <w:multiLevelType w:val="hybridMultilevel"/>
+    <w:tmpl w:val="C98A334C"/>
+    <w:lvl w:ilvl="0" w:tplc="2000000F">
+      <w:start w:val="1"/>
+      <w:numFmt w:val="decimal"/>
+      <w:lvlText w:val="%1."/>
+      <w:lvlJc w:val="left"/>
+      <w:pPr>
+        <w:ind w:left="360" w:hanging="360"/>
+      </w:pPr>
+      <w:rPr>
+        <w:rFonts w:hint="default"/>
+      </w:rPr>
+    </w:lvl>
+    <w:lvl w:ilvl="1" w:tplc="20000019" w:tentative="1">
+      <w:start w:val="1"/>
+      <w:numFmt w:val="lowerLetter"/>
+      <w:lvlText w:val="%2."/>
+      <w:lvlJc w:val="left"/>
+      <w:pPr>
+        <w:ind w:left="1080" w:hanging="360"/>
+      </w:pPr>
+    </w:lvl>
+    <w:lvl w:ilvl="2" w:tplc="2000001B" w:tentative="1">
+      <w:start w:val="1"/>
+      <w:numFmt w:val="lowerRoman"/>
+      <w:lvlText w:val="%3."/>
+      <w:lvlJc w:val="right"/>
+      <w:pPr>
+        <w:ind w:left="1800" w:hanging="180"/>
+      </w:pPr>
+    </w:lvl>
+    <w:lvl w:ilvl="3" w:tplc="2000000F" w:tentative="1">
+      <w:start w:val="1"/>
+      <w:numFmt w:val="decimal"/>
+      <w:lvlText w:val="%4."/>
+      <w:lvlJc w:val="left"/>
+      <w:pPr>
+        <w:ind w:left="2520" w:hanging="360"/>
+      </w:pPr>
+    </w:lvl>
+    <w:lvl w:ilvl="4" w:tplc="20000019" w:tentative="1">
+      <w:start w:val="1"/>
+      <w:numFmt w:val="lowerLetter"/>
+      <w:lvlText w:val="%5."/>
+      <w:lvlJc w:val="left"/>
+      <w:pPr>
+        <w:ind w:left="3240" w:hanging="360"/>
+      </w:pPr>
+    </w:lvl>
+    <w:lvl w:ilvl="5" w:tplc="2000001B" w:tentative="1">
+      <w:start w:val="1"/>
+      <w:numFmt w:val="lowerRoman"/>
+      <w:lvlText w:val="%6."/>
+      <w:lvlJc w:val="right"/>
+      <w:pPr>
+        <w:ind w:left="3960" w:hanging="180"/>
+      </w:pPr>
+    </w:lvl>
+    <w:lvl w:ilvl="6" w:tplc="2000000F" w:tentative="1">
+      <w:start w:val="1"/>
+      <w:numFmt w:val="decimal"/>
+      <w:lvlText w:val="%7."/>
+      <w:lvlJc w:val="left"/>
+      <w:pPr>
+        <w:ind w:left="4680" w:hanging="360"/>
+      </w:pPr>
+    </w:lvl>
+    <w:lvl w:ilvl="7" w:tplc="20000019" w:tentative="1">
+      <w:start w:val="1"/>
+      <w:numFmt w:val="lowerLetter"/>
+      <w:lvlText w:val="%8."/>
+      <w:lvlJc w:val="left"/>
+      <w:pPr>
+        <w:ind w:left="5400" w:hanging="360"/>
+      </w:pPr>
+    </w:lvl>
+    <w:lvl w:ilvl="8" w:tplc="2000001B" w:tentative="1">
+      <w:start w:val="1"/>
+      <w:numFmt w:val="lowerRoman"/>
+      <w:lvlText w:val="%9."/>
+      <w:lvlJc w:val="right"/>
+      <w:pPr>
+        <w:ind w:left="6120" w:hanging="180"/>
+      </w:pPr>
+    </w:lvl>
+  </w:abstractNum>
+  <w:abstractNum w:abstractNumId="4" w15:restartNumberingAfterBreak="0">
     <w:nsid w:val="226772A4"/>
     <w:multiLevelType w:val="hybridMultilevel"/>
     <w:tmpl w:val="986E2092"/>
@@ -10619,7 +11058,7 @@
       </w:pPr>
     </w:lvl>
   </w:abstractNum>
-  <w:abstractNum w:abstractNumId="3" w15:restartNumberingAfterBreak="0">
+  <w:abstractNum w:abstractNumId="5" w15:restartNumberingAfterBreak="0">
     <w:nsid w:val="2F3D0570"/>
     <w:multiLevelType w:val="hybridMultilevel"/>
     <w:tmpl w:val="D0C6F1FE"/>
@@ -10708,7 +11147,7 @@
       </w:pPr>
     </w:lvl>
   </w:abstractNum>
-  <w:abstractNum w:abstractNumId="4" w15:restartNumberingAfterBreak="0">
+  <w:abstractNum w:abstractNumId="6" w15:restartNumberingAfterBreak="0">
     <w:nsid w:val="3907134F"/>
     <w:multiLevelType w:val="hybridMultilevel"/>
     <w:tmpl w:val="FB22E1A2"/>
@@ -10797,7 +11236,7 @@
       </w:pPr>
     </w:lvl>
   </w:abstractNum>
-  <w:abstractNum w:abstractNumId="5" w15:restartNumberingAfterBreak="0">
+  <w:abstractNum w:abstractNumId="7" w15:restartNumberingAfterBreak="0">
     <w:nsid w:val="551E3519"/>
     <w:multiLevelType w:val="hybridMultilevel"/>
     <w:tmpl w:val="D0C6F1FE"/>
@@ -10886,7 +11325,7 @@
       </w:pPr>
     </w:lvl>
   </w:abstractNum>
-  <w:abstractNum w:abstractNumId="6" w15:restartNumberingAfterBreak="0">
+  <w:abstractNum w:abstractNumId="8" w15:restartNumberingAfterBreak="0">
     <w:nsid w:val="56D451EA"/>
     <w:multiLevelType w:val="hybridMultilevel"/>
     <w:tmpl w:val="9586A9E0"/>
@@ -10975,7 +11414,96 @@
       </w:pPr>
     </w:lvl>
   </w:abstractNum>
-  <w:abstractNum w:abstractNumId="7" w15:restartNumberingAfterBreak="0">
+  <w:abstractNum w:abstractNumId="9" w15:restartNumberingAfterBreak="0">
+    <w:nsid w:val="5D01323B"/>
+    <w:multiLevelType w:val="hybridMultilevel"/>
+    <w:tmpl w:val="2D7A1D38"/>
+    <w:lvl w:ilvl="0" w:tplc="2000000F">
+      <w:start w:val="1"/>
+      <w:numFmt w:val="decimal"/>
+      <w:lvlText w:val="%1."/>
+      <w:lvlJc w:val="left"/>
+      <w:pPr>
+        <w:ind w:left="360" w:hanging="360"/>
+      </w:pPr>
+      <w:rPr>
+        <w:rFonts w:hint="default"/>
+      </w:rPr>
+    </w:lvl>
+    <w:lvl w:ilvl="1" w:tplc="20000019" w:tentative="1">
+      <w:start w:val="1"/>
+      <w:numFmt w:val="lowerLetter"/>
+      <w:lvlText w:val="%2."/>
+      <w:lvlJc w:val="left"/>
+      <w:pPr>
+        <w:ind w:left="1080" w:hanging="360"/>
+      </w:pPr>
+    </w:lvl>
+    <w:lvl w:ilvl="2" w:tplc="2000001B" w:tentative="1">
+      <w:start w:val="1"/>
+      <w:numFmt w:val="lowerRoman"/>
+      <w:lvlText w:val="%3."/>
+      <w:lvlJc w:val="right"/>
+      <w:pPr>
+        <w:ind w:left="1800" w:hanging="180"/>
+      </w:pPr>
+    </w:lvl>
+    <w:lvl w:ilvl="3" w:tplc="2000000F" w:tentative="1">
+      <w:start w:val="1"/>
+      <w:numFmt w:val="decimal"/>
+      <w:lvlText w:val="%4."/>
+      <w:lvlJc w:val="left"/>
+      <w:pPr>
+        <w:ind w:left="2520" w:hanging="360"/>
+      </w:pPr>
+    </w:lvl>
+    <w:lvl w:ilvl="4" w:tplc="20000019" w:tentative="1">
+      <w:start w:val="1"/>
+      <w:numFmt w:val="lowerLetter"/>
+      <w:lvlText w:val="%5."/>
+      <w:lvlJc w:val="left"/>
+      <w:pPr>
+        <w:ind w:left="3240" w:hanging="360"/>
+      </w:pPr>
+    </w:lvl>
+    <w:lvl w:ilvl="5" w:tplc="2000001B" w:tentative="1">
+      <w:start w:val="1"/>
+      <w:numFmt w:val="lowerRoman"/>
+      <w:lvlText w:val="%6."/>
+      <w:lvlJc w:val="right"/>
+      <w:pPr>
+        <w:ind w:left="3960" w:hanging="180"/>
+      </w:pPr>
+    </w:lvl>
+    <w:lvl w:ilvl="6" w:tplc="2000000F" w:tentative="1">
+      <w:start w:val="1"/>
+      <w:numFmt w:val="decimal"/>
+      <w:lvlText w:val="%7."/>
+      <w:lvlJc w:val="left"/>
+      <w:pPr>
+        <w:ind w:left="4680" w:hanging="360"/>
+      </w:pPr>
+    </w:lvl>
+    <w:lvl w:ilvl="7" w:tplc="20000019" w:tentative="1">
+      <w:start w:val="1"/>
+      <w:numFmt w:val="lowerLetter"/>
+      <w:lvlText w:val="%8."/>
+      <w:lvlJc w:val="left"/>
+      <w:pPr>
+        <w:ind w:left="5400" w:hanging="360"/>
+      </w:pPr>
+    </w:lvl>
+    <w:lvl w:ilvl="8" w:tplc="2000001B" w:tentative="1">
+      <w:start w:val="1"/>
+      <w:numFmt w:val="lowerRoman"/>
+      <w:lvlText w:val="%9."/>
+      <w:lvlJc w:val="right"/>
+      <w:pPr>
+        <w:ind w:left="6120" w:hanging="180"/>
+      </w:pPr>
+    </w:lvl>
+  </w:abstractNum>
+  <w:abstractNum w:abstractNumId="10" w15:restartNumberingAfterBreak="0">
     <w:nsid w:val="613876D3"/>
     <w:multiLevelType w:val="hybridMultilevel"/>
     <w:tmpl w:val="7A940838"/>
@@ -11066,7 +11594,7 @@
       </w:pPr>
     </w:lvl>
   </w:abstractNum>
-  <w:abstractNum w:abstractNumId="8" w15:restartNumberingAfterBreak="0">
+  <w:abstractNum w:abstractNumId="11" w15:restartNumberingAfterBreak="0">
     <w:nsid w:val="67945EE1"/>
     <w:multiLevelType w:val="hybridMultilevel"/>
     <w:tmpl w:val="F80A519A"/>
@@ -11155,7 +11683,96 @@
       </w:pPr>
     </w:lvl>
   </w:abstractNum>
-  <w:abstractNum w:abstractNumId="9" w15:restartNumberingAfterBreak="0">
+  <w:abstractNum w:abstractNumId="12" w15:restartNumberingAfterBreak="0">
+    <w:nsid w:val="687F176F"/>
+    <w:multiLevelType w:val="hybridMultilevel"/>
+    <w:tmpl w:val="E1FC1CA2"/>
+    <w:lvl w:ilvl="0" w:tplc="2000000F">
+      <w:start w:val="1"/>
+      <w:numFmt w:val="decimal"/>
+      <w:lvlText w:val="%1."/>
+      <w:lvlJc w:val="left"/>
+      <w:pPr>
+        <w:ind w:left="360" w:hanging="360"/>
+      </w:pPr>
+      <w:rPr>
+        <w:rFonts w:hint="default"/>
+      </w:rPr>
+    </w:lvl>
+    <w:lvl w:ilvl="1" w:tplc="20000019" w:tentative="1">
+      <w:start w:val="1"/>
+      <w:numFmt w:val="lowerLetter"/>
+      <w:lvlText w:val="%2."/>
+      <w:lvlJc w:val="left"/>
+      <w:pPr>
+        <w:ind w:left="1080" w:hanging="360"/>
+      </w:pPr>
+    </w:lvl>
+    <w:lvl w:ilvl="2" w:tplc="2000001B" w:tentative="1">
+      <w:start w:val="1"/>
+      <w:numFmt w:val="lowerRoman"/>
+      <w:lvlText w:val="%3."/>
+      <w:lvlJc w:val="right"/>
+      <w:pPr>
+        <w:ind w:left="1800" w:hanging="180"/>
+      </w:pPr>
+    </w:lvl>
+    <w:lvl w:ilvl="3" w:tplc="2000000F" w:tentative="1">
+      <w:start w:val="1"/>
+      <w:numFmt w:val="decimal"/>
+      <w:lvlText w:val="%4."/>
+      <w:lvlJc w:val="left"/>
+      <w:pPr>
+        <w:ind w:left="2520" w:hanging="360"/>
+      </w:pPr>
+    </w:lvl>
+    <w:lvl w:ilvl="4" w:tplc="20000019" w:tentative="1">
+      <w:start w:val="1"/>
+      <w:numFmt w:val="lowerLetter"/>
+      <w:lvlText w:val="%5."/>
+      <w:lvlJc w:val="left"/>
+      <w:pPr>
+        <w:ind w:left="3240" w:hanging="360"/>
+      </w:pPr>
+    </w:lvl>
+    <w:lvl w:ilvl="5" w:tplc="2000001B" w:tentative="1">
+      <w:start w:val="1"/>
+      <w:numFmt w:val="lowerRoman"/>
+      <w:lvlText w:val="%6."/>
+      <w:lvlJc w:val="right"/>
+      <w:pPr>
+        <w:ind w:left="3960" w:hanging="180"/>
+      </w:pPr>
+    </w:lvl>
+    <w:lvl w:ilvl="6" w:tplc="2000000F" w:tentative="1">
+      <w:start w:val="1"/>
+      <w:numFmt w:val="decimal"/>
+      <w:lvlText w:val="%7."/>
+      <w:lvlJc w:val="left"/>
+      <w:pPr>
+        <w:ind w:left="4680" w:hanging="360"/>
+      </w:pPr>
+    </w:lvl>
+    <w:lvl w:ilvl="7" w:tplc="20000019" w:tentative="1">
+      <w:start w:val="1"/>
+      <w:numFmt w:val="lowerLetter"/>
+      <w:lvlText w:val="%8."/>
+      <w:lvlJc w:val="left"/>
+      <w:pPr>
+        <w:ind w:left="5400" w:hanging="360"/>
+      </w:pPr>
+    </w:lvl>
+    <w:lvl w:ilvl="8" w:tplc="2000001B" w:tentative="1">
+      <w:start w:val="1"/>
+      <w:numFmt w:val="lowerRoman"/>
+      <w:lvlText w:val="%9."/>
+      <w:lvlJc w:val="right"/>
+      <w:pPr>
+        <w:ind w:left="6120" w:hanging="180"/>
+      </w:pPr>
+    </w:lvl>
+  </w:abstractNum>
+  <w:abstractNum w:abstractNumId="13" w15:restartNumberingAfterBreak="0">
     <w:nsid w:val="6B073167"/>
     <w:multiLevelType w:val="hybridMultilevel"/>
     <w:tmpl w:val="15662E30"/>
@@ -11244,7 +11861,7 @@
       </w:pPr>
     </w:lvl>
   </w:abstractNum>
-  <w:abstractNum w:abstractNumId="10" w15:restartNumberingAfterBreak="0">
+  <w:abstractNum w:abstractNumId="14" w15:restartNumberingAfterBreak="0">
     <w:nsid w:val="7B3447A9"/>
     <w:multiLevelType w:val="hybridMultilevel"/>
     <w:tmpl w:val="3462115E"/>
@@ -11337,34 +11954,46 @@
     <w:abstractNumId w:val="0"/>
   </w:num>
   <w:num w:numId="2" w16cid:durableId="2118134085">
+    <w:abstractNumId w:val="6"/>
+  </w:num>
+  <w:num w:numId="3" w16cid:durableId="1949507879">
+    <w:abstractNumId w:val="13"/>
+  </w:num>
+  <w:num w:numId="4" w16cid:durableId="1584294926">
+    <w:abstractNumId w:val="14"/>
+  </w:num>
+  <w:num w:numId="5" w16cid:durableId="558394665">
+    <w:abstractNumId w:val="11"/>
+  </w:num>
+  <w:num w:numId="6" w16cid:durableId="2133161217">
+    <w:abstractNumId w:val="5"/>
+  </w:num>
+  <w:num w:numId="7" w16cid:durableId="932320633">
+    <w:abstractNumId w:val="7"/>
+  </w:num>
+  <w:num w:numId="8" w16cid:durableId="1504586809">
     <w:abstractNumId w:val="4"/>
   </w:num>
-  <w:num w:numId="3" w16cid:durableId="1949507879">
+  <w:num w:numId="9" w16cid:durableId="1488861626">
+    <w:abstractNumId w:val="8"/>
+  </w:num>
+  <w:num w:numId="10" w16cid:durableId="801266411">
+    <w:abstractNumId w:val="10"/>
+  </w:num>
+  <w:num w:numId="11" w16cid:durableId="313460662">
+    <w:abstractNumId w:val="2"/>
+  </w:num>
+  <w:num w:numId="12" w16cid:durableId="369571612">
+    <w:abstractNumId w:val="3"/>
+  </w:num>
+  <w:num w:numId="13" w16cid:durableId="263270336">
     <w:abstractNumId w:val="9"/>
   </w:num>
-  <w:num w:numId="4" w16cid:durableId="1584294926">
-    <w:abstractNumId w:val="10"/>
+  <w:num w:numId="14" w16cid:durableId="1145703032">
+    <w:abstractNumId w:val="1"/>
   </w:num>
-  <w:num w:numId="5" w16cid:durableId="558394665">
-    <w:abstractNumId w:val="8"/>
-  </w:num>
-  <w:num w:numId="6" w16cid:durableId="2133161217">
-    <w:abstractNumId w:val="3"/>
-  </w:num>
-  <w:num w:numId="7" w16cid:durableId="932320633">
-    <w:abstractNumId w:val="5"/>
-  </w:num>
-  <w:num w:numId="8" w16cid:durableId="1504586809">
-    <w:abstractNumId w:val="2"/>
-  </w:num>
-  <w:num w:numId="9" w16cid:durableId="1488861626">
-    <w:abstractNumId w:val="6"/>
-  </w:num>
-  <w:num w:numId="10" w16cid:durableId="801266411">
-    <w:abstractNumId w:val="7"/>
-  </w:num>
-  <w:num w:numId="11" w16cid:durableId="313460662">
-    <w:abstractNumId w:val="1"/>
+  <w:num w:numId="15" w16cid:durableId="1357850175">
+    <w:abstractNumId w:val="12"/>
   </w:num>
 </w:numbering>
 </file>
@@ -11378,7 +12007,7 @@
         <w:kern w:val="2"/>
         <w:sz w:val="24"/>
         <w:szCs w:val="24"/>
-        <w:lang w:eastAsia="en-US" w:bidi="he-IL"/>
+        <w:lang w:val="en-IL" w:eastAsia="en-US" w:bidi="he-IL"/>
         <w14:ligatures w14:val="standardContextual"/>
       </w:rPr>
     </w:rPrDefault>

</xml_diff>